<commit_message>
docs: add capabilities 09-13 to AI capabilities doc
Added five new LLM二次包装 capability cards:
- 09: 自然语言 Excel 分析
- 10: 竞品/行业快速分析
- 11: 客户画像自动生成
- 12: AI 培训题库生成
- 13: AI 文本摘要与总结

Co-Authored-By: Claude Sonnet 4.6 <noreply@anthropic.com>
</commit_message>
<xml_diff>
--- a/docs/AI能力与解决方案.docx
+++ b/docs/AI能力与解决方案.docx
@@ -5254,6 +5254,2531 @@
         </w:tc>
       </w:tr>
     </w:tbl>
+    <w:p>
+      <w:pPr>
+        <w:pageBreakBefore/>
+      </w:pPr>
+    </w:p>
+    <w:tbl>
+      <w:tblPr>
+        <w:tblW w:type="dxa" w:w="9360"/>
+        <w:tblBorders>
+          <w:top w:val="single" w:color="auto" w:sz="4"/>
+          <w:left w:val="single" w:color="auto" w:sz="4"/>
+          <w:bottom w:val="single" w:color="auto" w:sz="4"/>
+          <w:right w:val="single" w:color="auto" w:sz="4"/>
+          <w:insideH w:val="single" w:color="auto" w:sz="4"/>
+          <w:insideV w:val="single" w:color="auto" w:sz="4"/>
+        </w:tblBorders>
+      </w:tblPr>
+      <w:tblGrid>
+        <w:gridCol w:w="700"/>
+        <w:gridCol w:w="8660"/>
+      </w:tblGrid>
+      <w:tr>
+        <w:tc>
+          <w:tcPr>
+            <w:tcW w:type="dxa" w:w="700"/>
+            <w:tcBorders>
+              <w:top w:val="single" w:color="1B4F8A" w:sz="1"/>
+              <w:left w:val="single" w:color="1B4F8A" w:sz="1"/>
+              <w:bottom w:val="single" w:color="1B4F8A" w:sz="1"/>
+              <w:right w:val="single" w:color="1B4F8A" w:sz="1"/>
+            </w:tcBorders>
+            <w:shd w:fill="1B4F8A" w:val="clear"/>
+            <w:tcMar>
+              <w:top w:type="dxa" w:w="120"/>
+              <w:left w:type="dxa" w:w="140"/>
+              <w:bottom w:type="dxa" w:w="120"/>
+              <w:right w:type="dxa" w:w="140"/>
+            </w:tcMar>
+            <w:vAlign w:val="center"/>
+          </w:tcPr>
+          <w:p>
+            <w:pPr>
+              <w:jc w:val="center"/>
+            </w:pPr>
+            <w:r>
+              <w:rPr>
+                <w:rFonts w:ascii="Arial" w:cs="Arial" w:eastAsia="Arial" w:hAnsi="Arial"/>
+                <w:b/>
+                <w:bCs/>
+                <w:color w:val="FFFFFF"/>
+                <w:sz w:val="28"/>
+                <w:szCs w:val="28"/>
+              </w:rPr>
+              <w:t xml:space="preserve">09</w:t>
+            </w:r>
+          </w:p>
+        </w:tc>
+        <w:tc>
+          <w:tcPr>
+            <w:tcW w:type="dxa" w:w="8660"/>
+            <w:tcBorders>
+              <w:top w:val="single" w:color="1B4F8A" w:sz="1"/>
+              <w:left w:val="single" w:color="1B4F8A" w:sz="1"/>
+              <w:bottom w:val="single" w:color="1B4F8A" w:sz="1"/>
+              <w:right w:val="single" w:color="1B4F8A" w:sz="1"/>
+            </w:tcBorders>
+            <w:shd w:fill="1B4F8A" w:val="clear"/>
+            <w:tcMar>
+              <w:top w:type="dxa" w:w="120"/>
+              <w:left w:type="dxa" w:w="160"/>
+              <w:bottom w:type="dxa" w:w="120"/>
+              <w:right w:type="dxa" w:w="160"/>
+            </w:tcMar>
+          </w:tcPr>
+          <w:p>
+            <w:r>
+              <w:rPr>
+                <w:rFonts w:ascii="Arial" w:cs="Arial" w:eastAsia="Arial" w:hAnsi="Arial"/>
+                <w:b/>
+                <w:bCs/>
+                <w:color w:val="FFFFFF"/>
+                <w:sz w:val="28"/>
+                <w:szCs w:val="28"/>
+              </w:rPr>
+              <w:t xml:space="preserve">自然语言 Excel 分析  </w:t>
+            </w:r>
+            <w:r>
+              <w:rPr>
+                <w:rFonts w:ascii="Arial" w:cs="Arial" w:eastAsia="Arial" w:hAnsi="Arial"/>
+                <w:color w:val="A8D0F0"/>
+                <w:sz w:val="18"/>
+                <w:szCs w:val="18"/>
+              </w:rPr>
+              <w:t xml:space="preserve">可交付</w:t>
+            </w:r>
+          </w:p>
+          <w:p>
+            <w:pPr>
+              <w:spacing w:before="40"/>
+            </w:pPr>
+            <w:r>
+              <w:rPr>
+                <w:rFonts w:ascii="Arial" w:cs="Arial" w:eastAsia="Arial" w:hAnsi="Arial"/>
+                <w:color w:val="C8DFF0"/>
+                <w:sz w:val="20"/>
+                <w:szCs w:val="20"/>
+              </w:rPr>
+              <w:t xml:space="preserve">不会数据分析也能问出结论</w:t>
+            </w:r>
+          </w:p>
+        </w:tc>
+      </w:tr>
+      <w:tr>
+        <w:tc>
+          <w:tcPr>
+            <w:tcW w:type="dxa" w:w="1400"/>
+            <w:tcBorders>
+              <w:top w:val="single" w:color="E8E8E8" w:sz="1"/>
+              <w:left w:val="single" w:color="CCCCCC" w:sz="1"/>
+              <w:bottom w:val="single" w:color="E8E8E8" w:sz="1"/>
+              <w:right w:val="single" w:color="D0D0D0" w:sz="1"/>
+            </w:tcBorders>
+            <w:shd w:fill="F5F5F5" w:val="clear"/>
+            <w:tcMar>
+              <w:top w:type="dxa" w:w="100"/>
+              <w:left w:type="dxa" w:w="140"/>
+              <w:bottom w:type="dxa" w:w="100"/>
+              <w:right w:type="dxa" w:w="140"/>
+            </w:tcMar>
+            <w:vAlign w:val="top"/>
+          </w:tcPr>
+          <w:p>
+            <w:r>
+              <w:rPr>
+                <w:rFonts w:ascii="Arial" w:cs="Arial" w:eastAsia="Arial" w:hAnsi="Arial"/>
+                <w:b/>
+                <w:bCs/>
+                <w:color w:val="2E86C1"/>
+                <w:sz w:val="20"/>
+                <w:szCs w:val="20"/>
+              </w:rPr>
+              <w:t xml:space="preserve">应用场景</w:t>
+            </w:r>
+          </w:p>
+        </w:tc>
+        <w:tc>
+          <w:tcPr>
+            <w:tcW w:type="dxa" w:w="7960"/>
+            <w:tcBorders>
+              <w:top w:val="single" w:color="E8E8E8" w:sz="1"/>
+              <w:left w:val="single" w:color="D0D0D0" w:sz="1"/>
+              <w:bottom w:val="single" w:color="E8E8E8" w:sz="1"/>
+              <w:right w:val="single" w:color="CCCCCC" w:sz="1"/>
+            </w:tcBorders>
+            <w:tcMar>
+              <w:top w:type="dxa" w:w="100"/>
+              <w:left w:type="dxa" w:w="160"/>
+              <w:bottom w:type="dxa" w:w="100"/>
+              <w:right w:type="dxa" w:w="160"/>
+            </w:tcMar>
+          </w:tcPr>
+          <w:p>
+            <w:pPr>
+              <w:spacing w:after="0" w:before="0"/>
+            </w:pPr>
+            <w:r>
+              <w:rPr>
+                <w:rFonts w:ascii="Arial" w:cs="Arial" w:eastAsia="Arial" w:hAnsi="Arial"/>
+                <w:color w:val="1A1A1A"/>
+                <w:sz w:val="21"/>
+                <w:szCs w:val="21"/>
+              </w:rPr>
+              <w:t xml:space="preserve">业务人员手上有大量 Excel 数据，但不懂函数、不会写 SQL、也没有数据分析师支持。每次需要洞察都要依赖 IT 或分析部门，等待时间长，临时需求无法自助满足。</w:t>
+            </w:r>
+          </w:p>
+        </w:tc>
+      </w:tr>
+      <w:tr>
+        <w:tc>
+          <w:tcPr>
+            <w:tcW w:type="dxa" w:w="1400"/>
+            <w:tcBorders>
+              <w:top w:val="single" w:color="E8E8E8" w:sz="1"/>
+              <w:left w:val="single" w:color="CCCCCC" w:sz="1"/>
+              <w:bottom w:val="single" w:color="E8E8E8" w:sz="1"/>
+              <w:right w:val="single" w:color="D0D0D0" w:sz="1"/>
+            </w:tcBorders>
+            <w:shd w:fill="F5F5F5" w:val="clear"/>
+            <w:tcMar>
+              <w:top w:type="dxa" w:w="100"/>
+              <w:left w:type="dxa" w:w="140"/>
+              <w:bottom w:type="dxa" w:w="100"/>
+              <w:right w:type="dxa" w:w="140"/>
+            </w:tcMar>
+            <w:vAlign w:val="top"/>
+          </w:tcPr>
+          <w:p>
+            <w:r>
+              <w:rPr>
+                <w:rFonts w:ascii="Arial" w:cs="Arial" w:eastAsia="Arial" w:hAnsi="Arial"/>
+                <w:b/>
+                <w:bCs/>
+                <w:color w:val="2E86C1"/>
+                <w:sz w:val="20"/>
+                <w:szCs w:val="20"/>
+              </w:rPr>
+              <w:t xml:space="preserve">用户痛点</w:t>
+            </w:r>
+          </w:p>
+        </w:tc>
+        <w:tc>
+          <w:tcPr>
+            <w:tcW w:type="dxa" w:w="7960"/>
+            <w:tcBorders>
+              <w:top w:val="single" w:color="E8E8E8" w:sz="1"/>
+              <w:left w:val="single" w:color="D0D0D0" w:sz="1"/>
+              <w:bottom w:val="single" w:color="E8E8E8" w:sz="1"/>
+              <w:right w:val="single" w:color="CCCCCC" w:sz="1"/>
+            </w:tcBorders>
+            <w:tcMar>
+              <w:top w:type="dxa" w:w="100"/>
+              <w:left w:type="dxa" w:w="160"/>
+              <w:bottom w:type="dxa" w:w="100"/>
+              <w:right w:type="dxa" w:w="160"/>
+            </w:tcMar>
+          </w:tcPr>
+          <w:p>
+            <w:pPr>
+              <w:pStyle w:val="ListParagraph"/>
+              <w:numPr>
+                <w:ilvl w:val="0"/>
+                <w:numId w:val="2"/>
+              </w:numPr>
+              <w:spacing w:after="30" w:before="30"/>
+            </w:pPr>
+            <w:r>
+              <w:rPr>
+                <w:rFonts w:ascii="Arial" w:cs="Arial" w:eastAsia="Arial" w:hAnsi="Arial"/>
+                <w:color w:val="1A1A1A"/>
+                <w:sz w:val="21"/>
+                <w:szCs w:val="21"/>
+              </w:rPr>
+              <w:t xml:space="preserve">有数据但不会用，Excel 函数门槛高，非技术人员望而生畏</w:t>
+            </w:r>
+          </w:p>
+          <w:p>
+            <w:pPr>
+              <w:pStyle w:val="ListParagraph"/>
+              <w:numPr>
+                <w:ilvl w:val="0"/>
+                <w:numId w:val="2"/>
+              </w:numPr>
+              <w:spacing w:after="30" w:before="30"/>
+            </w:pPr>
+            <w:r>
+              <w:rPr>
+                <w:rFonts w:ascii="Arial" w:cs="Arial" w:eastAsia="Arial" w:hAnsi="Arial"/>
+                <w:color w:val="1A1A1A"/>
+                <w:sz w:val="21"/>
+                <w:szCs w:val="21"/>
+              </w:rPr>
+              <w:t xml:space="preserve">每次临时查数据都要找 IT 帮忙，响应慢、等待久</w:t>
+            </w:r>
+          </w:p>
+          <w:p>
+            <w:pPr>
+              <w:pStyle w:val="ListParagraph"/>
+              <w:numPr>
+                <w:ilvl w:val="0"/>
+                <w:numId w:val="2"/>
+              </w:numPr>
+              <w:spacing w:after="30" w:before="30"/>
+            </w:pPr>
+            <w:r>
+              <w:rPr>
+                <w:rFonts w:ascii="Arial" w:cs="Arial" w:eastAsia="Arial" w:hAnsi="Arial"/>
+                <w:color w:val="1A1A1A"/>
+                <w:sz w:val="21"/>
+                <w:szCs w:val="21"/>
+              </w:rPr>
+              <w:t xml:space="preserve">月报、周报需要手工汇总，耗时且容易出错</w:t>
+            </w:r>
+          </w:p>
+          <w:p>
+            <w:pPr>
+              <w:pStyle w:val="ListParagraph"/>
+              <w:numPr>
+                <w:ilvl w:val="0"/>
+                <w:numId w:val="2"/>
+              </w:numPr>
+              <w:spacing w:after="30" w:before="30"/>
+            </w:pPr>
+            <w:r>
+              <w:rPr>
+                <w:rFonts w:ascii="Arial" w:cs="Arial" w:eastAsia="Arial" w:hAnsi="Arial"/>
+                <w:color w:val="1A1A1A"/>
+                <w:sz w:val="21"/>
+                <w:szCs w:val="21"/>
+              </w:rPr>
+              <w:t xml:space="preserve">想做数据对比和趋势分析，但缺乏工具和技能</w:t>
+            </w:r>
+          </w:p>
+        </w:tc>
+      </w:tr>
+      <w:tr>
+        <w:tc>
+          <w:tcPr>
+            <w:tcW w:type="dxa" w:w="1400"/>
+            <w:tcBorders>
+              <w:top w:val="single" w:color="E8E8E8" w:sz="1"/>
+              <w:left w:val="single" w:color="CCCCCC" w:sz="1"/>
+              <w:bottom w:val="single" w:color="E8E8E8" w:sz="1"/>
+              <w:right w:val="single" w:color="D0D0D0" w:sz="1"/>
+            </w:tcBorders>
+            <w:shd w:fill="F5F5F5" w:val="clear"/>
+            <w:tcMar>
+              <w:top w:type="dxa" w:w="100"/>
+              <w:left w:type="dxa" w:w="140"/>
+              <w:bottom w:type="dxa" w:w="100"/>
+              <w:right w:type="dxa" w:w="140"/>
+            </w:tcMar>
+            <w:vAlign w:val="top"/>
+          </w:tcPr>
+          <w:p>
+            <w:r>
+              <w:rPr>
+                <w:rFonts w:ascii="Arial" w:cs="Arial" w:eastAsia="Arial" w:hAnsi="Arial"/>
+                <w:b/>
+                <w:bCs/>
+                <w:color w:val="2E86C1"/>
+                <w:sz w:val="20"/>
+                <w:szCs w:val="20"/>
+              </w:rPr>
+              <w:t xml:space="preserve">我们的解决方案</w:t>
+            </w:r>
+          </w:p>
+        </w:tc>
+        <w:tc>
+          <w:tcPr>
+            <w:tcW w:type="dxa" w:w="7960"/>
+            <w:tcBorders>
+              <w:top w:val="single" w:color="E8E8E8" w:sz="1"/>
+              <w:left w:val="single" w:color="D0D0D0" w:sz="1"/>
+              <w:bottom w:val="single" w:color="E8E8E8" w:sz="1"/>
+              <w:right w:val="single" w:color="CCCCCC" w:sz="1"/>
+            </w:tcBorders>
+            <w:tcMar>
+              <w:top w:type="dxa" w:w="100"/>
+              <w:left w:type="dxa" w:w="160"/>
+              <w:bottom w:type="dxa" w:w="100"/>
+              <w:right w:type="dxa" w:w="160"/>
+            </w:tcMar>
+          </w:tcPr>
+          <w:p>
+            <w:pPr>
+              <w:spacing w:after="0" w:before="0"/>
+            </w:pPr>
+            <w:r>
+              <w:rPr>
+                <w:rFonts w:ascii="Arial" w:cs="Arial" w:eastAsia="Arial" w:hAnsi="Arial"/>
+                <w:color w:val="1A1A1A"/>
+                <w:sz w:val="21"/>
+                <w:szCs w:val="21"/>
+              </w:rPr>
+              <w:t xml:space="preserve">上传 Excel 或 CSV 文件，用中文直接提问（"上个月哪个区域销售最好？""客户复购率怎么变化的？"），系统自动理解数据结构、执行分析、返回结论和可视化图表，不需要写任何公式或代码。</w:t>
+            </w:r>
+          </w:p>
+        </w:tc>
+      </w:tr>
+      <w:tr>
+        <w:tc>
+          <w:tcPr>
+            <w:tcW w:type="dxa" w:w="1400"/>
+            <w:tcBorders>
+              <w:top w:val="single" w:color="E8E8E8" w:sz="1"/>
+              <w:left w:val="single" w:color="CCCCCC" w:sz="1"/>
+              <w:bottom w:val="single" w:color="E8E8E8" w:sz="1"/>
+              <w:right w:val="single" w:color="D0D0D0" w:sz="1"/>
+            </w:tcBorders>
+            <w:shd w:fill="F5F5F5" w:val="clear"/>
+            <w:tcMar>
+              <w:top w:type="dxa" w:w="100"/>
+              <w:left w:type="dxa" w:w="140"/>
+              <w:bottom w:type="dxa" w:w="100"/>
+              <w:right w:type="dxa" w:w="140"/>
+            </w:tcMar>
+            <w:vAlign w:val="top"/>
+          </w:tcPr>
+          <w:p>
+            <w:r>
+              <w:rPr>
+                <w:rFonts w:ascii="Arial" w:cs="Arial" w:eastAsia="Arial" w:hAnsi="Arial"/>
+                <w:b/>
+                <w:bCs/>
+                <w:color w:val="2E86C1"/>
+                <w:sz w:val="20"/>
+                <w:szCs w:val="20"/>
+              </w:rPr>
+              <w:t xml:space="preserve">适合的甲方</w:t>
+            </w:r>
+          </w:p>
+        </w:tc>
+        <w:tc>
+          <w:tcPr>
+            <w:tcW w:type="dxa" w:w="7960"/>
+            <w:tcBorders>
+              <w:top w:val="single" w:color="E8E8E8" w:sz="1"/>
+              <w:left w:val="single" w:color="D0D0D0" w:sz="1"/>
+              <w:bottom w:val="single" w:color="E8E8E8" w:sz="1"/>
+              <w:right w:val="single" w:color="CCCCCC" w:sz="1"/>
+            </w:tcBorders>
+            <w:tcMar>
+              <w:top w:type="dxa" w:w="100"/>
+              <w:left w:type="dxa" w:w="160"/>
+              <w:bottom w:type="dxa" w:w="100"/>
+              <w:right w:type="dxa" w:w="160"/>
+            </w:tcMar>
+          </w:tcPr>
+          <w:p>
+            <w:pPr>
+              <w:spacing w:after="0" w:before="0"/>
+            </w:pPr>
+            <w:r>
+              <w:rPr>
+                <w:rFonts w:ascii="Arial" w:cs="Arial" w:eastAsia="Arial" w:hAnsi="Arial"/>
+                <w:color w:val="1A1A1A"/>
+                <w:sz w:val="21"/>
+                <w:szCs w:val="21"/>
+              </w:rPr>
+              <w:t xml:space="preserve">销售团队 / 运营部门 / 财务分析 / 管理层 / 任何有数据但缺分析能力的业务部门</w:t>
+            </w:r>
+          </w:p>
+        </w:tc>
+      </w:tr>
+      <w:tr>
+        <w:tc>
+          <w:tcPr>
+            <w:tcW w:type="dxa" w:w="1400"/>
+            <w:tcBorders>
+              <w:top w:val="single" w:color="E8E8E8" w:sz="1"/>
+              <w:left w:val="single" w:color="CCCCCC" w:sz="1"/>
+              <w:bottom w:val="single" w:color="E8E8E8" w:sz="1"/>
+              <w:right w:val="single" w:color="D0D0D0" w:sz="1"/>
+            </w:tcBorders>
+            <w:shd w:fill="F5F5F5" w:val="clear"/>
+            <w:tcMar>
+              <w:top w:type="dxa" w:w="100"/>
+              <w:left w:type="dxa" w:w="140"/>
+              <w:bottom w:type="dxa" w:w="100"/>
+              <w:right w:type="dxa" w:w="140"/>
+            </w:tcMar>
+            <w:vAlign w:val="top"/>
+          </w:tcPr>
+          <w:p>
+            <w:r>
+              <w:rPr>
+                <w:rFonts w:ascii="Arial" w:cs="Arial" w:eastAsia="Arial" w:hAnsi="Arial"/>
+                <w:b/>
+                <w:bCs/>
+                <w:color w:val="2E86C1"/>
+                <w:sz w:val="20"/>
+                <w:szCs w:val="20"/>
+              </w:rPr>
+              <w:t xml:space="preserve">核心价值</w:t>
+            </w:r>
+          </w:p>
+        </w:tc>
+        <w:tc>
+          <w:tcPr>
+            <w:tcW w:type="dxa" w:w="7960"/>
+            <w:tcBorders>
+              <w:top w:val="single" w:color="E8E8E8" w:sz="1"/>
+              <w:left w:val="single" w:color="D0D0D0" w:sz="1"/>
+              <w:bottom w:val="single" w:color="E8E8E8" w:sz="1"/>
+              <w:right w:val="single" w:color="CCCCCC" w:sz="1"/>
+            </w:tcBorders>
+            <w:tcMar>
+              <w:top w:type="dxa" w:w="100"/>
+              <w:left w:type="dxa" w:w="160"/>
+              <w:bottom w:type="dxa" w:w="100"/>
+              <w:right w:type="dxa" w:w="160"/>
+            </w:tcMar>
+          </w:tcPr>
+          <w:p>
+            <w:pPr>
+              <w:spacing w:after="0" w:before="0"/>
+            </w:pPr>
+            <w:r>
+              <w:rPr>
+                <w:rFonts w:ascii="Arial" w:cs="Arial" w:eastAsia="Arial" w:hAnsi="Arial"/>
+                <w:color w:val="1A1A1A"/>
+                <w:sz w:val="21"/>
+                <w:szCs w:val="21"/>
+              </w:rPr>
+              <w:t xml:space="preserve">把"需要 IT 支持才能用的数据"变成"人人都能自助查询的资产"；分钟级出结论，不再等待；降低企业对数据分析岗位的依赖。</w:t>
+            </w:r>
+          </w:p>
+        </w:tc>
+      </w:tr>
+    </w:tbl>
+    <w:p>
+      <w:pPr>
+        <w:spacing w:after="240" w:before="0"/>
+      </w:pPr>
+    </w:p>
+    <w:p>
+      <w:pPr>
+        <w:pageBreakBefore/>
+      </w:pPr>
+    </w:p>
+    <w:tbl>
+      <w:tblPr>
+        <w:tblW w:type="dxa" w:w="9360"/>
+        <w:tblBorders>
+          <w:top w:val="single" w:color="auto" w:sz="4"/>
+          <w:left w:val="single" w:color="auto" w:sz="4"/>
+          <w:bottom w:val="single" w:color="auto" w:sz="4"/>
+          <w:right w:val="single" w:color="auto" w:sz="4"/>
+          <w:insideH w:val="single" w:color="auto" w:sz="4"/>
+          <w:insideV w:val="single" w:color="auto" w:sz="4"/>
+        </w:tblBorders>
+      </w:tblPr>
+      <w:tblGrid>
+        <w:gridCol w:w="700"/>
+        <w:gridCol w:w="8660"/>
+      </w:tblGrid>
+      <w:tr>
+        <w:tc>
+          <w:tcPr>
+            <w:tcW w:type="dxa" w:w="700"/>
+            <w:tcBorders>
+              <w:top w:val="single" w:color="1B4F8A" w:sz="1"/>
+              <w:left w:val="single" w:color="1B4F8A" w:sz="1"/>
+              <w:bottom w:val="single" w:color="1B4F8A" w:sz="1"/>
+              <w:right w:val="single" w:color="1B4F8A" w:sz="1"/>
+            </w:tcBorders>
+            <w:shd w:fill="1B4F8A" w:val="clear"/>
+            <w:tcMar>
+              <w:top w:type="dxa" w:w="120"/>
+              <w:left w:type="dxa" w:w="140"/>
+              <w:bottom w:type="dxa" w:w="120"/>
+              <w:right w:type="dxa" w:w="140"/>
+            </w:tcMar>
+            <w:vAlign w:val="center"/>
+          </w:tcPr>
+          <w:p>
+            <w:pPr>
+              <w:jc w:val="center"/>
+            </w:pPr>
+            <w:r>
+              <w:rPr>
+                <w:rFonts w:ascii="Arial" w:cs="Arial" w:eastAsia="Arial" w:hAnsi="Arial"/>
+                <w:b/>
+                <w:bCs/>
+                <w:color w:val="FFFFFF"/>
+                <w:sz w:val="28"/>
+                <w:szCs w:val="28"/>
+              </w:rPr>
+              <w:t xml:space="preserve">10</w:t>
+            </w:r>
+          </w:p>
+        </w:tc>
+        <w:tc>
+          <w:tcPr>
+            <w:tcW w:type="dxa" w:w="8660"/>
+            <w:tcBorders>
+              <w:top w:val="single" w:color="1B4F8A" w:sz="1"/>
+              <w:left w:val="single" w:color="1B4F8A" w:sz="1"/>
+              <w:bottom w:val="single" w:color="1B4F8A" w:sz="1"/>
+              <w:right w:val="single" w:color="1B4F8A" w:sz="1"/>
+            </w:tcBorders>
+            <w:shd w:fill="1B4F8A" w:val="clear"/>
+            <w:tcMar>
+              <w:top w:type="dxa" w:w="120"/>
+              <w:left w:type="dxa" w:w="160"/>
+              <w:bottom w:type="dxa" w:w="120"/>
+              <w:right w:type="dxa" w:w="160"/>
+            </w:tcMar>
+          </w:tcPr>
+          <w:p>
+            <w:r>
+              <w:rPr>
+                <w:rFonts w:ascii="Arial" w:cs="Arial" w:eastAsia="Arial" w:hAnsi="Arial"/>
+                <w:b/>
+                <w:bCs/>
+                <w:color w:val="FFFFFF"/>
+                <w:sz w:val="28"/>
+                <w:szCs w:val="28"/>
+              </w:rPr>
+              <w:t xml:space="preserve">竞品 / 行业快速分析  </w:t>
+            </w:r>
+            <w:r>
+              <w:rPr>
+                <w:rFonts w:ascii="Arial" w:cs="Arial" w:eastAsia="Arial" w:hAnsi="Arial"/>
+                <w:color w:val="A8D0F0"/>
+                <w:sz w:val="18"/>
+                <w:szCs w:val="18"/>
+              </w:rPr>
+              <w:t xml:space="preserve">可交付</w:t>
+            </w:r>
+          </w:p>
+          <w:p>
+            <w:pPr>
+              <w:spacing w:before="40"/>
+            </w:pPr>
+            <w:r>
+              <w:rPr>
+                <w:rFonts w:ascii="Arial" w:cs="Arial" w:eastAsia="Arial" w:hAnsi="Arial"/>
+                <w:color w:val="C8DFF0"/>
+                <w:sz w:val="20"/>
+                <w:szCs w:val="20"/>
+              </w:rPr>
+              <w:t xml:space="preserve">输入资料，分钟级输出结构化竞品报告</w:t>
+            </w:r>
+          </w:p>
+        </w:tc>
+      </w:tr>
+      <w:tr>
+        <w:tc>
+          <w:tcPr>
+            <w:tcW w:type="dxa" w:w="1400"/>
+            <w:tcBorders>
+              <w:top w:val="single" w:color="E8E8E8" w:sz="1"/>
+              <w:left w:val="single" w:color="CCCCCC" w:sz="1"/>
+              <w:bottom w:val="single" w:color="E8E8E8" w:sz="1"/>
+              <w:right w:val="single" w:color="D0D0D0" w:sz="1"/>
+            </w:tcBorders>
+            <w:shd w:fill="F5F5F5" w:val="clear"/>
+            <w:tcMar>
+              <w:top w:type="dxa" w:w="100"/>
+              <w:left w:type="dxa" w:w="140"/>
+              <w:bottom w:type="dxa" w:w="100"/>
+              <w:right w:type="dxa" w:w="140"/>
+            </w:tcMar>
+            <w:vAlign w:val="top"/>
+          </w:tcPr>
+          <w:p>
+            <w:r>
+              <w:rPr>
+                <w:rFonts w:ascii="Arial" w:cs="Arial" w:eastAsia="Arial" w:hAnsi="Arial"/>
+                <w:b/>
+                <w:bCs/>
+                <w:color w:val="2E86C1"/>
+                <w:sz w:val="20"/>
+                <w:szCs w:val="20"/>
+              </w:rPr>
+              <w:t xml:space="preserve">应用场景</w:t>
+            </w:r>
+          </w:p>
+        </w:tc>
+        <w:tc>
+          <w:tcPr>
+            <w:tcW w:type="dxa" w:w="7960"/>
+            <w:tcBorders>
+              <w:top w:val="single" w:color="E8E8E8" w:sz="1"/>
+              <w:left w:val="single" w:color="D0D0D0" w:sz="1"/>
+              <w:bottom w:val="single" w:color="E8E8E8" w:sz="1"/>
+              <w:right w:val="single" w:color="CCCCCC" w:sz="1"/>
+            </w:tcBorders>
+            <w:tcMar>
+              <w:top w:type="dxa" w:w="100"/>
+              <w:left w:type="dxa" w:w="160"/>
+              <w:bottom w:type="dxa" w:w="100"/>
+              <w:right w:type="dxa" w:w="160"/>
+            </w:tcMar>
+          </w:tcPr>
+          <w:p>
+            <w:pPr>
+              <w:spacing w:after="0" w:before="0"/>
+            </w:pPr>
+            <w:r>
+              <w:rPr>
+                <w:rFonts w:ascii="Arial" w:cs="Arial" w:eastAsia="Arial" w:hAnsi="Arial"/>
+                <w:color w:val="1A1A1A"/>
+                <w:sz w:val="21"/>
+                <w:szCs w:val="21"/>
+              </w:rPr>
+              <w:t xml:space="preserve">企业战略、销售、产品团队需要定期做竞品研究，但人工收集资料、整理对比、撰写报告耗时耗力，且难以保持频率。市场变化快，靠人工做的竞品分析往往滞后。</w:t>
+            </w:r>
+          </w:p>
+        </w:tc>
+      </w:tr>
+      <w:tr>
+        <w:tc>
+          <w:tcPr>
+            <w:tcW w:type="dxa" w:w="1400"/>
+            <w:tcBorders>
+              <w:top w:val="single" w:color="E8E8E8" w:sz="1"/>
+              <w:left w:val="single" w:color="CCCCCC" w:sz="1"/>
+              <w:bottom w:val="single" w:color="E8E8E8" w:sz="1"/>
+              <w:right w:val="single" w:color="D0D0D0" w:sz="1"/>
+            </w:tcBorders>
+            <w:shd w:fill="F5F5F5" w:val="clear"/>
+            <w:tcMar>
+              <w:top w:type="dxa" w:w="100"/>
+              <w:left w:type="dxa" w:w="140"/>
+              <w:bottom w:type="dxa" w:w="100"/>
+              <w:right w:type="dxa" w:w="140"/>
+            </w:tcMar>
+            <w:vAlign w:val="top"/>
+          </w:tcPr>
+          <w:p>
+            <w:r>
+              <w:rPr>
+                <w:rFonts w:ascii="Arial" w:cs="Arial" w:eastAsia="Arial" w:hAnsi="Arial"/>
+                <w:b/>
+                <w:bCs/>
+                <w:color w:val="2E86C1"/>
+                <w:sz w:val="20"/>
+                <w:szCs w:val="20"/>
+              </w:rPr>
+              <w:t xml:space="preserve">用户痛点</w:t>
+            </w:r>
+          </w:p>
+        </w:tc>
+        <w:tc>
+          <w:tcPr>
+            <w:tcW w:type="dxa" w:w="7960"/>
+            <w:tcBorders>
+              <w:top w:val="single" w:color="E8E8E8" w:sz="1"/>
+              <w:left w:val="single" w:color="D0D0D0" w:sz="1"/>
+              <w:bottom w:val="single" w:color="E8E8E8" w:sz="1"/>
+              <w:right w:val="single" w:color="CCCCCC" w:sz="1"/>
+            </w:tcBorders>
+            <w:tcMar>
+              <w:top w:type="dxa" w:w="100"/>
+              <w:left w:type="dxa" w:w="160"/>
+              <w:bottom w:type="dxa" w:w="100"/>
+              <w:right w:type="dxa" w:w="160"/>
+            </w:tcMar>
+          </w:tcPr>
+          <w:p>
+            <w:pPr>
+              <w:pStyle w:val="ListParagraph"/>
+              <w:numPr>
+                <w:ilvl w:val="0"/>
+                <w:numId w:val="2"/>
+              </w:numPr>
+              <w:spacing w:after="30" w:before="30"/>
+            </w:pPr>
+            <w:r>
+              <w:rPr>
+                <w:rFonts w:ascii="Arial" w:cs="Arial" w:eastAsia="Arial" w:hAnsi="Arial"/>
+                <w:color w:val="1A1A1A"/>
+                <w:sz w:val="21"/>
+                <w:szCs w:val="21"/>
+              </w:rPr>
+              <w:t xml:space="preserve">竞品调研需要大量人工收集、阅读、整理，周期以天计</w:t>
+            </w:r>
+          </w:p>
+          <w:p>
+            <w:pPr>
+              <w:pStyle w:val="ListParagraph"/>
+              <w:numPr>
+                <w:ilvl w:val="0"/>
+                <w:numId w:val="2"/>
+              </w:numPr>
+              <w:spacing w:after="30" w:before="30"/>
+            </w:pPr>
+            <w:r>
+              <w:rPr>
+                <w:rFonts w:ascii="Arial" w:cs="Arial" w:eastAsia="Arial" w:hAnsi="Arial"/>
+                <w:color w:val="1A1A1A"/>
+                <w:sz w:val="21"/>
+                <w:szCs w:val="21"/>
+              </w:rPr>
+              <w:t xml:space="preserve">不同人做的竞品报告格式不一致，难以横向对比</w:t>
+            </w:r>
+          </w:p>
+          <w:p>
+            <w:pPr>
+              <w:pStyle w:val="ListParagraph"/>
+              <w:numPr>
+                <w:ilvl w:val="0"/>
+                <w:numId w:val="2"/>
+              </w:numPr>
+              <w:spacing w:after="30" w:before="30"/>
+            </w:pPr>
+            <w:r>
+              <w:rPr>
+                <w:rFonts w:ascii="Arial" w:cs="Arial" w:eastAsia="Arial" w:hAnsi="Arial"/>
+                <w:color w:val="1A1A1A"/>
+                <w:sz w:val="21"/>
+                <w:szCs w:val="21"/>
+              </w:rPr>
+              <w:t xml:space="preserve">市场变化快，人工竞品分析频率跟不上</w:t>
+            </w:r>
+          </w:p>
+          <w:p>
+            <w:pPr>
+              <w:pStyle w:val="ListParagraph"/>
+              <w:numPr>
+                <w:ilvl w:val="0"/>
+                <w:numId w:val="2"/>
+              </w:numPr>
+              <w:spacing w:after="30" w:before="30"/>
+            </w:pPr>
+            <w:r>
+              <w:rPr>
+                <w:rFonts w:ascii="Arial" w:cs="Arial" w:eastAsia="Arial" w:hAnsi="Arial"/>
+                <w:color w:val="1A1A1A"/>
+                <w:sz w:val="21"/>
+                <w:szCs w:val="21"/>
+              </w:rPr>
+              <w:t xml:space="preserve">咨询公司报告价格高，且针对性不足</w:t>
+            </w:r>
+          </w:p>
+        </w:tc>
+      </w:tr>
+      <w:tr>
+        <w:tc>
+          <w:tcPr>
+            <w:tcW w:type="dxa" w:w="1400"/>
+            <w:tcBorders>
+              <w:top w:val="single" w:color="E8E8E8" w:sz="1"/>
+              <w:left w:val="single" w:color="CCCCCC" w:sz="1"/>
+              <w:bottom w:val="single" w:color="E8E8E8" w:sz="1"/>
+              <w:right w:val="single" w:color="D0D0D0" w:sz="1"/>
+            </w:tcBorders>
+            <w:shd w:fill="F5F5F5" w:val="clear"/>
+            <w:tcMar>
+              <w:top w:type="dxa" w:w="100"/>
+              <w:left w:type="dxa" w:w="140"/>
+              <w:bottom w:type="dxa" w:w="100"/>
+              <w:right w:type="dxa" w:w="140"/>
+            </w:tcMar>
+            <w:vAlign w:val="top"/>
+          </w:tcPr>
+          <w:p>
+            <w:r>
+              <w:rPr>
+                <w:rFonts w:ascii="Arial" w:cs="Arial" w:eastAsia="Arial" w:hAnsi="Arial"/>
+                <w:b/>
+                <w:bCs/>
+                <w:color w:val="2E86C1"/>
+                <w:sz w:val="20"/>
+                <w:szCs w:val="20"/>
+              </w:rPr>
+              <w:t xml:space="preserve">我们的解决方案</w:t>
+            </w:r>
+          </w:p>
+        </w:tc>
+        <w:tc>
+          <w:tcPr>
+            <w:tcW w:type="dxa" w:w="7960"/>
+            <w:tcBorders>
+              <w:top w:val="single" w:color="E8E8E8" w:sz="1"/>
+              <w:left w:val="single" w:color="D0D0D0" w:sz="1"/>
+              <w:bottom w:val="single" w:color="E8E8E8" w:sz="1"/>
+              <w:right w:val="single" w:color="CCCCCC" w:sz="1"/>
+            </w:tcBorders>
+            <w:tcMar>
+              <w:top w:type="dxa" w:w="100"/>
+              <w:left w:type="dxa" w:w="160"/>
+              <w:bottom w:type="dxa" w:w="100"/>
+              <w:right w:type="dxa" w:w="160"/>
+            </w:tcMar>
+          </w:tcPr>
+          <w:p>
+            <w:pPr>
+              <w:spacing w:after="0" w:before="0"/>
+            </w:pPr>
+            <w:r>
+              <w:rPr>
+                <w:rFonts w:ascii="Arial" w:cs="Arial" w:eastAsia="Arial" w:hAnsi="Arial"/>
+                <w:color w:val="1A1A1A"/>
+                <w:sz w:val="21"/>
+                <w:szCs w:val="21"/>
+              </w:rPr>
+              <w:t xml:space="preserve">输入竞品官网、产品介绍、新闻资讯、用户评价等资料，系统自动按统一框架（产品定位 / 核心功能 / 价格策略 / 优劣势 / 目标客户）生成结构化分析报告，支持多竞品横向对比表格输出。</w:t>
+            </w:r>
+          </w:p>
+        </w:tc>
+      </w:tr>
+      <w:tr>
+        <w:tc>
+          <w:tcPr>
+            <w:tcW w:type="dxa" w:w="1400"/>
+            <w:tcBorders>
+              <w:top w:val="single" w:color="E8E8E8" w:sz="1"/>
+              <w:left w:val="single" w:color="CCCCCC" w:sz="1"/>
+              <w:bottom w:val="single" w:color="E8E8E8" w:sz="1"/>
+              <w:right w:val="single" w:color="D0D0D0" w:sz="1"/>
+            </w:tcBorders>
+            <w:shd w:fill="F5F5F5" w:val="clear"/>
+            <w:tcMar>
+              <w:top w:type="dxa" w:w="100"/>
+              <w:left w:type="dxa" w:w="140"/>
+              <w:bottom w:type="dxa" w:w="100"/>
+              <w:right w:type="dxa" w:w="140"/>
+            </w:tcMar>
+            <w:vAlign w:val="top"/>
+          </w:tcPr>
+          <w:p>
+            <w:r>
+              <w:rPr>
+                <w:rFonts w:ascii="Arial" w:cs="Arial" w:eastAsia="Arial" w:hAnsi="Arial"/>
+                <w:b/>
+                <w:bCs/>
+                <w:color w:val="2E86C1"/>
+                <w:sz w:val="20"/>
+                <w:szCs w:val="20"/>
+              </w:rPr>
+              <w:t xml:space="preserve">适合的甲方</w:t>
+            </w:r>
+          </w:p>
+        </w:tc>
+        <w:tc>
+          <w:tcPr>
+            <w:tcW w:type="dxa" w:w="7960"/>
+            <w:tcBorders>
+              <w:top w:val="single" w:color="E8E8E8" w:sz="1"/>
+              <w:left w:val="single" w:color="D0D0D0" w:sz="1"/>
+              <w:bottom w:val="single" w:color="E8E8E8" w:sz="1"/>
+              <w:right w:val="single" w:color="CCCCCC" w:sz="1"/>
+            </w:tcBorders>
+            <w:tcMar>
+              <w:top w:type="dxa" w:w="100"/>
+              <w:left w:type="dxa" w:w="160"/>
+              <w:bottom w:type="dxa" w:w="100"/>
+              <w:right w:type="dxa" w:w="160"/>
+            </w:tcMar>
+          </w:tcPr>
+          <w:p>
+            <w:pPr>
+              <w:spacing w:after="0" w:before="0"/>
+            </w:pPr>
+            <w:r>
+              <w:rPr>
+                <w:rFonts w:ascii="Arial" w:cs="Arial" w:eastAsia="Arial" w:hAnsi="Arial"/>
+                <w:color w:val="1A1A1A"/>
+                <w:sz w:val="21"/>
+                <w:szCs w:val="21"/>
+              </w:rPr>
+              <w:t xml:space="preserve">战略部门 / 产品团队 / 销售支持 / 咨询公司 / 投资机构</w:t>
+            </w:r>
+          </w:p>
+        </w:tc>
+      </w:tr>
+      <w:tr>
+        <w:tc>
+          <w:tcPr>
+            <w:tcW w:type="dxa" w:w="1400"/>
+            <w:tcBorders>
+              <w:top w:val="single" w:color="E8E8E8" w:sz="1"/>
+              <w:left w:val="single" w:color="CCCCCC" w:sz="1"/>
+              <w:bottom w:val="single" w:color="E8E8E8" w:sz="1"/>
+              <w:right w:val="single" w:color="D0D0D0" w:sz="1"/>
+            </w:tcBorders>
+            <w:shd w:fill="F5F5F5" w:val="clear"/>
+            <w:tcMar>
+              <w:top w:type="dxa" w:w="100"/>
+              <w:left w:type="dxa" w:w="140"/>
+              <w:bottom w:type="dxa" w:w="100"/>
+              <w:right w:type="dxa" w:w="140"/>
+            </w:tcMar>
+            <w:vAlign w:val="top"/>
+          </w:tcPr>
+          <w:p>
+            <w:r>
+              <w:rPr>
+                <w:rFonts w:ascii="Arial" w:cs="Arial" w:eastAsia="Arial" w:hAnsi="Arial"/>
+                <w:b/>
+                <w:bCs/>
+                <w:color w:val="2E86C1"/>
+                <w:sz w:val="20"/>
+                <w:szCs w:val="20"/>
+              </w:rPr>
+              <w:t xml:space="preserve">核心价值</w:t>
+            </w:r>
+          </w:p>
+        </w:tc>
+        <w:tc>
+          <w:tcPr>
+            <w:tcW w:type="dxa" w:w="7960"/>
+            <w:tcBorders>
+              <w:top w:val="single" w:color="E8E8E8" w:sz="1"/>
+              <w:left w:val="single" w:color="D0D0D0" w:sz="1"/>
+              <w:bottom w:val="single" w:color="E8E8E8" w:sz="1"/>
+              <w:right w:val="single" w:color="CCCCCC" w:sz="1"/>
+            </w:tcBorders>
+            <w:tcMar>
+              <w:top w:type="dxa" w:w="100"/>
+              <w:left w:type="dxa" w:w="160"/>
+              <w:bottom w:type="dxa" w:w="100"/>
+              <w:right w:type="dxa" w:w="160"/>
+            </w:tcMar>
+          </w:tcPr>
+          <w:p>
+            <w:pPr>
+              <w:spacing w:after="0" w:before="0"/>
+            </w:pPr>
+            <w:r>
+              <w:rPr>
+                <w:rFonts w:ascii="Arial" w:cs="Arial" w:eastAsia="Arial" w:hAnsi="Arial"/>
+                <w:color w:val="1A1A1A"/>
+                <w:sz w:val="21"/>
+                <w:szCs w:val="21"/>
+              </w:rPr>
+              <w:t xml:space="preserve">竞品分析时间从数天压缩到 1 小时内；统一框架让结果可沉淀复用；支持高频更新，让竞品洞察变成常态化能力而非一次性项目。</w:t>
+            </w:r>
+          </w:p>
+        </w:tc>
+      </w:tr>
+    </w:tbl>
+    <w:p>
+      <w:pPr>
+        <w:spacing w:after="240" w:before="0"/>
+      </w:pPr>
+    </w:p>
+    <w:p>
+      <w:pPr>
+        <w:pageBreakBefore/>
+      </w:pPr>
+    </w:p>
+    <w:tbl>
+      <w:tblPr>
+        <w:tblW w:type="dxa" w:w="9360"/>
+        <w:tblBorders>
+          <w:top w:val="single" w:color="auto" w:sz="4"/>
+          <w:left w:val="single" w:color="auto" w:sz="4"/>
+          <w:bottom w:val="single" w:color="auto" w:sz="4"/>
+          <w:right w:val="single" w:color="auto" w:sz="4"/>
+          <w:insideH w:val="single" w:color="auto" w:sz="4"/>
+          <w:insideV w:val="single" w:color="auto" w:sz="4"/>
+        </w:tblBorders>
+      </w:tblPr>
+      <w:tblGrid>
+        <w:gridCol w:w="700"/>
+        <w:gridCol w:w="8660"/>
+      </w:tblGrid>
+      <w:tr>
+        <w:tc>
+          <w:tcPr>
+            <w:tcW w:type="dxa" w:w="700"/>
+            <w:tcBorders>
+              <w:top w:val="single" w:color="1B4F8A" w:sz="1"/>
+              <w:left w:val="single" w:color="1B4F8A" w:sz="1"/>
+              <w:bottom w:val="single" w:color="1B4F8A" w:sz="1"/>
+              <w:right w:val="single" w:color="1B4F8A" w:sz="1"/>
+            </w:tcBorders>
+            <w:shd w:fill="1B4F8A" w:val="clear"/>
+            <w:tcMar>
+              <w:top w:type="dxa" w:w="120"/>
+              <w:left w:type="dxa" w:w="140"/>
+              <w:bottom w:type="dxa" w:w="120"/>
+              <w:right w:type="dxa" w:w="140"/>
+            </w:tcMar>
+            <w:vAlign w:val="center"/>
+          </w:tcPr>
+          <w:p>
+            <w:pPr>
+              <w:jc w:val="center"/>
+            </w:pPr>
+            <w:r>
+              <w:rPr>
+                <w:rFonts w:ascii="Arial" w:cs="Arial" w:eastAsia="Arial" w:hAnsi="Arial"/>
+                <w:b/>
+                <w:bCs/>
+                <w:color w:val="FFFFFF"/>
+                <w:sz w:val="28"/>
+                <w:szCs w:val="28"/>
+              </w:rPr>
+              <w:t xml:space="preserve">11</w:t>
+            </w:r>
+          </w:p>
+        </w:tc>
+        <w:tc>
+          <w:tcPr>
+            <w:tcW w:type="dxa" w:w="8660"/>
+            <w:tcBorders>
+              <w:top w:val="single" w:color="1B4F8A" w:sz="1"/>
+              <w:left w:val="single" w:color="1B4F8A" w:sz="1"/>
+              <w:bottom w:val="single" w:color="1B4F8A" w:sz="1"/>
+              <w:right w:val="single" w:color="1B4F8A" w:sz="1"/>
+            </w:tcBorders>
+            <w:shd w:fill="1B4F8A" w:val="clear"/>
+            <w:tcMar>
+              <w:top w:type="dxa" w:w="120"/>
+              <w:left w:type="dxa" w:w="160"/>
+              <w:bottom w:type="dxa" w:w="120"/>
+              <w:right w:type="dxa" w:w="160"/>
+            </w:tcMar>
+          </w:tcPr>
+          <w:p>
+            <w:r>
+              <w:rPr>
+                <w:rFonts w:ascii="Arial" w:cs="Arial" w:eastAsia="Arial" w:hAnsi="Arial"/>
+                <w:b/>
+                <w:bCs/>
+                <w:color w:val="FFFFFF"/>
+                <w:sz w:val="28"/>
+                <w:szCs w:val="28"/>
+              </w:rPr>
+              <w:t xml:space="preserve">客户画像自动生成  </w:t>
+            </w:r>
+            <w:r>
+              <w:rPr>
+                <w:rFonts w:ascii="Arial" w:cs="Arial" w:eastAsia="Arial" w:hAnsi="Arial"/>
+                <w:color w:val="A8D0F0"/>
+                <w:sz w:val="18"/>
+                <w:szCs w:val="18"/>
+              </w:rPr>
+              <w:t xml:space="preserve">可交付</w:t>
+            </w:r>
+          </w:p>
+          <w:p>
+            <w:pPr>
+              <w:spacing w:before="40"/>
+            </w:pPr>
+            <w:r>
+              <w:rPr>
+                <w:rFonts w:ascii="Arial" w:cs="Arial" w:eastAsia="Arial" w:hAnsi="Arial"/>
+                <w:color w:val="C8DFF0"/>
+                <w:sz w:val="20"/>
+                <w:szCs w:val="20"/>
+              </w:rPr>
+              <w:t xml:space="preserve">从对话和行为数据中自动提炼客户洞察</w:t>
+            </w:r>
+          </w:p>
+        </w:tc>
+      </w:tr>
+      <w:tr>
+        <w:tc>
+          <w:tcPr>
+            <w:tcW w:type="dxa" w:w="1400"/>
+            <w:tcBorders>
+              <w:top w:val="single" w:color="E8E8E8" w:sz="1"/>
+              <w:left w:val="single" w:color="CCCCCC" w:sz="1"/>
+              <w:bottom w:val="single" w:color="E8E8E8" w:sz="1"/>
+              <w:right w:val="single" w:color="D0D0D0" w:sz="1"/>
+            </w:tcBorders>
+            <w:shd w:fill="F5F5F5" w:val="clear"/>
+            <w:tcMar>
+              <w:top w:type="dxa" w:w="100"/>
+              <w:left w:type="dxa" w:w="140"/>
+              <w:bottom w:type="dxa" w:w="100"/>
+              <w:right w:type="dxa" w:w="140"/>
+            </w:tcMar>
+            <w:vAlign w:val="top"/>
+          </w:tcPr>
+          <w:p>
+            <w:r>
+              <w:rPr>
+                <w:rFonts w:ascii="Arial" w:cs="Arial" w:eastAsia="Arial" w:hAnsi="Arial"/>
+                <w:b/>
+                <w:bCs/>
+                <w:color w:val="2E86C1"/>
+                <w:sz w:val="20"/>
+                <w:szCs w:val="20"/>
+              </w:rPr>
+              <w:t xml:space="preserve">应用场景</w:t>
+            </w:r>
+          </w:p>
+        </w:tc>
+        <w:tc>
+          <w:tcPr>
+            <w:tcW w:type="dxa" w:w="7960"/>
+            <w:tcBorders>
+              <w:top w:val="single" w:color="E8E8E8" w:sz="1"/>
+              <w:left w:val="single" w:color="D0D0D0" w:sz="1"/>
+              <w:bottom w:val="single" w:color="E8E8E8" w:sz="1"/>
+              <w:right w:val="single" w:color="CCCCCC" w:sz="1"/>
+            </w:tcBorders>
+            <w:tcMar>
+              <w:top w:type="dxa" w:w="100"/>
+              <w:left w:type="dxa" w:w="160"/>
+              <w:bottom w:type="dxa" w:w="100"/>
+              <w:right w:type="dxa" w:w="160"/>
+            </w:tcMar>
+          </w:tcPr>
+          <w:p>
+            <w:pPr>
+              <w:spacing w:after="0" w:before="0"/>
+            </w:pPr>
+            <w:r>
+              <w:rPr>
+                <w:rFonts w:ascii="Arial" w:cs="Arial" w:eastAsia="Arial" w:hAnsi="Arial"/>
+                <w:color w:val="1A1A1A"/>
+                <w:sz w:val="21"/>
+                <w:szCs w:val="21"/>
+              </w:rPr>
+              <w:t xml:space="preserve">销售团队、客服部门积累了大量与客户的沟通记录（CRM、聊天记录、邮件往来），但这些信息分散、非结构化，无法直接用于销售策略或产品改进。</w:t>
+            </w:r>
+          </w:p>
+        </w:tc>
+      </w:tr>
+      <w:tr>
+        <w:tc>
+          <w:tcPr>
+            <w:tcW w:type="dxa" w:w="1400"/>
+            <w:tcBorders>
+              <w:top w:val="single" w:color="E8E8E8" w:sz="1"/>
+              <w:left w:val="single" w:color="CCCCCC" w:sz="1"/>
+              <w:bottom w:val="single" w:color="E8E8E8" w:sz="1"/>
+              <w:right w:val="single" w:color="D0D0D0" w:sz="1"/>
+            </w:tcBorders>
+            <w:shd w:fill="F5F5F5" w:val="clear"/>
+            <w:tcMar>
+              <w:top w:type="dxa" w:w="100"/>
+              <w:left w:type="dxa" w:w="140"/>
+              <w:bottom w:type="dxa" w:w="100"/>
+              <w:right w:type="dxa" w:w="140"/>
+            </w:tcMar>
+            <w:vAlign w:val="top"/>
+          </w:tcPr>
+          <w:p>
+            <w:r>
+              <w:rPr>
+                <w:rFonts w:ascii="Arial" w:cs="Arial" w:eastAsia="Arial" w:hAnsi="Arial"/>
+                <w:b/>
+                <w:bCs/>
+                <w:color w:val="2E86C1"/>
+                <w:sz w:val="20"/>
+                <w:szCs w:val="20"/>
+              </w:rPr>
+              <w:t xml:space="preserve">用户痛点</w:t>
+            </w:r>
+          </w:p>
+        </w:tc>
+        <w:tc>
+          <w:tcPr>
+            <w:tcW w:type="dxa" w:w="7960"/>
+            <w:tcBorders>
+              <w:top w:val="single" w:color="E8E8E8" w:sz="1"/>
+              <w:left w:val="single" w:color="D0D0D0" w:sz="1"/>
+              <w:bottom w:val="single" w:color="E8E8E8" w:sz="1"/>
+              <w:right w:val="single" w:color="CCCCCC" w:sz="1"/>
+            </w:tcBorders>
+            <w:tcMar>
+              <w:top w:type="dxa" w:w="100"/>
+              <w:left w:type="dxa" w:w="160"/>
+              <w:bottom w:type="dxa" w:w="100"/>
+              <w:right w:type="dxa" w:w="160"/>
+            </w:tcMar>
+          </w:tcPr>
+          <w:p>
+            <w:pPr>
+              <w:pStyle w:val="ListParagraph"/>
+              <w:numPr>
+                <w:ilvl w:val="0"/>
+                <w:numId w:val="2"/>
+              </w:numPr>
+              <w:spacing w:after="30" w:before="30"/>
+            </w:pPr>
+            <w:r>
+              <w:rPr>
+                <w:rFonts w:ascii="Arial" w:cs="Arial" w:eastAsia="Arial" w:hAnsi="Arial"/>
+                <w:color w:val="1A1A1A"/>
+                <w:sz w:val="21"/>
+                <w:szCs w:val="21"/>
+              </w:rPr>
+              <w:t xml:space="preserve">客户信息散落在 CRM、邮件、聊天记录中，无法统一分析</w:t>
+            </w:r>
+          </w:p>
+          <w:p>
+            <w:pPr>
+              <w:pStyle w:val="ListParagraph"/>
+              <w:numPr>
+                <w:ilvl w:val="0"/>
+                <w:numId w:val="2"/>
+              </w:numPr>
+              <w:spacing w:after="30" w:before="30"/>
+            </w:pPr>
+            <w:r>
+              <w:rPr>
+                <w:rFonts w:ascii="Arial" w:cs="Arial" w:eastAsia="Arial" w:hAnsi="Arial"/>
+                <w:color w:val="1A1A1A"/>
+                <w:sz w:val="21"/>
+                <w:szCs w:val="21"/>
+              </w:rPr>
+              <w:t xml:space="preserve">销售凭个人经验判断客户需求，标准不一</w:t>
+            </w:r>
+          </w:p>
+          <w:p>
+            <w:pPr>
+              <w:pStyle w:val="ListParagraph"/>
+              <w:numPr>
+                <w:ilvl w:val="0"/>
+                <w:numId w:val="2"/>
+              </w:numPr>
+              <w:spacing w:after="30" w:before="30"/>
+            </w:pPr>
+            <w:r>
+              <w:rPr>
+                <w:rFonts w:ascii="Arial" w:cs="Arial" w:eastAsia="Arial" w:hAnsi="Arial"/>
+                <w:color w:val="1A1A1A"/>
+                <w:sz w:val="21"/>
+                <w:szCs w:val="21"/>
+              </w:rPr>
+              <w:t xml:space="preserve">客户分层、需求分析全靠人工，耗时且主观</w:t>
+            </w:r>
+          </w:p>
+          <w:p>
+            <w:pPr>
+              <w:pStyle w:val="ListParagraph"/>
+              <w:numPr>
+                <w:ilvl w:val="0"/>
+                <w:numId w:val="2"/>
+              </w:numPr>
+              <w:spacing w:after="30" w:before="30"/>
+            </w:pPr>
+            <w:r>
+              <w:rPr>
+                <w:rFonts w:ascii="Arial" w:cs="Arial" w:eastAsia="Arial" w:hAnsi="Arial"/>
+                <w:color w:val="1A1A1A"/>
+                <w:sz w:val="21"/>
+                <w:szCs w:val="21"/>
+              </w:rPr>
+              <w:t xml:space="preserve">难以发现不同客户群体之间的共性规律</w:t>
+            </w:r>
+          </w:p>
+        </w:tc>
+      </w:tr>
+      <w:tr>
+        <w:tc>
+          <w:tcPr>
+            <w:tcW w:type="dxa" w:w="1400"/>
+            <w:tcBorders>
+              <w:top w:val="single" w:color="E8E8E8" w:sz="1"/>
+              <w:left w:val="single" w:color="CCCCCC" w:sz="1"/>
+              <w:bottom w:val="single" w:color="E8E8E8" w:sz="1"/>
+              <w:right w:val="single" w:color="D0D0D0" w:sz="1"/>
+            </w:tcBorders>
+            <w:shd w:fill="F5F5F5" w:val="clear"/>
+            <w:tcMar>
+              <w:top w:type="dxa" w:w="100"/>
+              <w:left w:type="dxa" w:w="140"/>
+              <w:bottom w:type="dxa" w:w="100"/>
+              <w:right w:type="dxa" w:w="140"/>
+            </w:tcMar>
+            <w:vAlign w:val="top"/>
+          </w:tcPr>
+          <w:p>
+            <w:r>
+              <w:rPr>
+                <w:rFonts w:ascii="Arial" w:cs="Arial" w:eastAsia="Arial" w:hAnsi="Arial"/>
+                <w:b/>
+                <w:bCs/>
+                <w:color w:val="2E86C1"/>
+                <w:sz w:val="20"/>
+                <w:szCs w:val="20"/>
+              </w:rPr>
+              <w:t xml:space="preserve">我们的解决方案</w:t>
+            </w:r>
+          </w:p>
+        </w:tc>
+        <w:tc>
+          <w:tcPr>
+            <w:tcW w:type="dxa" w:w="7960"/>
+            <w:tcBorders>
+              <w:top w:val="single" w:color="E8E8E8" w:sz="1"/>
+              <w:left w:val="single" w:color="D0D0D0" w:sz="1"/>
+              <w:bottom w:val="single" w:color="E8E8E8" w:sz="1"/>
+              <w:right w:val="single" w:color="CCCCCC" w:sz="1"/>
+            </w:tcBorders>
+            <w:tcMar>
+              <w:top w:type="dxa" w:w="100"/>
+              <w:left w:type="dxa" w:w="160"/>
+              <w:bottom w:type="dxa" w:w="100"/>
+              <w:right w:type="dxa" w:w="160"/>
+            </w:tcMar>
+          </w:tcPr>
+          <w:p>
+            <w:pPr>
+              <w:spacing w:after="0" w:before="0"/>
+            </w:pPr>
+            <w:r>
+              <w:rPr>
+                <w:rFonts w:ascii="Arial" w:cs="Arial" w:eastAsia="Arial" w:hAnsi="Arial"/>
+                <w:color w:val="1A1A1A"/>
+                <w:sz w:val="21"/>
+                <w:szCs w:val="21"/>
+              </w:rPr>
+              <w:t xml:space="preserve">输入客户沟通记录、购买历史、反馈数据，系统自动提炼客户标签（行业、规模、需求痛点、决策风格、价格敏感度），生成结构化客户画像，并识别不同客户群体的共性特征，辅助销售策略和产品迭代决策。</w:t>
+            </w:r>
+          </w:p>
+        </w:tc>
+      </w:tr>
+      <w:tr>
+        <w:tc>
+          <w:tcPr>
+            <w:tcW w:type="dxa" w:w="1400"/>
+            <w:tcBorders>
+              <w:top w:val="single" w:color="E8E8E8" w:sz="1"/>
+              <w:left w:val="single" w:color="CCCCCC" w:sz="1"/>
+              <w:bottom w:val="single" w:color="E8E8E8" w:sz="1"/>
+              <w:right w:val="single" w:color="D0D0D0" w:sz="1"/>
+            </w:tcBorders>
+            <w:shd w:fill="F5F5F5" w:val="clear"/>
+            <w:tcMar>
+              <w:top w:type="dxa" w:w="100"/>
+              <w:left w:type="dxa" w:w="140"/>
+              <w:bottom w:type="dxa" w:w="100"/>
+              <w:right w:type="dxa" w:w="140"/>
+            </w:tcMar>
+            <w:vAlign w:val="top"/>
+          </w:tcPr>
+          <w:p>
+            <w:r>
+              <w:rPr>
+                <w:rFonts w:ascii="Arial" w:cs="Arial" w:eastAsia="Arial" w:hAnsi="Arial"/>
+                <w:b/>
+                <w:bCs/>
+                <w:color w:val="2E86C1"/>
+                <w:sz w:val="20"/>
+                <w:szCs w:val="20"/>
+              </w:rPr>
+              <w:t xml:space="preserve">适合的甲方</w:t>
+            </w:r>
+          </w:p>
+        </w:tc>
+        <w:tc>
+          <w:tcPr>
+            <w:tcW w:type="dxa" w:w="7960"/>
+            <w:tcBorders>
+              <w:top w:val="single" w:color="E8E8E8" w:sz="1"/>
+              <w:left w:val="single" w:color="D0D0D0" w:sz="1"/>
+              <w:bottom w:val="single" w:color="E8E8E8" w:sz="1"/>
+              <w:right w:val="single" w:color="CCCCCC" w:sz="1"/>
+            </w:tcBorders>
+            <w:tcMar>
+              <w:top w:type="dxa" w:w="100"/>
+              <w:left w:type="dxa" w:w="160"/>
+              <w:bottom w:type="dxa" w:w="100"/>
+              <w:right w:type="dxa" w:w="160"/>
+            </w:tcMar>
+          </w:tcPr>
+          <w:p>
+            <w:pPr>
+              <w:spacing w:after="0" w:before="0"/>
+            </w:pPr>
+            <w:r>
+              <w:rPr>
+                <w:rFonts w:ascii="Arial" w:cs="Arial" w:eastAsia="Arial" w:hAnsi="Arial"/>
+                <w:color w:val="1A1A1A"/>
+                <w:sz w:val="21"/>
+                <w:szCs w:val="21"/>
+              </w:rPr>
+              <w:t xml:space="preserve">B2B 销售团队 / 电商运营 / 产品经理 / 市场营销部门 / 任何需要深入理解客户的团队</w:t>
+            </w:r>
+          </w:p>
+        </w:tc>
+      </w:tr>
+      <w:tr>
+        <w:tc>
+          <w:tcPr>
+            <w:tcW w:type="dxa" w:w="1400"/>
+            <w:tcBorders>
+              <w:top w:val="single" w:color="E8E8E8" w:sz="1"/>
+              <w:left w:val="single" w:color="CCCCCC" w:sz="1"/>
+              <w:bottom w:val="single" w:color="E8E8E8" w:sz="1"/>
+              <w:right w:val="single" w:color="D0D0D0" w:sz="1"/>
+            </w:tcBorders>
+            <w:shd w:fill="F5F5F5" w:val="clear"/>
+            <w:tcMar>
+              <w:top w:type="dxa" w:w="100"/>
+              <w:left w:type="dxa" w:w="140"/>
+              <w:bottom w:type="dxa" w:w="100"/>
+              <w:right w:type="dxa" w:w="140"/>
+            </w:tcMar>
+            <w:vAlign w:val="top"/>
+          </w:tcPr>
+          <w:p>
+            <w:r>
+              <w:rPr>
+                <w:rFonts w:ascii="Arial" w:cs="Arial" w:eastAsia="Arial" w:hAnsi="Arial"/>
+                <w:b/>
+                <w:bCs/>
+                <w:color w:val="2E86C1"/>
+                <w:sz w:val="20"/>
+                <w:szCs w:val="20"/>
+              </w:rPr>
+              <w:t xml:space="preserve">核心价值</w:t>
+            </w:r>
+          </w:p>
+        </w:tc>
+        <w:tc>
+          <w:tcPr>
+            <w:tcW w:type="dxa" w:w="7960"/>
+            <w:tcBorders>
+              <w:top w:val="single" w:color="E8E8E8" w:sz="1"/>
+              <w:left w:val="single" w:color="D0D0D0" w:sz="1"/>
+              <w:bottom w:val="single" w:color="E8E8E8" w:sz="1"/>
+              <w:right w:val="single" w:color="CCCCCC" w:sz="1"/>
+            </w:tcBorders>
+            <w:tcMar>
+              <w:top w:type="dxa" w:w="100"/>
+              <w:left w:type="dxa" w:w="160"/>
+              <w:bottom w:type="dxa" w:w="100"/>
+              <w:right w:type="dxa" w:w="160"/>
+            </w:tcMar>
+          </w:tcPr>
+          <w:p>
+            <w:pPr>
+              <w:spacing w:after="0" w:before="0"/>
+            </w:pPr>
+            <w:r>
+              <w:rPr>
+                <w:rFonts w:ascii="Arial" w:cs="Arial" w:eastAsia="Arial" w:hAnsi="Arial"/>
+                <w:color w:val="1A1A1A"/>
+                <w:sz w:val="21"/>
+                <w:szCs w:val="21"/>
+              </w:rPr>
+              <w:t xml:space="preserve">把散落的客户信息转化为可行动的洞察；销售策略由数据驱动而非个人经验驱动；客户分层标准化，提升团队整体销售效率。</w:t>
+            </w:r>
+          </w:p>
+        </w:tc>
+      </w:tr>
+    </w:tbl>
+    <w:p>
+      <w:pPr>
+        <w:spacing w:after="240" w:before="0"/>
+      </w:pPr>
+    </w:p>
+    <w:p>
+      <w:pPr>
+        <w:pageBreakBefore/>
+      </w:pPr>
+    </w:p>
+    <w:tbl>
+      <w:tblPr>
+        <w:tblW w:type="dxa" w:w="9360"/>
+        <w:tblBorders>
+          <w:top w:val="single" w:color="auto" w:sz="4"/>
+          <w:left w:val="single" w:color="auto" w:sz="4"/>
+          <w:bottom w:val="single" w:color="auto" w:sz="4"/>
+          <w:right w:val="single" w:color="auto" w:sz="4"/>
+          <w:insideH w:val="single" w:color="auto" w:sz="4"/>
+          <w:insideV w:val="single" w:color="auto" w:sz="4"/>
+        </w:tblBorders>
+      </w:tblPr>
+      <w:tblGrid>
+        <w:gridCol w:w="700"/>
+        <w:gridCol w:w="8660"/>
+      </w:tblGrid>
+      <w:tr>
+        <w:tc>
+          <w:tcPr>
+            <w:tcW w:type="dxa" w:w="700"/>
+            <w:tcBorders>
+              <w:top w:val="single" w:color="1B4F8A" w:sz="1"/>
+              <w:left w:val="single" w:color="1B4F8A" w:sz="1"/>
+              <w:bottom w:val="single" w:color="1B4F8A" w:sz="1"/>
+              <w:right w:val="single" w:color="1B4F8A" w:sz="1"/>
+            </w:tcBorders>
+            <w:shd w:fill="1B4F8A" w:val="clear"/>
+            <w:tcMar>
+              <w:top w:type="dxa" w:w="120"/>
+              <w:left w:type="dxa" w:w="140"/>
+              <w:bottom w:type="dxa" w:w="120"/>
+              <w:right w:type="dxa" w:w="140"/>
+            </w:tcMar>
+            <w:vAlign w:val="center"/>
+          </w:tcPr>
+          <w:p>
+            <w:pPr>
+              <w:jc w:val="center"/>
+            </w:pPr>
+            <w:r>
+              <w:rPr>
+                <w:rFonts w:ascii="Arial" w:cs="Arial" w:eastAsia="Arial" w:hAnsi="Arial"/>
+                <w:b/>
+                <w:bCs/>
+                <w:color w:val="FFFFFF"/>
+                <w:sz w:val="28"/>
+                <w:szCs w:val="28"/>
+              </w:rPr>
+              <w:t xml:space="preserve">12</w:t>
+            </w:r>
+          </w:p>
+        </w:tc>
+        <w:tc>
+          <w:tcPr>
+            <w:tcW w:type="dxa" w:w="8660"/>
+            <w:tcBorders>
+              <w:top w:val="single" w:color="1B4F8A" w:sz="1"/>
+              <w:left w:val="single" w:color="1B4F8A" w:sz="1"/>
+              <w:bottom w:val="single" w:color="1B4F8A" w:sz="1"/>
+              <w:right w:val="single" w:color="1B4F8A" w:sz="1"/>
+            </w:tcBorders>
+            <w:shd w:fill="1B4F8A" w:val="clear"/>
+            <w:tcMar>
+              <w:top w:type="dxa" w:w="120"/>
+              <w:left w:type="dxa" w:w="160"/>
+              <w:bottom w:type="dxa" w:w="120"/>
+              <w:right w:type="dxa" w:w="160"/>
+            </w:tcMar>
+          </w:tcPr>
+          <w:p>
+            <w:r>
+              <w:rPr>
+                <w:rFonts w:ascii="Arial" w:cs="Arial" w:eastAsia="Arial" w:hAnsi="Arial"/>
+                <w:b/>
+                <w:bCs/>
+                <w:color w:val="FFFFFF"/>
+                <w:sz w:val="28"/>
+                <w:szCs w:val="28"/>
+              </w:rPr>
+              <w:t xml:space="preserve">AI 培训题库生成  </w:t>
+            </w:r>
+            <w:r>
+              <w:rPr>
+                <w:rFonts w:ascii="Arial" w:cs="Arial" w:eastAsia="Arial" w:hAnsi="Arial"/>
+                <w:color w:val="A8D0F0"/>
+                <w:sz w:val="18"/>
+                <w:szCs w:val="18"/>
+              </w:rPr>
+              <w:t xml:space="preserve">可交付</w:t>
+            </w:r>
+          </w:p>
+          <w:p>
+            <w:pPr>
+              <w:spacing w:before="40"/>
+            </w:pPr>
+            <w:r>
+              <w:rPr>
+                <w:rFonts w:ascii="Arial" w:cs="Arial" w:eastAsia="Arial" w:hAnsi="Arial"/>
+                <w:color w:val="C8DFF0"/>
+                <w:sz w:val="20"/>
+                <w:szCs w:val="20"/>
+              </w:rPr>
+              <w:t xml:space="preserve">上传材料，自动生成覆盖全面的考题和练习</w:t>
+            </w:r>
+          </w:p>
+        </w:tc>
+      </w:tr>
+      <w:tr>
+        <w:tc>
+          <w:tcPr>
+            <w:tcW w:type="dxa" w:w="1400"/>
+            <w:tcBorders>
+              <w:top w:val="single" w:color="E8E8E8" w:sz="1"/>
+              <w:left w:val="single" w:color="CCCCCC" w:sz="1"/>
+              <w:bottom w:val="single" w:color="E8E8E8" w:sz="1"/>
+              <w:right w:val="single" w:color="D0D0D0" w:sz="1"/>
+            </w:tcBorders>
+            <w:shd w:fill="F5F5F5" w:val="clear"/>
+            <w:tcMar>
+              <w:top w:type="dxa" w:w="100"/>
+              <w:left w:type="dxa" w:w="140"/>
+              <w:bottom w:type="dxa" w:w="100"/>
+              <w:right w:type="dxa" w:w="140"/>
+            </w:tcMar>
+            <w:vAlign w:val="top"/>
+          </w:tcPr>
+          <w:p>
+            <w:r>
+              <w:rPr>
+                <w:rFonts w:ascii="Arial" w:cs="Arial" w:eastAsia="Arial" w:hAnsi="Arial"/>
+                <w:b/>
+                <w:bCs/>
+                <w:color w:val="2E86C1"/>
+                <w:sz w:val="20"/>
+                <w:szCs w:val="20"/>
+              </w:rPr>
+              <w:t xml:space="preserve">应用场景</w:t>
+            </w:r>
+          </w:p>
+        </w:tc>
+        <w:tc>
+          <w:tcPr>
+            <w:tcW w:type="dxa" w:w="7960"/>
+            <w:tcBorders>
+              <w:top w:val="single" w:color="E8E8E8" w:sz="1"/>
+              <w:left w:val="single" w:color="D0D0D0" w:sz="1"/>
+              <w:bottom w:val="single" w:color="E8E8E8" w:sz="1"/>
+              <w:right w:val="single" w:color="CCCCCC" w:sz="1"/>
+            </w:tcBorders>
+            <w:tcMar>
+              <w:top w:type="dxa" w:w="100"/>
+              <w:left w:type="dxa" w:w="160"/>
+              <w:bottom w:type="dxa" w:w="100"/>
+              <w:right w:type="dxa" w:w="160"/>
+            </w:tcMar>
+          </w:tcPr>
+          <w:p>
+            <w:pPr>
+              <w:spacing w:after="0" w:before="0"/>
+            </w:pPr>
+            <w:r>
+              <w:rPr>
+                <w:rFonts w:ascii="Arial" w:cs="Arial" w:eastAsia="Arial" w:hAnsi="Arial"/>
+                <w:color w:val="1A1A1A"/>
+                <w:sz w:val="21"/>
+                <w:szCs w:val="21"/>
+              </w:rPr>
+              <w:t xml:space="preserve">企业培训部门、教育机构需要针对培训材料制作考题和练习册，目前全部依赖人工，制作周期长，题目质量参差不齐，材料更新后题库同步成本高。</w:t>
+            </w:r>
+          </w:p>
+        </w:tc>
+      </w:tr>
+      <w:tr>
+        <w:tc>
+          <w:tcPr>
+            <w:tcW w:type="dxa" w:w="1400"/>
+            <w:tcBorders>
+              <w:top w:val="single" w:color="E8E8E8" w:sz="1"/>
+              <w:left w:val="single" w:color="CCCCCC" w:sz="1"/>
+              <w:bottom w:val="single" w:color="E8E8E8" w:sz="1"/>
+              <w:right w:val="single" w:color="D0D0D0" w:sz="1"/>
+            </w:tcBorders>
+            <w:shd w:fill="F5F5F5" w:val="clear"/>
+            <w:tcMar>
+              <w:top w:type="dxa" w:w="100"/>
+              <w:left w:type="dxa" w:w="140"/>
+              <w:bottom w:type="dxa" w:w="100"/>
+              <w:right w:type="dxa" w:w="140"/>
+            </w:tcMar>
+            <w:vAlign w:val="top"/>
+          </w:tcPr>
+          <w:p>
+            <w:r>
+              <w:rPr>
+                <w:rFonts w:ascii="Arial" w:cs="Arial" w:eastAsia="Arial" w:hAnsi="Arial"/>
+                <w:b/>
+                <w:bCs/>
+                <w:color w:val="2E86C1"/>
+                <w:sz w:val="20"/>
+                <w:szCs w:val="20"/>
+              </w:rPr>
+              <w:t xml:space="preserve">用户痛点</w:t>
+            </w:r>
+          </w:p>
+        </w:tc>
+        <w:tc>
+          <w:tcPr>
+            <w:tcW w:type="dxa" w:w="7960"/>
+            <w:tcBorders>
+              <w:top w:val="single" w:color="E8E8E8" w:sz="1"/>
+              <w:left w:val="single" w:color="D0D0D0" w:sz="1"/>
+              <w:bottom w:val="single" w:color="E8E8E8" w:sz="1"/>
+              <w:right w:val="single" w:color="CCCCCC" w:sz="1"/>
+            </w:tcBorders>
+            <w:tcMar>
+              <w:top w:type="dxa" w:w="100"/>
+              <w:left w:type="dxa" w:w="160"/>
+              <w:bottom w:type="dxa" w:w="100"/>
+              <w:right w:type="dxa" w:w="160"/>
+            </w:tcMar>
+          </w:tcPr>
+          <w:p>
+            <w:pPr>
+              <w:pStyle w:val="ListParagraph"/>
+              <w:numPr>
+                <w:ilvl w:val="0"/>
+                <w:numId w:val="2"/>
+              </w:numPr>
+              <w:spacing w:after="30" w:before="30"/>
+            </w:pPr>
+            <w:r>
+              <w:rPr>
+                <w:rFonts w:ascii="Arial" w:cs="Arial" w:eastAsia="Arial" w:hAnsi="Arial"/>
+                <w:color w:val="1A1A1A"/>
+                <w:sz w:val="21"/>
+                <w:szCs w:val="21"/>
+              </w:rPr>
+              <w:t xml:space="preserve">出题耗时耗力，一套完整题库需要数天甚至数周</w:t>
+            </w:r>
+          </w:p>
+          <w:p>
+            <w:pPr>
+              <w:pStyle w:val="ListParagraph"/>
+              <w:numPr>
+                <w:ilvl w:val="0"/>
+                <w:numId w:val="2"/>
+              </w:numPr>
+              <w:spacing w:after="30" w:before="30"/>
+            </w:pPr>
+            <w:r>
+              <w:rPr>
+                <w:rFonts w:ascii="Arial" w:cs="Arial" w:eastAsia="Arial" w:hAnsi="Arial"/>
+                <w:color w:val="1A1A1A"/>
+                <w:sz w:val="21"/>
+                <w:szCs w:val="21"/>
+              </w:rPr>
+              <w:t xml:space="preserve">题目覆盖率不均匀，重要知识点容易遗漏</w:t>
+            </w:r>
+          </w:p>
+          <w:p>
+            <w:pPr>
+              <w:pStyle w:val="ListParagraph"/>
+              <w:numPr>
+                <w:ilvl w:val="0"/>
+                <w:numId w:val="2"/>
+              </w:numPr>
+              <w:spacing w:after="30" w:before="30"/>
+            </w:pPr>
+            <w:r>
+              <w:rPr>
+                <w:rFonts w:ascii="Arial" w:cs="Arial" w:eastAsia="Arial" w:hAnsi="Arial"/>
+                <w:color w:val="1A1A1A"/>
+                <w:sz w:val="21"/>
+                <w:szCs w:val="21"/>
+              </w:rPr>
+              <w:t xml:space="preserve">不同出题人风格不一致，题目质量参差不齐</w:t>
+            </w:r>
+          </w:p>
+          <w:p>
+            <w:pPr>
+              <w:pStyle w:val="ListParagraph"/>
+              <w:numPr>
+                <w:ilvl w:val="0"/>
+                <w:numId w:val="2"/>
+              </w:numPr>
+              <w:spacing w:after="30" w:before="30"/>
+            </w:pPr>
+            <w:r>
+              <w:rPr>
+                <w:rFonts w:ascii="Arial" w:cs="Arial" w:eastAsia="Arial" w:hAnsi="Arial"/>
+                <w:color w:val="1A1A1A"/>
+                <w:sz w:val="21"/>
+                <w:szCs w:val="21"/>
+              </w:rPr>
+              <w:t xml:space="preserve">培训材料更新后，题库同步更新成本高</w:t>
+            </w:r>
+          </w:p>
+        </w:tc>
+      </w:tr>
+      <w:tr>
+        <w:tc>
+          <w:tcPr>
+            <w:tcW w:type="dxa" w:w="1400"/>
+            <w:tcBorders>
+              <w:top w:val="single" w:color="E8E8E8" w:sz="1"/>
+              <w:left w:val="single" w:color="CCCCCC" w:sz="1"/>
+              <w:bottom w:val="single" w:color="E8E8E8" w:sz="1"/>
+              <w:right w:val="single" w:color="D0D0D0" w:sz="1"/>
+            </w:tcBorders>
+            <w:shd w:fill="F5F5F5" w:val="clear"/>
+            <w:tcMar>
+              <w:top w:type="dxa" w:w="100"/>
+              <w:left w:type="dxa" w:w="140"/>
+              <w:bottom w:type="dxa" w:w="100"/>
+              <w:right w:type="dxa" w:w="140"/>
+            </w:tcMar>
+            <w:vAlign w:val="top"/>
+          </w:tcPr>
+          <w:p>
+            <w:r>
+              <w:rPr>
+                <w:rFonts w:ascii="Arial" w:cs="Arial" w:eastAsia="Arial" w:hAnsi="Arial"/>
+                <w:b/>
+                <w:bCs/>
+                <w:color w:val="2E86C1"/>
+                <w:sz w:val="20"/>
+                <w:szCs w:val="20"/>
+              </w:rPr>
+              <w:t xml:space="preserve">我们的解决方案</w:t>
+            </w:r>
+          </w:p>
+        </w:tc>
+        <w:tc>
+          <w:tcPr>
+            <w:tcW w:type="dxa" w:w="7960"/>
+            <w:tcBorders>
+              <w:top w:val="single" w:color="E8E8E8" w:sz="1"/>
+              <w:left w:val="single" w:color="D0D0D0" w:sz="1"/>
+              <w:bottom w:val="single" w:color="E8E8E8" w:sz="1"/>
+              <w:right w:val="single" w:color="CCCCCC" w:sz="1"/>
+            </w:tcBorders>
+            <w:tcMar>
+              <w:top w:type="dxa" w:w="100"/>
+              <w:left w:type="dxa" w:w="160"/>
+              <w:bottom w:type="dxa" w:w="100"/>
+              <w:right w:type="dxa" w:w="160"/>
+            </w:tcMar>
+          </w:tcPr>
+          <w:p>
+            <w:pPr>
+              <w:spacing w:after="0" w:before="0"/>
+            </w:pPr>
+            <w:r>
+              <w:rPr>
+                <w:rFonts w:ascii="Arial" w:cs="Arial" w:eastAsia="Arial" w:hAnsi="Arial"/>
+                <w:color w:val="1A1A1A"/>
+                <w:sz w:val="21"/>
+                <w:szCs w:val="21"/>
+              </w:rPr>
+              <w:t xml:space="preserve">上传培训课件、操作手册、规章制度等材料，系统自动生成多种题型（单选题、多选题、判断题、简答题、情景案例题），并附参考答案和考点出处，支持难度分级和按章节导出，材料更新后一键同步题库。</w:t>
+            </w:r>
+          </w:p>
+        </w:tc>
+      </w:tr>
+      <w:tr>
+        <w:tc>
+          <w:tcPr>
+            <w:tcW w:type="dxa" w:w="1400"/>
+            <w:tcBorders>
+              <w:top w:val="single" w:color="E8E8E8" w:sz="1"/>
+              <w:left w:val="single" w:color="CCCCCC" w:sz="1"/>
+              <w:bottom w:val="single" w:color="E8E8E8" w:sz="1"/>
+              <w:right w:val="single" w:color="D0D0D0" w:sz="1"/>
+            </w:tcBorders>
+            <w:shd w:fill="F5F5F5" w:val="clear"/>
+            <w:tcMar>
+              <w:top w:type="dxa" w:w="100"/>
+              <w:left w:type="dxa" w:w="140"/>
+              <w:bottom w:type="dxa" w:w="100"/>
+              <w:right w:type="dxa" w:w="140"/>
+            </w:tcMar>
+            <w:vAlign w:val="top"/>
+          </w:tcPr>
+          <w:p>
+            <w:r>
+              <w:rPr>
+                <w:rFonts w:ascii="Arial" w:cs="Arial" w:eastAsia="Arial" w:hAnsi="Arial"/>
+                <w:b/>
+                <w:bCs/>
+                <w:color w:val="2E86C1"/>
+                <w:sz w:val="20"/>
+                <w:szCs w:val="20"/>
+              </w:rPr>
+              <w:t xml:space="preserve">适合的甲方</w:t>
+            </w:r>
+          </w:p>
+        </w:tc>
+        <w:tc>
+          <w:tcPr>
+            <w:tcW w:type="dxa" w:w="7960"/>
+            <w:tcBorders>
+              <w:top w:val="single" w:color="E8E8E8" w:sz="1"/>
+              <w:left w:val="single" w:color="D0D0D0" w:sz="1"/>
+              <w:bottom w:val="single" w:color="E8E8E8" w:sz="1"/>
+              <w:right w:val="single" w:color="CCCCCC" w:sz="1"/>
+            </w:tcBorders>
+            <w:tcMar>
+              <w:top w:type="dxa" w:w="100"/>
+              <w:left w:type="dxa" w:w="160"/>
+              <w:bottom w:type="dxa" w:w="100"/>
+              <w:right w:type="dxa" w:w="160"/>
+            </w:tcMar>
+          </w:tcPr>
+          <w:p>
+            <w:pPr>
+              <w:spacing w:after="0" w:before="0"/>
+            </w:pPr>
+            <w:r>
+              <w:rPr>
+                <w:rFonts w:ascii="Arial" w:cs="Arial" w:eastAsia="Arial" w:hAnsi="Arial"/>
+                <w:color w:val="1A1A1A"/>
+                <w:sz w:val="21"/>
+                <w:szCs w:val="21"/>
+              </w:rPr>
+              <w:t xml:space="preserve">企业培训部门 / 在线教育平台 / 职业技能培训机构 / 政府单位合规培训 / 金融保险行业资质考核</w:t>
+            </w:r>
+          </w:p>
+        </w:tc>
+      </w:tr>
+      <w:tr>
+        <w:tc>
+          <w:tcPr>
+            <w:tcW w:type="dxa" w:w="1400"/>
+            <w:tcBorders>
+              <w:top w:val="single" w:color="E8E8E8" w:sz="1"/>
+              <w:left w:val="single" w:color="CCCCCC" w:sz="1"/>
+              <w:bottom w:val="single" w:color="E8E8E8" w:sz="1"/>
+              <w:right w:val="single" w:color="D0D0D0" w:sz="1"/>
+            </w:tcBorders>
+            <w:shd w:fill="F5F5F5" w:val="clear"/>
+            <w:tcMar>
+              <w:top w:type="dxa" w:w="100"/>
+              <w:left w:type="dxa" w:w="140"/>
+              <w:bottom w:type="dxa" w:w="100"/>
+              <w:right w:type="dxa" w:w="140"/>
+            </w:tcMar>
+            <w:vAlign w:val="top"/>
+          </w:tcPr>
+          <w:p>
+            <w:r>
+              <w:rPr>
+                <w:rFonts w:ascii="Arial" w:cs="Arial" w:eastAsia="Arial" w:hAnsi="Arial"/>
+                <w:b/>
+                <w:bCs/>
+                <w:color w:val="2E86C1"/>
+                <w:sz w:val="20"/>
+                <w:szCs w:val="20"/>
+              </w:rPr>
+              <w:t xml:space="preserve">核心价值</w:t>
+            </w:r>
+          </w:p>
+        </w:tc>
+        <w:tc>
+          <w:tcPr>
+            <w:tcW w:type="dxa" w:w="7960"/>
+            <w:tcBorders>
+              <w:top w:val="single" w:color="E8E8E8" w:sz="1"/>
+              <w:left w:val="single" w:color="D0D0D0" w:sz="1"/>
+              <w:bottom w:val="single" w:color="E8E8E8" w:sz="1"/>
+              <w:right w:val="single" w:color="CCCCCC" w:sz="1"/>
+            </w:tcBorders>
+            <w:tcMar>
+              <w:top w:type="dxa" w:w="100"/>
+              <w:left w:type="dxa" w:w="160"/>
+              <w:bottom w:type="dxa" w:w="100"/>
+              <w:right w:type="dxa" w:w="160"/>
+            </w:tcMar>
+          </w:tcPr>
+          <w:p>
+            <w:pPr>
+              <w:spacing w:after="0" w:before="0"/>
+            </w:pPr>
+            <w:r>
+              <w:rPr>
+                <w:rFonts w:ascii="Arial" w:cs="Arial" w:eastAsia="Arial" w:hAnsi="Arial"/>
+                <w:color w:val="1A1A1A"/>
+                <w:sz w:val="21"/>
+                <w:szCs w:val="21"/>
+              </w:rPr>
+              <w:t xml:space="preserve">出题时间从数天压缩到分钟级；知识点覆盖全面不遗漏；题库随材料更新一键同步；培训效果可量化评估，形成完整培训闭环。</w:t>
+            </w:r>
+          </w:p>
+        </w:tc>
+      </w:tr>
+    </w:tbl>
+    <w:p>
+      <w:pPr>
+        <w:spacing w:after="240" w:before="0"/>
+      </w:pPr>
+    </w:p>
+    <w:p>
+      <w:pPr>
+        <w:pageBreakBefore/>
+      </w:pPr>
+    </w:p>
+    <w:tbl>
+      <w:tblPr>
+        <w:tblW w:type="dxa" w:w="9360"/>
+        <w:tblBorders>
+          <w:top w:val="single" w:color="auto" w:sz="4"/>
+          <w:left w:val="single" w:color="auto" w:sz="4"/>
+          <w:bottom w:val="single" w:color="auto" w:sz="4"/>
+          <w:right w:val="single" w:color="auto" w:sz="4"/>
+          <w:insideH w:val="single" w:color="auto" w:sz="4"/>
+          <w:insideV w:val="single" w:color="auto" w:sz="4"/>
+        </w:tblBorders>
+      </w:tblPr>
+      <w:tblGrid>
+        <w:gridCol w:w="700"/>
+        <w:gridCol w:w="8660"/>
+      </w:tblGrid>
+      <w:tr>
+        <w:tc>
+          <w:tcPr>
+            <w:tcW w:type="dxa" w:w="700"/>
+            <w:tcBorders>
+              <w:top w:val="single" w:color="1B4F8A" w:sz="1"/>
+              <w:left w:val="single" w:color="1B4F8A" w:sz="1"/>
+              <w:bottom w:val="single" w:color="1B4F8A" w:sz="1"/>
+              <w:right w:val="single" w:color="1B4F8A" w:sz="1"/>
+            </w:tcBorders>
+            <w:shd w:fill="1B4F8A" w:val="clear"/>
+            <w:tcMar>
+              <w:top w:type="dxa" w:w="120"/>
+              <w:left w:type="dxa" w:w="140"/>
+              <w:bottom w:type="dxa" w:w="120"/>
+              <w:right w:type="dxa" w:w="140"/>
+            </w:tcMar>
+            <w:vAlign w:val="center"/>
+          </w:tcPr>
+          <w:p>
+            <w:pPr>
+              <w:jc w:val="center"/>
+            </w:pPr>
+            <w:r>
+              <w:rPr>
+                <w:rFonts w:ascii="Arial" w:cs="Arial" w:eastAsia="Arial" w:hAnsi="Arial"/>
+                <w:b/>
+                <w:bCs/>
+                <w:color w:val="FFFFFF"/>
+                <w:sz w:val="28"/>
+                <w:szCs w:val="28"/>
+              </w:rPr>
+              <w:t xml:space="preserve">13</w:t>
+            </w:r>
+          </w:p>
+        </w:tc>
+        <w:tc>
+          <w:tcPr>
+            <w:tcW w:type="dxa" w:w="8660"/>
+            <w:tcBorders>
+              <w:top w:val="single" w:color="1B4F8A" w:sz="1"/>
+              <w:left w:val="single" w:color="1B4F8A" w:sz="1"/>
+              <w:bottom w:val="single" w:color="1B4F8A" w:sz="1"/>
+              <w:right w:val="single" w:color="1B4F8A" w:sz="1"/>
+            </w:tcBorders>
+            <w:shd w:fill="1B4F8A" w:val="clear"/>
+            <w:tcMar>
+              <w:top w:type="dxa" w:w="120"/>
+              <w:left w:type="dxa" w:w="160"/>
+              <w:bottom w:type="dxa" w:w="120"/>
+              <w:right w:type="dxa" w:w="160"/>
+            </w:tcMar>
+          </w:tcPr>
+          <w:p>
+            <w:r>
+              <w:rPr>
+                <w:rFonts w:ascii="Arial" w:cs="Arial" w:eastAsia="Arial" w:hAnsi="Arial"/>
+                <w:b/>
+                <w:bCs/>
+                <w:color w:val="FFFFFF"/>
+                <w:sz w:val="28"/>
+                <w:szCs w:val="28"/>
+              </w:rPr>
+              <w:t xml:space="preserve">AI 文本摘要与总结  </w:t>
+            </w:r>
+            <w:r>
+              <w:rPr>
+                <w:rFonts w:ascii="Arial" w:cs="Arial" w:eastAsia="Arial" w:hAnsi="Arial"/>
+                <w:color w:val="A8D0F0"/>
+                <w:sz w:val="18"/>
+                <w:szCs w:val="18"/>
+              </w:rPr>
+              <w:t xml:space="preserve">可交付</w:t>
+            </w:r>
+          </w:p>
+          <w:p>
+            <w:pPr>
+              <w:spacing w:before="40"/>
+            </w:pPr>
+            <w:r>
+              <w:rPr>
+                <w:rFonts w:ascii="Arial" w:cs="Arial" w:eastAsia="Arial" w:hAnsi="Arial"/>
+                <w:color w:val="C8DFF0"/>
+                <w:sz w:val="20"/>
+                <w:szCs w:val="20"/>
+              </w:rPr>
+              <w:t xml:space="preserve">长文档秒变精华，关键信息不遗漏</w:t>
+            </w:r>
+          </w:p>
+        </w:tc>
+      </w:tr>
+      <w:tr>
+        <w:tc>
+          <w:tcPr>
+            <w:tcW w:type="dxa" w:w="1400"/>
+            <w:tcBorders>
+              <w:top w:val="single" w:color="E8E8E8" w:sz="1"/>
+              <w:left w:val="single" w:color="CCCCCC" w:sz="1"/>
+              <w:bottom w:val="single" w:color="E8E8E8" w:sz="1"/>
+              <w:right w:val="single" w:color="D0D0D0" w:sz="1"/>
+            </w:tcBorders>
+            <w:shd w:fill="F5F5F5" w:val="clear"/>
+            <w:tcMar>
+              <w:top w:type="dxa" w:w="100"/>
+              <w:left w:type="dxa" w:w="140"/>
+              <w:bottom w:type="dxa" w:w="100"/>
+              <w:right w:type="dxa" w:w="140"/>
+            </w:tcMar>
+            <w:vAlign w:val="top"/>
+          </w:tcPr>
+          <w:p>
+            <w:r>
+              <w:rPr>
+                <w:rFonts w:ascii="Arial" w:cs="Arial" w:eastAsia="Arial" w:hAnsi="Arial"/>
+                <w:b/>
+                <w:bCs/>
+                <w:color w:val="2E86C1"/>
+                <w:sz w:val="20"/>
+                <w:szCs w:val="20"/>
+              </w:rPr>
+              <w:t xml:space="preserve">应用场景</w:t>
+            </w:r>
+          </w:p>
+        </w:tc>
+        <w:tc>
+          <w:tcPr>
+            <w:tcW w:type="dxa" w:w="7960"/>
+            <w:tcBorders>
+              <w:top w:val="single" w:color="E8E8E8" w:sz="1"/>
+              <w:left w:val="single" w:color="D0D0D0" w:sz="1"/>
+              <w:bottom w:val="single" w:color="E8E8E8" w:sz="1"/>
+              <w:right w:val="single" w:color="CCCCCC" w:sz="1"/>
+            </w:tcBorders>
+            <w:tcMar>
+              <w:top w:type="dxa" w:w="100"/>
+              <w:left w:type="dxa" w:w="160"/>
+              <w:bottom w:type="dxa" w:w="100"/>
+              <w:right w:type="dxa" w:w="160"/>
+            </w:tcMar>
+          </w:tcPr>
+          <w:p>
+            <w:pPr>
+              <w:spacing w:after="0" w:before="0"/>
+            </w:pPr>
+            <w:r>
+              <w:rPr>
+                <w:rFonts w:ascii="Arial" w:cs="Arial" w:eastAsia="Arial" w:hAnsi="Arial"/>
+                <w:color w:val="1A1A1A"/>
+                <w:sz w:val="21"/>
+                <w:szCs w:val="21"/>
+              </w:rPr>
+              <w:t xml:space="preserve">管理层、研究人员、业务人员每天面对大量需要阅读的材料——行业报告、会议纪要、政策文件、新闻资讯、合同条款。时间有限，无法逐一精读，但又不敢遗漏重要信息。</w:t>
+            </w:r>
+          </w:p>
+        </w:tc>
+      </w:tr>
+      <w:tr>
+        <w:tc>
+          <w:tcPr>
+            <w:tcW w:type="dxa" w:w="1400"/>
+            <w:tcBorders>
+              <w:top w:val="single" w:color="E8E8E8" w:sz="1"/>
+              <w:left w:val="single" w:color="CCCCCC" w:sz="1"/>
+              <w:bottom w:val="single" w:color="E8E8E8" w:sz="1"/>
+              <w:right w:val="single" w:color="D0D0D0" w:sz="1"/>
+            </w:tcBorders>
+            <w:shd w:fill="F5F5F5" w:val="clear"/>
+            <w:tcMar>
+              <w:top w:type="dxa" w:w="100"/>
+              <w:left w:type="dxa" w:w="140"/>
+              <w:bottom w:type="dxa" w:w="100"/>
+              <w:right w:type="dxa" w:w="140"/>
+            </w:tcMar>
+            <w:vAlign w:val="top"/>
+          </w:tcPr>
+          <w:p>
+            <w:r>
+              <w:rPr>
+                <w:rFonts w:ascii="Arial" w:cs="Arial" w:eastAsia="Arial" w:hAnsi="Arial"/>
+                <w:b/>
+                <w:bCs/>
+                <w:color w:val="2E86C1"/>
+                <w:sz w:val="20"/>
+                <w:szCs w:val="20"/>
+              </w:rPr>
+              <w:t xml:space="preserve">用户痛点</w:t>
+            </w:r>
+          </w:p>
+        </w:tc>
+        <w:tc>
+          <w:tcPr>
+            <w:tcW w:type="dxa" w:w="7960"/>
+            <w:tcBorders>
+              <w:top w:val="single" w:color="E8E8E8" w:sz="1"/>
+              <w:left w:val="single" w:color="D0D0D0" w:sz="1"/>
+              <w:bottom w:val="single" w:color="E8E8E8" w:sz="1"/>
+              <w:right w:val="single" w:color="CCCCCC" w:sz="1"/>
+            </w:tcBorders>
+            <w:tcMar>
+              <w:top w:type="dxa" w:w="100"/>
+              <w:left w:type="dxa" w:w="160"/>
+              <w:bottom w:type="dxa" w:w="100"/>
+              <w:right w:type="dxa" w:w="160"/>
+            </w:tcMar>
+          </w:tcPr>
+          <w:p>
+            <w:pPr>
+              <w:pStyle w:val="ListParagraph"/>
+              <w:numPr>
+                <w:ilvl w:val="0"/>
+                <w:numId w:val="2"/>
+              </w:numPr>
+              <w:spacing w:after="30" w:before="30"/>
+            </w:pPr>
+            <w:r>
+              <w:rPr>
+                <w:rFonts w:ascii="Arial" w:cs="Arial" w:eastAsia="Arial" w:hAnsi="Arial"/>
+                <w:color w:val="1A1A1A"/>
+                <w:sz w:val="21"/>
+                <w:szCs w:val="21"/>
+              </w:rPr>
+              <w:t xml:space="preserve">阅读量大，时间不够，重要内容容易错过</w:t>
+            </w:r>
+          </w:p>
+          <w:p>
+            <w:pPr>
+              <w:pStyle w:val="ListParagraph"/>
+              <w:numPr>
+                <w:ilvl w:val="0"/>
+                <w:numId w:val="2"/>
+              </w:numPr>
+              <w:spacing w:after="30" w:before="30"/>
+            </w:pPr>
+            <w:r>
+              <w:rPr>
+                <w:rFonts w:ascii="Arial" w:cs="Arial" w:eastAsia="Arial" w:hAnsi="Arial"/>
+                <w:color w:val="1A1A1A"/>
+                <w:sz w:val="21"/>
+                <w:szCs w:val="21"/>
+              </w:rPr>
+              <w:t xml:space="preserve">手工摘要耗时，不同人摘的侧重点不一样，格式混乱</w:t>
+            </w:r>
+          </w:p>
+          <w:p>
+            <w:pPr>
+              <w:pStyle w:val="ListParagraph"/>
+              <w:numPr>
+                <w:ilvl w:val="0"/>
+                <w:numId w:val="2"/>
+              </w:numPr>
+              <w:spacing w:after="30" w:before="30"/>
+            </w:pPr>
+            <w:r>
+              <w:rPr>
+                <w:rFonts w:ascii="Arial" w:cs="Arial" w:eastAsia="Arial" w:hAnsi="Arial"/>
+                <w:color w:val="1A1A1A"/>
+                <w:sz w:val="21"/>
+                <w:szCs w:val="21"/>
+              </w:rPr>
+              <w:t xml:space="preserve">跨部门共享信息时，没有统一的摘要格式</w:t>
+            </w:r>
+          </w:p>
+          <w:p>
+            <w:pPr>
+              <w:pStyle w:val="ListParagraph"/>
+              <w:numPr>
+                <w:ilvl w:val="0"/>
+                <w:numId w:val="2"/>
+              </w:numPr>
+              <w:spacing w:after="30" w:before="30"/>
+            </w:pPr>
+            <w:r>
+              <w:rPr>
+                <w:rFonts w:ascii="Arial" w:cs="Arial" w:eastAsia="Arial" w:hAnsi="Arial"/>
+                <w:color w:val="1A1A1A"/>
+                <w:sz w:val="21"/>
+                <w:szCs w:val="21"/>
+              </w:rPr>
+              <w:t xml:space="preserve">大量历史文件需要回顾时，人工整理成本极高</w:t>
+            </w:r>
+          </w:p>
+        </w:tc>
+      </w:tr>
+      <w:tr>
+        <w:tc>
+          <w:tcPr>
+            <w:tcW w:type="dxa" w:w="1400"/>
+            <w:tcBorders>
+              <w:top w:val="single" w:color="E8E8E8" w:sz="1"/>
+              <w:left w:val="single" w:color="CCCCCC" w:sz="1"/>
+              <w:bottom w:val="single" w:color="E8E8E8" w:sz="1"/>
+              <w:right w:val="single" w:color="D0D0D0" w:sz="1"/>
+            </w:tcBorders>
+            <w:shd w:fill="F5F5F5" w:val="clear"/>
+            <w:tcMar>
+              <w:top w:type="dxa" w:w="100"/>
+              <w:left w:type="dxa" w:w="140"/>
+              <w:bottom w:type="dxa" w:w="100"/>
+              <w:right w:type="dxa" w:w="140"/>
+            </w:tcMar>
+            <w:vAlign w:val="top"/>
+          </w:tcPr>
+          <w:p>
+            <w:r>
+              <w:rPr>
+                <w:rFonts w:ascii="Arial" w:cs="Arial" w:eastAsia="Arial" w:hAnsi="Arial"/>
+                <w:b/>
+                <w:bCs/>
+                <w:color w:val="2E86C1"/>
+                <w:sz w:val="20"/>
+                <w:szCs w:val="20"/>
+              </w:rPr>
+              <w:t xml:space="preserve">我们的解决方案</w:t>
+            </w:r>
+          </w:p>
+        </w:tc>
+        <w:tc>
+          <w:tcPr>
+            <w:tcW w:type="dxa" w:w="7960"/>
+            <w:tcBorders>
+              <w:top w:val="single" w:color="E8E8E8" w:sz="1"/>
+              <w:left w:val="single" w:color="D0D0D0" w:sz="1"/>
+              <w:bottom w:val="single" w:color="E8E8E8" w:sz="1"/>
+              <w:right w:val="single" w:color="CCCCCC" w:sz="1"/>
+            </w:tcBorders>
+            <w:tcMar>
+              <w:top w:type="dxa" w:w="100"/>
+              <w:left w:type="dxa" w:w="160"/>
+              <w:bottom w:type="dxa" w:w="100"/>
+              <w:right w:type="dxa" w:w="160"/>
+            </w:tcMar>
+          </w:tcPr>
+          <w:p>
+            <w:pPr>
+              <w:spacing w:after="0" w:before="0"/>
+            </w:pPr>
+            <w:r>
+              <w:rPr>
+                <w:rFonts w:ascii="Arial" w:cs="Arial" w:eastAsia="Arial" w:hAnsi="Arial"/>
+                <w:color w:val="1A1A1A"/>
+                <w:sz w:val="21"/>
+                <w:szCs w:val="21"/>
+              </w:rPr>
+              <w:t xml:space="preserve">上传任意长文档（PDF / Word / 网页链接），系统自动生成多层次摘要：一句话结论、核心要点列表、详细段落摘要，并可按用户指定的关注维度（风险点、关键数字、结论、行动项）定向提炼，支持批量处理多份文件。</w:t>
+            </w:r>
+          </w:p>
+        </w:tc>
+      </w:tr>
+      <w:tr>
+        <w:tc>
+          <w:tcPr>
+            <w:tcW w:type="dxa" w:w="1400"/>
+            <w:tcBorders>
+              <w:top w:val="single" w:color="E8E8E8" w:sz="1"/>
+              <w:left w:val="single" w:color="CCCCCC" w:sz="1"/>
+              <w:bottom w:val="single" w:color="E8E8E8" w:sz="1"/>
+              <w:right w:val="single" w:color="D0D0D0" w:sz="1"/>
+            </w:tcBorders>
+            <w:shd w:fill="F5F5F5" w:val="clear"/>
+            <w:tcMar>
+              <w:top w:type="dxa" w:w="100"/>
+              <w:left w:type="dxa" w:w="140"/>
+              <w:bottom w:type="dxa" w:w="100"/>
+              <w:right w:type="dxa" w:w="140"/>
+            </w:tcMar>
+            <w:vAlign w:val="top"/>
+          </w:tcPr>
+          <w:p>
+            <w:r>
+              <w:rPr>
+                <w:rFonts w:ascii="Arial" w:cs="Arial" w:eastAsia="Arial" w:hAnsi="Arial"/>
+                <w:b/>
+                <w:bCs/>
+                <w:color w:val="2E86C1"/>
+                <w:sz w:val="20"/>
+                <w:szCs w:val="20"/>
+              </w:rPr>
+              <w:t xml:space="preserve">适合的甲方</w:t>
+            </w:r>
+          </w:p>
+        </w:tc>
+        <w:tc>
+          <w:tcPr>
+            <w:tcW w:type="dxa" w:w="7960"/>
+            <w:tcBorders>
+              <w:top w:val="single" w:color="E8E8E8" w:sz="1"/>
+              <w:left w:val="single" w:color="D0D0D0" w:sz="1"/>
+              <w:bottom w:val="single" w:color="E8E8E8" w:sz="1"/>
+              <w:right w:val="single" w:color="CCCCCC" w:sz="1"/>
+            </w:tcBorders>
+            <w:tcMar>
+              <w:top w:type="dxa" w:w="100"/>
+              <w:left w:type="dxa" w:w="160"/>
+              <w:bottom w:type="dxa" w:w="100"/>
+              <w:right w:type="dxa" w:w="160"/>
+            </w:tcMar>
+          </w:tcPr>
+          <w:p>
+            <w:pPr>
+              <w:spacing w:after="0" w:before="0"/>
+            </w:pPr>
+            <w:r>
+              <w:rPr>
+                <w:rFonts w:ascii="Arial" w:cs="Arial" w:eastAsia="Arial" w:hAnsi="Arial"/>
+                <w:color w:val="1A1A1A"/>
+                <w:sz w:val="21"/>
+                <w:szCs w:val="21"/>
+              </w:rPr>
+              <w:t xml:space="preserve">管理层 / 研究机构 / 法务合规 / 投资机构 / 政府部门 / 任何信息密集型工作场景</w:t>
+            </w:r>
+          </w:p>
+        </w:tc>
+      </w:tr>
+      <w:tr>
+        <w:tc>
+          <w:tcPr>
+            <w:tcW w:type="dxa" w:w="1400"/>
+            <w:tcBorders>
+              <w:top w:val="single" w:color="E8E8E8" w:sz="1"/>
+              <w:left w:val="single" w:color="CCCCCC" w:sz="1"/>
+              <w:bottom w:val="single" w:color="E8E8E8" w:sz="1"/>
+              <w:right w:val="single" w:color="D0D0D0" w:sz="1"/>
+            </w:tcBorders>
+            <w:shd w:fill="F5F5F5" w:val="clear"/>
+            <w:tcMar>
+              <w:top w:type="dxa" w:w="100"/>
+              <w:left w:type="dxa" w:w="140"/>
+              <w:bottom w:type="dxa" w:w="100"/>
+              <w:right w:type="dxa" w:w="140"/>
+            </w:tcMar>
+            <w:vAlign w:val="top"/>
+          </w:tcPr>
+          <w:p>
+            <w:r>
+              <w:rPr>
+                <w:rFonts w:ascii="Arial" w:cs="Arial" w:eastAsia="Arial" w:hAnsi="Arial"/>
+                <w:b/>
+                <w:bCs/>
+                <w:color w:val="2E86C1"/>
+                <w:sz w:val="20"/>
+                <w:szCs w:val="20"/>
+              </w:rPr>
+              <w:t xml:space="preserve">核心价值</w:t>
+            </w:r>
+          </w:p>
+        </w:tc>
+        <w:tc>
+          <w:tcPr>
+            <w:tcW w:type="dxa" w:w="7960"/>
+            <w:tcBorders>
+              <w:top w:val="single" w:color="E8E8E8" w:sz="1"/>
+              <w:left w:val="single" w:color="D0D0D0" w:sz="1"/>
+              <w:bottom w:val="single" w:color="E8E8E8" w:sz="1"/>
+              <w:right w:val="single" w:color="CCCCCC" w:sz="1"/>
+            </w:tcBorders>
+            <w:tcMar>
+              <w:top w:type="dxa" w:w="100"/>
+              <w:left w:type="dxa" w:w="160"/>
+              <w:bottom w:type="dxa" w:w="100"/>
+              <w:right w:type="dxa" w:w="160"/>
+            </w:tcMar>
+          </w:tcPr>
+          <w:p>
+            <w:pPr>
+              <w:spacing w:after="0" w:before="0"/>
+            </w:pPr>
+            <w:r>
+              <w:rPr>
+                <w:rFonts w:ascii="Arial" w:cs="Arial" w:eastAsia="Arial" w:hAnsi="Arial"/>
+                <w:color w:val="1A1A1A"/>
+                <w:sz w:val="21"/>
+                <w:szCs w:val="21"/>
+              </w:rPr>
+              <w:t xml:space="preserve">将阅读 100 页报告的时间压缩到 5 分钟；摘要格式统一可沉淀；批量处理历史文档，快速建立信息档案；减少因信息遗漏导致的决策风险。</w:t>
+            </w:r>
+          </w:p>
+        </w:tc>
+      </w:tr>
+    </w:tbl>
+    <w:p>
+      <w:pPr>
+        <w:spacing w:after="240" w:before="0"/>
+      </w:pPr>
+    </w:p>
     <w:p>
       <w:pPr>
         <w:spacing w:after="240" w:before="0"/>

</xml_diff>

<commit_message>
docs: update capability overview table to include 08-13
- Changed "七个方向" to "十三个方向"
- Added overview rows for capabilities 08-13:
  招聘简历智能筛选, 自然语言Excel分析, 竞品/行业快速分析,
  客户画像自动生成, AI培训题库生成, AI文本摘要与总结

Co-Authored-By: Claude Sonnet 4.6 <noreply@anthropic.com>
</commit_message>
<xml_diff>
--- a/docs/AI能力与解决方案.docx
+++ b/docs/AI能力与解决方案.docx
@@ -142,7 +142,7 @@
           <w:sz w:val="22"/>
           <w:szCs w:val="22"/>
         </w:rPr>
-        <w:t xml:space="preserve">我们专注于 AI 落地交付，围绕以下七个方向提供从场景分析到系统上线的完整服务。所有能力均来自真实项目积累，不是概念演示。</w:t>
+        <w:t xml:space="preserve">我们专注于 AI 落地交付，围绕以下十三个方向提供从场景分析到系统上线的完整服务。所有能力均来自真实项目积累，不是概念演示。</w:t>
       </w:r>
     </w:p>
     <w:p>
@@ -1215,6 +1215,786 @@
                 <w:szCs w:val="20"/>
               </w:rPr>
               <w:t xml:space="preserve">★★★★★</w:t>
+            </w:r>
+          </w:p>
+        </w:tc>
+      </w:tr>
+      <w:tr>
+        <w:tc>
+          <w:tcPr>
+            <w:tcW w:type="dxa" w:w="2600"/>
+            <w:tcBorders>
+              <w:top w:val="single" w:color="CCCCCC" w:sz="1"/>
+              <w:left w:val="single" w:color="CCCCCC" w:sz="1"/>
+              <w:bottom w:val="single" w:color="CCCCCC" w:sz="1"/>
+              <w:right w:val="single" w:color="CCCCCC" w:sz="1"/>
+            </w:tcBorders>
+            <w:shd w:fill="FFFFFF" w:val="clear"/>
+            <w:tcMar>
+              <w:top w:type="dxa" w:w="80"/>
+              <w:left w:type="dxa" w:w="120"/>
+              <w:bottom w:type="dxa" w:w="80"/>
+              <w:right w:type="dxa" w:w="120"/>
+            </w:tcMar>
+          </w:tcPr>
+          <w:p>
+            <w:pPr>
+              <w:jc w:val="left"/>
+            </w:pPr>
+            <w:r>
+              <w:rPr>
+                <w:rFonts w:ascii="Arial" w:cs="Arial" w:eastAsia="Arial" w:hAnsi="Arial"/>
+                <w:color w:val="1A1A1A"/>
+                <w:sz w:val="20"/>
+                <w:szCs w:val="20"/>
+              </w:rPr>
+              <w:t xml:space="preserve">招聘简历智能筛选</w:t>
+            </w:r>
+          </w:p>
+        </w:tc>
+        <w:tc>
+          <w:tcPr>
+            <w:tcW w:type="dxa" w:w="3200"/>
+            <w:tcBorders>
+              <w:top w:val="single" w:color="CCCCCC" w:sz="1"/>
+              <w:left w:val="single" w:color="CCCCCC" w:sz="1"/>
+              <w:bottom w:val="single" w:color="CCCCCC" w:sz="1"/>
+              <w:right w:val="single" w:color="CCCCCC" w:sz="1"/>
+            </w:tcBorders>
+            <w:shd w:fill="FFFFFF" w:val="clear"/>
+            <w:tcMar>
+              <w:top w:type="dxa" w:w="80"/>
+              <w:left w:type="dxa" w:w="120"/>
+              <w:bottom w:type="dxa" w:w="80"/>
+              <w:right w:type="dxa" w:w="120"/>
+            </w:tcMar>
+          </w:tcPr>
+          <w:p>
+            <w:pPr>
+              <w:jc w:val="left"/>
+            </w:pPr>
+            <w:r>
+              <w:rPr>
+                <w:rFonts w:ascii="Arial" w:cs="Arial" w:eastAsia="Arial" w:hAnsi="Arial"/>
+                <w:color w:val="1A1A1A"/>
+                <w:sz w:val="20"/>
+                <w:szCs w:val="20"/>
+              </w:rPr>
+              <w:t xml:space="preserve">替代人工初筛，快速锁定最佳候选人</w:t>
+            </w:r>
+          </w:p>
+        </w:tc>
+        <w:tc>
+          <w:tcPr>
+            <w:tcW w:type="dxa" w:w="1780"/>
+            <w:tcBorders>
+              <w:top w:val="single" w:color="CCCCCC" w:sz="1"/>
+              <w:left w:val="single" w:color="CCCCCC" w:sz="1"/>
+              <w:bottom w:val="single" w:color="CCCCCC" w:sz="1"/>
+              <w:right w:val="single" w:color="CCCCCC" w:sz="1"/>
+            </w:tcBorders>
+            <w:shd w:fill="FFFFFF" w:val="clear"/>
+            <w:tcMar>
+              <w:top w:type="dxa" w:w="80"/>
+              <w:left w:type="dxa" w:w="120"/>
+              <w:bottom w:type="dxa" w:w="80"/>
+              <w:right w:type="dxa" w:w="120"/>
+            </w:tcMar>
+          </w:tcPr>
+          <w:p>
+            <w:pPr>
+              <w:jc w:val="center"/>
+            </w:pPr>
+            <w:r>
+              <w:rPr>
+                <w:rFonts w:ascii="Arial" w:cs="Arial" w:eastAsia="Arial" w:hAnsi="Arial"/>
+                <w:color w:val="1A1A1A"/>
+                <w:sz w:val="20"/>
+                <w:szCs w:val="20"/>
+              </w:rPr>
+              <w:t xml:space="preserve">可交付</w:t>
+            </w:r>
+          </w:p>
+        </w:tc>
+        <w:tc>
+          <w:tcPr>
+            <w:tcW w:type="dxa" w:w="1780"/>
+            <w:tcBorders>
+              <w:top w:val="single" w:color="CCCCCC" w:sz="1"/>
+              <w:left w:val="single" w:color="CCCCCC" w:sz="1"/>
+              <w:bottom w:val="single" w:color="CCCCCC" w:sz="1"/>
+              <w:right w:val="single" w:color="CCCCCC" w:sz="1"/>
+            </w:tcBorders>
+            <w:shd w:fill="FFFFFF" w:val="clear"/>
+            <w:tcMar>
+              <w:top w:type="dxa" w:w="80"/>
+              <w:left w:type="dxa" w:w="120"/>
+              <w:bottom w:type="dxa" w:w="80"/>
+              <w:right w:type="dxa" w:w="120"/>
+            </w:tcMar>
+          </w:tcPr>
+          <w:p>
+            <w:pPr>
+              <w:jc w:val="center"/>
+            </w:pPr>
+            <w:r>
+              <w:rPr>
+                <w:rFonts w:ascii="Arial" w:cs="Arial" w:eastAsia="Arial" w:hAnsi="Arial"/>
+                <w:color w:val="1A1A1A"/>
+                <w:sz w:val="20"/>
+                <w:szCs w:val="20"/>
+              </w:rPr>
+              <w:t xml:space="preserve">★★★★☆</w:t>
+            </w:r>
+          </w:p>
+        </w:tc>
+      </w:tr>
+      <w:tr>
+        <w:tc>
+          <w:tcPr>
+            <w:tcW w:type="dxa" w:w="2600"/>
+            <w:tcBorders>
+              <w:top w:val="single" w:color="CCCCCC" w:sz="1"/>
+              <w:left w:val="single" w:color="CCCCCC" w:sz="1"/>
+              <w:bottom w:val="single" w:color="CCCCCC" w:sz="1"/>
+              <w:right w:val="single" w:color="CCCCCC" w:sz="1"/>
+            </w:tcBorders>
+            <w:shd w:fill="FFFFFF" w:val="clear"/>
+            <w:tcMar>
+              <w:top w:type="dxa" w:w="80"/>
+              <w:left w:type="dxa" w:w="120"/>
+              <w:bottom w:type="dxa" w:w="80"/>
+              <w:right w:type="dxa" w:w="120"/>
+            </w:tcMar>
+          </w:tcPr>
+          <w:p>
+            <w:pPr>
+              <w:jc w:val="left"/>
+            </w:pPr>
+            <w:r>
+              <w:rPr>
+                <w:rFonts w:ascii="Arial" w:cs="Arial" w:eastAsia="Arial" w:hAnsi="Arial"/>
+                <w:color w:val="1A1A1A"/>
+                <w:sz w:val="20"/>
+                <w:szCs w:val="20"/>
+              </w:rPr>
+              <w:t xml:space="preserve">自然语言 Excel 分析</w:t>
+            </w:r>
+          </w:p>
+        </w:tc>
+        <w:tc>
+          <w:tcPr>
+            <w:tcW w:type="dxa" w:w="3200"/>
+            <w:tcBorders>
+              <w:top w:val="single" w:color="CCCCCC" w:sz="1"/>
+              <w:left w:val="single" w:color="CCCCCC" w:sz="1"/>
+              <w:bottom w:val="single" w:color="CCCCCC" w:sz="1"/>
+              <w:right w:val="single" w:color="CCCCCC" w:sz="1"/>
+            </w:tcBorders>
+            <w:shd w:fill="FFFFFF" w:val="clear"/>
+            <w:tcMar>
+              <w:top w:type="dxa" w:w="80"/>
+              <w:left w:type="dxa" w:w="120"/>
+              <w:bottom w:type="dxa" w:w="80"/>
+              <w:right w:type="dxa" w:w="120"/>
+            </w:tcMar>
+          </w:tcPr>
+          <w:p>
+            <w:pPr>
+              <w:jc w:val="left"/>
+            </w:pPr>
+            <w:r>
+              <w:rPr>
+                <w:rFonts w:ascii="Arial" w:cs="Arial" w:eastAsia="Arial" w:hAnsi="Arial"/>
+                <w:color w:val="1A1A1A"/>
+                <w:sz w:val="20"/>
+                <w:szCs w:val="20"/>
+              </w:rPr>
+              <w:t xml:space="preserve">不会数据分析也能问出结论</w:t>
+            </w:r>
+          </w:p>
+        </w:tc>
+        <w:tc>
+          <w:tcPr>
+            <w:tcW w:type="dxa" w:w="1780"/>
+            <w:tcBorders>
+              <w:top w:val="single" w:color="CCCCCC" w:sz="1"/>
+              <w:left w:val="single" w:color="CCCCCC" w:sz="1"/>
+              <w:bottom w:val="single" w:color="CCCCCC" w:sz="1"/>
+              <w:right w:val="single" w:color="CCCCCC" w:sz="1"/>
+            </w:tcBorders>
+            <w:shd w:fill="FFFFFF" w:val="clear"/>
+            <w:tcMar>
+              <w:top w:type="dxa" w:w="80"/>
+              <w:left w:type="dxa" w:w="120"/>
+              <w:bottom w:type="dxa" w:w="80"/>
+              <w:right w:type="dxa" w:w="120"/>
+            </w:tcMar>
+          </w:tcPr>
+          <w:p>
+            <w:pPr>
+              <w:jc w:val="center"/>
+            </w:pPr>
+            <w:r>
+              <w:rPr>
+                <w:rFonts w:ascii="Arial" w:cs="Arial" w:eastAsia="Arial" w:hAnsi="Arial"/>
+                <w:color w:val="1A1A1A"/>
+                <w:sz w:val="20"/>
+                <w:szCs w:val="20"/>
+              </w:rPr>
+              <w:t xml:space="preserve">可交付</w:t>
+            </w:r>
+          </w:p>
+        </w:tc>
+        <w:tc>
+          <w:tcPr>
+            <w:tcW w:type="dxa" w:w="1780"/>
+            <w:tcBorders>
+              <w:top w:val="single" w:color="CCCCCC" w:sz="1"/>
+              <w:left w:val="single" w:color="CCCCCC" w:sz="1"/>
+              <w:bottom w:val="single" w:color="CCCCCC" w:sz="1"/>
+              <w:right w:val="single" w:color="CCCCCC" w:sz="1"/>
+            </w:tcBorders>
+            <w:shd w:fill="FFFFFF" w:val="clear"/>
+            <w:tcMar>
+              <w:top w:type="dxa" w:w="80"/>
+              <w:left w:type="dxa" w:w="120"/>
+              <w:bottom w:type="dxa" w:w="80"/>
+              <w:right w:type="dxa" w:w="120"/>
+            </w:tcMar>
+          </w:tcPr>
+          <w:p>
+            <w:pPr>
+              <w:jc w:val="center"/>
+            </w:pPr>
+            <w:r>
+              <w:rPr>
+                <w:rFonts w:ascii="Arial" w:cs="Arial" w:eastAsia="Arial" w:hAnsi="Arial"/>
+                <w:color w:val="1A1A1A"/>
+                <w:sz w:val="20"/>
+                <w:szCs w:val="20"/>
+              </w:rPr>
+              <w:t xml:space="preserve">★★★★☆</w:t>
+            </w:r>
+          </w:p>
+        </w:tc>
+      </w:tr>
+      <w:tr>
+        <w:tc>
+          <w:tcPr>
+            <w:tcW w:type="dxa" w:w="2600"/>
+            <w:tcBorders>
+              <w:top w:val="single" w:color="CCCCCC" w:sz="1"/>
+              <w:left w:val="single" w:color="CCCCCC" w:sz="1"/>
+              <w:bottom w:val="single" w:color="CCCCCC" w:sz="1"/>
+              <w:right w:val="single" w:color="CCCCCC" w:sz="1"/>
+            </w:tcBorders>
+            <w:shd w:fill="FFFFFF" w:val="clear"/>
+            <w:tcMar>
+              <w:top w:type="dxa" w:w="80"/>
+              <w:left w:type="dxa" w:w="120"/>
+              <w:bottom w:type="dxa" w:w="80"/>
+              <w:right w:type="dxa" w:w="120"/>
+            </w:tcMar>
+          </w:tcPr>
+          <w:p>
+            <w:pPr>
+              <w:jc w:val="left"/>
+            </w:pPr>
+            <w:r>
+              <w:rPr>
+                <w:rFonts w:ascii="Arial" w:cs="Arial" w:eastAsia="Arial" w:hAnsi="Arial"/>
+                <w:color w:val="1A1A1A"/>
+                <w:sz w:val="20"/>
+                <w:szCs w:val="20"/>
+              </w:rPr>
+              <w:t xml:space="preserve">竞品 / 行业快速分析</w:t>
+            </w:r>
+          </w:p>
+        </w:tc>
+        <w:tc>
+          <w:tcPr>
+            <w:tcW w:type="dxa" w:w="3200"/>
+            <w:tcBorders>
+              <w:top w:val="single" w:color="CCCCCC" w:sz="1"/>
+              <w:left w:val="single" w:color="CCCCCC" w:sz="1"/>
+              <w:bottom w:val="single" w:color="CCCCCC" w:sz="1"/>
+              <w:right w:val="single" w:color="CCCCCC" w:sz="1"/>
+            </w:tcBorders>
+            <w:shd w:fill="FFFFFF" w:val="clear"/>
+            <w:tcMar>
+              <w:top w:type="dxa" w:w="80"/>
+              <w:left w:type="dxa" w:w="120"/>
+              <w:bottom w:type="dxa" w:w="80"/>
+              <w:right w:type="dxa" w:w="120"/>
+            </w:tcMar>
+          </w:tcPr>
+          <w:p>
+            <w:pPr>
+              <w:jc w:val="left"/>
+            </w:pPr>
+            <w:r>
+              <w:rPr>
+                <w:rFonts w:ascii="Arial" w:cs="Arial" w:eastAsia="Arial" w:hAnsi="Arial"/>
+                <w:color w:val="1A1A1A"/>
+                <w:sz w:val="20"/>
+                <w:szCs w:val="20"/>
+              </w:rPr>
+              <w:t xml:space="preserve">输入资料，分钟级输出结构化竞品报告</w:t>
+            </w:r>
+          </w:p>
+        </w:tc>
+        <w:tc>
+          <w:tcPr>
+            <w:tcW w:type="dxa" w:w="1780"/>
+            <w:tcBorders>
+              <w:top w:val="single" w:color="CCCCCC" w:sz="1"/>
+              <w:left w:val="single" w:color="CCCCCC" w:sz="1"/>
+              <w:bottom w:val="single" w:color="CCCCCC" w:sz="1"/>
+              <w:right w:val="single" w:color="CCCCCC" w:sz="1"/>
+            </w:tcBorders>
+            <w:shd w:fill="FFFFFF" w:val="clear"/>
+            <w:tcMar>
+              <w:top w:type="dxa" w:w="80"/>
+              <w:left w:type="dxa" w:w="120"/>
+              <w:bottom w:type="dxa" w:w="80"/>
+              <w:right w:type="dxa" w:w="120"/>
+            </w:tcMar>
+          </w:tcPr>
+          <w:p>
+            <w:pPr>
+              <w:jc w:val="center"/>
+            </w:pPr>
+            <w:r>
+              <w:rPr>
+                <w:rFonts w:ascii="Arial" w:cs="Arial" w:eastAsia="Arial" w:hAnsi="Arial"/>
+                <w:color w:val="1A1A1A"/>
+                <w:sz w:val="20"/>
+                <w:szCs w:val="20"/>
+              </w:rPr>
+              <w:t xml:space="preserve">可交付</w:t>
+            </w:r>
+          </w:p>
+        </w:tc>
+        <w:tc>
+          <w:tcPr>
+            <w:tcW w:type="dxa" w:w="1780"/>
+            <w:tcBorders>
+              <w:top w:val="single" w:color="CCCCCC" w:sz="1"/>
+              <w:left w:val="single" w:color="CCCCCC" w:sz="1"/>
+              <w:bottom w:val="single" w:color="CCCCCC" w:sz="1"/>
+              <w:right w:val="single" w:color="CCCCCC" w:sz="1"/>
+            </w:tcBorders>
+            <w:shd w:fill="FFFFFF" w:val="clear"/>
+            <w:tcMar>
+              <w:top w:type="dxa" w:w="80"/>
+              <w:left w:type="dxa" w:w="120"/>
+              <w:bottom w:type="dxa" w:w="80"/>
+              <w:right w:type="dxa" w:w="120"/>
+            </w:tcMar>
+          </w:tcPr>
+          <w:p>
+            <w:pPr>
+              <w:jc w:val="center"/>
+            </w:pPr>
+            <w:r>
+              <w:rPr>
+                <w:rFonts w:ascii="Arial" w:cs="Arial" w:eastAsia="Arial" w:hAnsi="Arial"/>
+                <w:color w:val="1A1A1A"/>
+                <w:sz w:val="20"/>
+                <w:szCs w:val="20"/>
+              </w:rPr>
+              <w:t xml:space="preserve">★★★★☆</w:t>
+            </w:r>
+          </w:p>
+        </w:tc>
+      </w:tr>
+      <w:tr>
+        <w:tc>
+          <w:tcPr>
+            <w:tcW w:type="dxa" w:w="2600"/>
+            <w:tcBorders>
+              <w:top w:val="single" w:color="CCCCCC" w:sz="1"/>
+              <w:left w:val="single" w:color="CCCCCC" w:sz="1"/>
+              <w:bottom w:val="single" w:color="CCCCCC" w:sz="1"/>
+              <w:right w:val="single" w:color="CCCCCC" w:sz="1"/>
+            </w:tcBorders>
+            <w:shd w:fill="FFFFFF" w:val="clear"/>
+            <w:tcMar>
+              <w:top w:type="dxa" w:w="80"/>
+              <w:left w:type="dxa" w:w="120"/>
+              <w:bottom w:type="dxa" w:w="80"/>
+              <w:right w:type="dxa" w:w="120"/>
+            </w:tcMar>
+          </w:tcPr>
+          <w:p>
+            <w:pPr>
+              <w:jc w:val="left"/>
+            </w:pPr>
+            <w:r>
+              <w:rPr>
+                <w:rFonts w:ascii="Arial" w:cs="Arial" w:eastAsia="Arial" w:hAnsi="Arial"/>
+                <w:color w:val="1A1A1A"/>
+                <w:sz w:val="20"/>
+                <w:szCs w:val="20"/>
+              </w:rPr>
+              <w:t xml:space="preserve">客户画像自动生成</w:t>
+            </w:r>
+          </w:p>
+        </w:tc>
+        <w:tc>
+          <w:tcPr>
+            <w:tcW w:type="dxa" w:w="3200"/>
+            <w:tcBorders>
+              <w:top w:val="single" w:color="CCCCCC" w:sz="1"/>
+              <w:left w:val="single" w:color="CCCCCC" w:sz="1"/>
+              <w:bottom w:val="single" w:color="CCCCCC" w:sz="1"/>
+              <w:right w:val="single" w:color="CCCCCC" w:sz="1"/>
+            </w:tcBorders>
+            <w:shd w:fill="FFFFFF" w:val="clear"/>
+            <w:tcMar>
+              <w:top w:type="dxa" w:w="80"/>
+              <w:left w:type="dxa" w:w="120"/>
+              <w:bottom w:type="dxa" w:w="80"/>
+              <w:right w:type="dxa" w:w="120"/>
+            </w:tcMar>
+          </w:tcPr>
+          <w:p>
+            <w:pPr>
+              <w:jc w:val="left"/>
+            </w:pPr>
+            <w:r>
+              <w:rPr>
+                <w:rFonts w:ascii="Arial" w:cs="Arial" w:eastAsia="Arial" w:hAnsi="Arial"/>
+                <w:color w:val="1A1A1A"/>
+                <w:sz w:val="20"/>
+                <w:szCs w:val="20"/>
+              </w:rPr>
+              <w:t xml:space="preserve">从对话和行为数据中自动提炼客户洞察</w:t>
+            </w:r>
+          </w:p>
+        </w:tc>
+        <w:tc>
+          <w:tcPr>
+            <w:tcW w:type="dxa" w:w="1780"/>
+            <w:tcBorders>
+              <w:top w:val="single" w:color="CCCCCC" w:sz="1"/>
+              <w:left w:val="single" w:color="CCCCCC" w:sz="1"/>
+              <w:bottom w:val="single" w:color="CCCCCC" w:sz="1"/>
+              <w:right w:val="single" w:color="CCCCCC" w:sz="1"/>
+            </w:tcBorders>
+            <w:shd w:fill="FFFFFF" w:val="clear"/>
+            <w:tcMar>
+              <w:top w:type="dxa" w:w="80"/>
+              <w:left w:type="dxa" w:w="120"/>
+              <w:bottom w:type="dxa" w:w="80"/>
+              <w:right w:type="dxa" w:w="120"/>
+            </w:tcMar>
+          </w:tcPr>
+          <w:p>
+            <w:pPr>
+              <w:jc w:val="center"/>
+            </w:pPr>
+            <w:r>
+              <w:rPr>
+                <w:rFonts w:ascii="Arial" w:cs="Arial" w:eastAsia="Arial" w:hAnsi="Arial"/>
+                <w:color w:val="1A1A1A"/>
+                <w:sz w:val="20"/>
+                <w:szCs w:val="20"/>
+              </w:rPr>
+              <w:t xml:space="preserve">可交付</w:t>
+            </w:r>
+          </w:p>
+        </w:tc>
+        <w:tc>
+          <w:tcPr>
+            <w:tcW w:type="dxa" w:w="1780"/>
+            <w:tcBorders>
+              <w:top w:val="single" w:color="CCCCCC" w:sz="1"/>
+              <w:left w:val="single" w:color="CCCCCC" w:sz="1"/>
+              <w:bottom w:val="single" w:color="CCCCCC" w:sz="1"/>
+              <w:right w:val="single" w:color="CCCCCC" w:sz="1"/>
+            </w:tcBorders>
+            <w:shd w:fill="FFFFFF" w:val="clear"/>
+            <w:tcMar>
+              <w:top w:type="dxa" w:w="80"/>
+              <w:left w:type="dxa" w:w="120"/>
+              <w:bottom w:type="dxa" w:w="80"/>
+              <w:right w:type="dxa" w:w="120"/>
+            </w:tcMar>
+          </w:tcPr>
+          <w:p>
+            <w:pPr>
+              <w:jc w:val="center"/>
+            </w:pPr>
+            <w:r>
+              <w:rPr>
+                <w:rFonts w:ascii="Arial" w:cs="Arial" w:eastAsia="Arial" w:hAnsi="Arial"/>
+                <w:color w:val="1A1A1A"/>
+                <w:sz w:val="20"/>
+                <w:szCs w:val="20"/>
+              </w:rPr>
+              <w:t xml:space="preserve">★★★★☆</w:t>
+            </w:r>
+          </w:p>
+        </w:tc>
+      </w:tr>
+      <w:tr>
+        <w:tc>
+          <w:tcPr>
+            <w:tcW w:type="dxa" w:w="2600"/>
+            <w:tcBorders>
+              <w:top w:val="single" w:color="CCCCCC" w:sz="1"/>
+              <w:left w:val="single" w:color="CCCCCC" w:sz="1"/>
+              <w:bottom w:val="single" w:color="CCCCCC" w:sz="1"/>
+              <w:right w:val="single" w:color="CCCCCC" w:sz="1"/>
+            </w:tcBorders>
+            <w:shd w:fill="FFFFFF" w:val="clear"/>
+            <w:tcMar>
+              <w:top w:type="dxa" w:w="80"/>
+              <w:left w:type="dxa" w:w="120"/>
+              <w:bottom w:type="dxa" w:w="80"/>
+              <w:right w:type="dxa" w:w="120"/>
+            </w:tcMar>
+          </w:tcPr>
+          <w:p>
+            <w:pPr>
+              <w:jc w:val="left"/>
+            </w:pPr>
+            <w:r>
+              <w:rPr>
+                <w:rFonts w:ascii="Arial" w:cs="Arial" w:eastAsia="Arial" w:hAnsi="Arial"/>
+                <w:color w:val="1A1A1A"/>
+                <w:sz w:val="20"/>
+                <w:szCs w:val="20"/>
+              </w:rPr>
+              <w:t xml:space="preserve">AI 培训题库生成</w:t>
+            </w:r>
+          </w:p>
+        </w:tc>
+        <w:tc>
+          <w:tcPr>
+            <w:tcW w:type="dxa" w:w="3200"/>
+            <w:tcBorders>
+              <w:top w:val="single" w:color="CCCCCC" w:sz="1"/>
+              <w:left w:val="single" w:color="CCCCCC" w:sz="1"/>
+              <w:bottom w:val="single" w:color="CCCCCC" w:sz="1"/>
+              <w:right w:val="single" w:color="CCCCCC" w:sz="1"/>
+            </w:tcBorders>
+            <w:shd w:fill="FFFFFF" w:val="clear"/>
+            <w:tcMar>
+              <w:top w:type="dxa" w:w="80"/>
+              <w:left w:type="dxa" w:w="120"/>
+              <w:bottom w:type="dxa" w:w="80"/>
+              <w:right w:type="dxa" w:w="120"/>
+            </w:tcMar>
+          </w:tcPr>
+          <w:p>
+            <w:pPr>
+              <w:jc w:val="left"/>
+            </w:pPr>
+            <w:r>
+              <w:rPr>
+                <w:rFonts w:ascii="Arial" w:cs="Arial" w:eastAsia="Arial" w:hAnsi="Arial"/>
+                <w:color w:val="1A1A1A"/>
+                <w:sz w:val="20"/>
+                <w:szCs w:val="20"/>
+              </w:rPr>
+              <w:t xml:space="preserve">上传材料，自动生成覆盖全面的考题和练习</w:t>
+            </w:r>
+          </w:p>
+        </w:tc>
+        <w:tc>
+          <w:tcPr>
+            <w:tcW w:type="dxa" w:w="1780"/>
+            <w:tcBorders>
+              <w:top w:val="single" w:color="CCCCCC" w:sz="1"/>
+              <w:left w:val="single" w:color="CCCCCC" w:sz="1"/>
+              <w:bottom w:val="single" w:color="CCCCCC" w:sz="1"/>
+              <w:right w:val="single" w:color="CCCCCC" w:sz="1"/>
+            </w:tcBorders>
+            <w:shd w:fill="FFFFFF" w:val="clear"/>
+            <w:tcMar>
+              <w:top w:type="dxa" w:w="80"/>
+              <w:left w:type="dxa" w:w="120"/>
+              <w:bottom w:type="dxa" w:w="80"/>
+              <w:right w:type="dxa" w:w="120"/>
+            </w:tcMar>
+          </w:tcPr>
+          <w:p>
+            <w:pPr>
+              <w:jc w:val="center"/>
+            </w:pPr>
+            <w:r>
+              <w:rPr>
+                <w:rFonts w:ascii="Arial" w:cs="Arial" w:eastAsia="Arial" w:hAnsi="Arial"/>
+                <w:color w:val="1A1A1A"/>
+                <w:sz w:val="20"/>
+                <w:szCs w:val="20"/>
+              </w:rPr>
+              <w:t xml:space="preserve">可交付</w:t>
+            </w:r>
+          </w:p>
+        </w:tc>
+        <w:tc>
+          <w:tcPr>
+            <w:tcW w:type="dxa" w:w="1780"/>
+            <w:tcBorders>
+              <w:top w:val="single" w:color="CCCCCC" w:sz="1"/>
+              <w:left w:val="single" w:color="CCCCCC" w:sz="1"/>
+              <w:bottom w:val="single" w:color="CCCCCC" w:sz="1"/>
+              <w:right w:val="single" w:color="CCCCCC" w:sz="1"/>
+            </w:tcBorders>
+            <w:shd w:fill="FFFFFF" w:val="clear"/>
+            <w:tcMar>
+              <w:top w:type="dxa" w:w="80"/>
+              <w:left w:type="dxa" w:w="120"/>
+              <w:bottom w:type="dxa" w:w="80"/>
+              <w:right w:type="dxa" w:w="120"/>
+            </w:tcMar>
+          </w:tcPr>
+          <w:p>
+            <w:pPr>
+              <w:jc w:val="center"/>
+            </w:pPr>
+            <w:r>
+              <w:rPr>
+                <w:rFonts w:ascii="Arial" w:cs="Arial" w:eastAsia="Arial" w:hAnsi="Arial"/>
+                <w:color w:val="1A1A1A"/>
+                <w:sz w:val="20"/>
+                <w:szCs w:val="20"/>
+              </w:rPr>
+              <w:t xml:space="preserve">★★★★☆</w:t>
+            </w:r>
+          </w:p>
+        </w:tc>
+      </w:tr>
+      <w:tr>
+        <w:tc>
+          <w:tcPr>
+            <w:tcW w:type="dxa" w:w="2600"/>
+            <w:tcBorders>
+              <w:top w:val="single" w:color="CCCCCC" w:sz="1"/>
+              <w:left w:val="single" w:color="CCCCCC" w:sz="1"/>
+              <w:bottom w:val="single" w:color="CCCCCC" w:sz="1"/>
+              <w:right w:val="single" w:color="CCCCCC" w:sz="1"/>
+            </w:tcBorders>
+            <w:shd w:fill="FFFFFF" w:val="clear"/>
+            <w:tcMar>
+              <w:top w:type="dxa" w:w="80"/>
+              <w:left w:type="dxa" w:w="120"/>
+              <w:bottom w:type="dxa" w:w="80"/>
+              <w:right w:type="dxa" w:w="120"/>
+            </w:tcMar>
+          </w:tcPr>
+          <w:p>
+            <w:pPr>
+              <w:jc w:val="left"/>
+            </w:pPr>
+            <w:r>
+              <w:rPr>
+                <w:rFonts w:ascii="Arial" w:cs="Arial" w:eastAsia="Arial" w:hAnsi="Arial"/>
+                <w:color w:val="1A1A1A"/>
+                <w:sz w:val="20"/>
+                <w:szCs w:val="20"/>
+              </w:rPr>
+              <w:t xml:space="preserve">AI 文本摘要与总结</w:t>
+            </w:r>
+          </w:p>
+        </w:tc>
+        <w:tc>
+          <w:tcPr>
+            <w:tcW w:type="dxa" w:w="3200"/>
+            <w:tcBorders>
+              <w:top w:val="single" w:color="CCCCCC" w:sz="1"/>
+              <w:left w:val="single" w:color="CCCCCC" w:sz="1"/>
+              <w:bottom w:val="single" w:color="CCCCCC" w:sz="1"/>
+              <w:right w:val="single" w:color="CCCCCC" w:sz="1"/>
+            </w:tcBorders>
+            <w:shd w:fill="FFFFFF" w:val="clear"/>
+            <w:tcMar>
+              <w:top w:type="dxa" w:w="80"/>
+              <w:left w:type="dxa" w:w="120"/>
+              <w:bottom w:type="dxa" w:w="80"/>
+              <w:right w:type="dxa" w:w="120"/>
+            </w:tcMar>
+          </w:tcPr>
+          <w:p>
+            <w:pPr>
+              <w:jc w:val="left"/>
+            </w:pPr>
+            <w:r>
+              <w:rPr>
+                <w:rFonts w:ascii="Arial" w:cs="Arial" w:eastAsia="Arial" w:hAnsi="Arial"/>
+                <w:color w:val="1A1A1A"/>
+                <w:sz w:val="20"/>
+                <w:szCs w:val="20"/>
+              </w:rPr>
+              <w:t xml:space="preserve">长文档秒变精华，关键信息不遗漏</w:t>
+            </w:r>
+          </w:p>
+        </w:tc>
+        <w:tc>
+          <w:tcPr>
+            <w:tcW w:type="dxa" w:w="1780"/>
+            <w:tcBorders>
+              <w:top w:val="single" w:color="CCCCCC" w:sz="1"/>
+              <w:left w:val="single" w:color="CCCCCC" w:sz="1"/>
+              <w:bottom w:val="single" w:color="CCCCCC" w:sz="1"/>
+              <w:right w:val="single" w:color="CCCCCC" w:sz="1"/>
+            </w:tcBorders>
+            <w:shd w:fill="FFFFFF" w:val="clear"/>
+            <w:tcMar>
+              <w:top w:type="dxa" w:w="80"/>
+              <w:left w:type="dxa" w:w="120"/>
+              <w:bottom w:type="dxa" w:w="80"/>
+              <w:right w:type="dxa" w:w="120"/>
+            </w:tcMar>
+          </w:tcPr>
+          <w:p>
+            <w:pPr>
+              <w:jc w:val="center"/>
+            </w:pPr>
+            <w:r>
+              <w:rPr>
+                <w:rFonts w:ascii="Arial" w:cs="Arial" w:eastAsia="Arial" w:hAnsi="Arial"/>
+                <w:color w:val="1A1A1A"/>
+                <w:sz w:val="20"/>
+                <w:szCs w:val="20"/>
+              </w:rPr>
+              <w:t xml:space="preserve">可交付</w:t>
+            </w:r>
+          </w:p>
+        </w:tc>
+        <w:tc>
+          <w:tcPr>
+            <w:tcW w:type="dxa" w:w="1780"/>
+            <w:tcBorders>
+              <w:top w:val="single" w:color="CCCCCC" w:sz="1"/>
+              <w:left w:val="single" w:color="CCCCCC" w:sz="1"/>
+              <w:bottom w:val="single" w:color="CCCCCC" w:sz="1"/>
+              <w:right w:val="single" w:color="CCCCCC" w:sz="1"/>
+            </w:tcBorders>
+            <w:shd w:fill="FFFFFF" w:val="clear"/>
+            <w:tcMar>
+              <w:top w:type="dxa" w:w="80"/>
+              <w:left w:type="dxa" w:w="120"/>
+              <w:bottom w:type="dxa" w:w="80"/>
+              <w:right w:type="dxa" w:w="120"/>
+            </w:tcMar>
+          </w:tcPr>
+          <w:p>
+            <w:pPr>
+              <w:jc w:val="center"/>
+            </w:pPr>
+            <w:r>
+              <w:rPr>
+                <w:rFonts w:ascii="Arial" w:cs="Arial" w:eastAsia="Arial" w:hAnsi="Arial"/>
+                <w:color w:val="1A1A1A"/>
+                <w:sz w:val="20"/>
+                <w:szCs w:val="20"/>
+              </w:rPr>
+              <w:t xml:space="preserve">★★★★☆</w:t>
             </w:r>
           </w:p>
         </w:tc>

</xml_diff>

<commit_message>
docs: remove 周期参考 column, 我们的立场 section, and closing line
Co-Authored-By: Claude Sonnet 4.6 <noreply@anthropic.com>
</commit_message>
<xml_diff>
--- a/docs/AI能力与解决方案.docx
+++ b/docs/AI能力与解决方案.docx
@@ -8626,8 +8626,7 @@
       </w:tblPr>
       <w:tblGrid>
         <w:gridCol w:w="1600"/>
-        <w:gridCol w:w="1100"/>
-        <w:gridCol w:w="4260"/>
+        <w:gridCol w:w="5360"/>
         <w:gridCol w:w="2400"/>
       </w:tblGrid>
       <w:tr>
@@ -8667,7 +8666,7 @@
         </w:tc>
         <w:tc>
           <w:tcPr>
-            <w:tcW w:type="dxa" w:w="1100"/>
+            <w:tcW w:type="dxa" w:w="5360"/>
             <w:tcBorders>
               <w:top w:val="single" w:color="1B4F8A" w:sz="1"/>
               <w:left w:val="single" w:color="1B4F8A" w:sz="1"/>
@@ -8695,13 +8694,13 @@
                 <w:sz w:val="20"/>
                 <w:szCs w:val="20"/>
               </w:rPr>
-              <w:t xml:space="preserve">周期参考</w:t>
-            </w:r>
-          </w:p>
-        </w:tc>
-        <w:tc>
-          <w:tcPr>
-            <w:tcW w:type="dxa" w:w="4260"/>
+              <w:t xml:space="preserve">交付内容</w:t>
+            </w:r>
+          </w:p>
+        </w:tc>
+        <w:tc>
+          <w:tcPr>
+            <w:tcW w:type="dxa" w:w="2400"/>
             <w:tcBorders>
               <w:top w:val="single" w:color="1B4F8A" w:sz="1"/>
               <w:left w:val="single" w:color="1B4F8A" w:sz="1"/>
@@ -8729,20 +8728,22 @@
                 <w:sz w:val="20"/>
                 <w:szCs w:val="20"/>
               </w:rPr>
-              <w:t xml:space="preserve">交付内容</w:t>
-            </w:r>
-          </w:p>
-        </w:tc>
-        <w:tc>
-          <w:tcPr>
-            <w:tcW w:type="dxa" w:w="2400"/>
-            <w:tcBorders>
-              <w:top w:val="single" w:color="1B4F8A" w:sz="1"/>
-              <w:left w:val="single" w:color="1B4F8A" w:sz="1"/>
-              <w:bottom w:val="single" w:color="1B4F8A" w:sz="1"/>
-              <w:right w:val="single" w:color="1B4F8A" w:sz="1"/>
-            </w:tcBorders>
-            <w:shd w:fill="1B4F8A" w:val="clear"/>
+              <w:t xml:space="preserve">适用场景</w:t>
+            </w:r>
+          </w:p>
+        </w:tc>
+      </w:tr>
+      <w:tr>
+        <w:tc>
+          <w:tcPr>
+            <w:tcW w:type="dxa" w:w="1600"/>
+            <w:tcBorders>
+              <w:top w:val="single" w:color="CCCCCC" w:sz="1"/>
+              <w:left w:val="single" w:color="CCCCCC" w:sz="1"/>
+              <w:bottom w:val="single" w:color="CCCCCC" w:sz="1"/>
+              <w:right w:val="single" w:color="CCCCCC" w:sz="1"/>
+            </w:tcBorders>
+            <w:shd w:fill="FFFFFF" w:val="clear"/>
             <w:tcMar>
               <w:top w:type="dxa" w:w="80"/>
               <w:left w:type="dxa" w:w="120"/>
@@ -8751,27 +8752,20 @@
             </w:tcMar>
           </w:tcPr>
           <w:p>
-            <w:pPr>
-              <w:jc w:val="center"/>
-            </w:pPr>
-            <w:r>
-              <w:rPr>
-                <w:rFonts w:ascii="Arial" w:cs="Arial" w:eastAsia="Arial" w:hAnsi="Arial"/>
-                <w:b/>
-                <w:bCs/>
-                <w:color w:val="FFFFFF"/>
-                <w:sz w:val="20"/>
-                <w:szCs w:val="20"/>
-              </w:rPr>
-              <w:t xml:space="preserve">适用场景</w:t>
-            </w:r>
-          </w:p>
-        </w:tc>
-      </w:tr>
-      <w:tr>
-        <w:tc>
-          <w:tcPr>
-            <w:tcW w:type="dxa" w:w="1600"/>
+            <w:r>
+              <w:rPr>
+                <w:rFonts w:ascii="Arial" w:cs="Arial" w:eastAsia="Arial" w:hAnsi="Arial"/>
+                <w:color w:val="1A1A1A"/>
+                <w:sz w:val="20"/>
+                <w:szCs w:val="20"/>
+              </w:rPr>
+              <w:t xml:space="preserve">概念验证（PoC）</w:t>
+            </w:r>
+          </w:p>
+        </w:tc>
+        <w:tc>
+          <w:tcPr>
+            <w:tcW w:type="dxa" w:w="5360"/>
             <w:tcBorders>
               <w:top w:val="single" w:color="CCCCCC" w:sz="1"/>
               <w:left w:val="single" w:color="CCCCCC" w:sz="1"/>
@@ -8794,13 +8788,13 @@
                 <w:sz w:val="20"/>
                 <w:szCs w:val="20"/>
               </w:rPr>
-              <w:t xml:space="preserve">概念验证（PoC）</w:t>
-            </w:r>
-          </w:p>
-        </w:tc>
-        <w:tc>
-          <w:tcPr>
-            <w:tcW w:type="dxa" w:w="1100"/>
+              <w:t xml:space="preserve">验证 AI 能否解决核心痛点，输出可演示 demo，风险低、见效快</w:t>
+            </w:r>
+          </w:p>
+        </w:tc>
+        <w:tc>
+          <w:tcPr>
+            <w:tcW w:type="dxa" w:w="2400"/>
             <w:tcBorders>
               <w:top w:val="single" w:color="CCCCCC" w:sz="1"/>
               <w:left w:val="single" w:color="CCCCCC" w:sz="1"/>
@@ -8823,20 +8817,22 @@
                 <w:sz w:val="20"/>
                 <w:szCs w:val="20"/>
               </w:rPr>
-              <w:t xml:space="preserve">2–4 周</w:t>
-            </w:r>
-          </w:p>
-        </w:tc>
-        <w:tc>
-          <w:tcPr>
-            <w:tcW w:type="dxa" w:w="4260"/>
+              <w:t xml:space="preserve">适合初次合作或场景不确定时</w:t>
+            </w:r>
+          </w:p>
+        </w:tc>
+      </w:tr>
+      <w:tr>
+        <w:tc>
+          <w:tcPr>
+            <w:tcW w:type="dxa" w:w="1600"/>
             <w:tcBorders>
               <w:top w:val="single" w:color="CCCCCC" w:sz="1"/>
               <w:left w:val="single" w:color="CCCCCC" w:sz="1"/>
               <w:bottom w:val="single" w:color="CCCCCC" w:sz="1"/>
               <w:right w:val="single" w:color="CCCCCC" w:sz="1"/>
             </w:tcBorders>
-            <w:shd w:fill="FFFFFF" w:val="clear"/>
+            <w:shd w:fill="F5F5F5" w:val="clear"/>
             <w:tcMar>
               <w:top w:type="dxa" w:w="80"/>
               <w:left w:type="dxa" w:w="120"/>
@@ -8852,20 +8848,20 @@
                 <w:sz w:val="20"/>
                 <w:szCs w:val="20"/>
               </w:rPr>
-              <w:t xml:space="preserve">验证 AI 能否解决核心痛点，输出可演示 demo，风险低、见效快</w:t>
-            </w:r>
-          </w:p>
-        </w:tc>
-        <w:tc>
-          <w:tcPr>
-            <w:tcW w:type="dxa" w:w="2400"/>
+              <w:t xml:space="preserve">标准交付项目</w:t>
+            </w:r>
+          </w:p>
+        </w:tc>
+        <w:tc>
+          <w:tcPr>
+            <w:tcW w:type="dxa" w:w="5360"/>
             <w:tcBorders>
               <w:top w:val="single" w:color="CCCCCC" w:sz="1"/>
               <w:left w:val="single" w:color="CCCCCC" w:sz="1"/>
               <w:bottom w:val="single" w:color="CCCCCC" w:sz="1"/>
               <w:right w:val="single" w:color="CCCCCC" w:sz="1"/>
             </w:tcBorders>
-            <w:shd w:fill="FFFFFF" w:val="clear"/>
+            <w:shd w:fill="F5F5F5" w:val="clear"/>
             <w:tcMar>
               <w:top w:type="dxa" w:w="80"/>
               <w:left w:type="dxa" w:w="120"/>
@@ -8881,15 +8877,13 @@
                 <w:sz w:val="20"/>
                 <w:szCs w:val="20"/>
               </w:rPr>
-              <w:t xml:space="preserve">适合初次合作或场景不确定时</w:t>
-            </w:r>
-          </w:p>
-        </w:tc>
-      </w:tr>
-      <w:tr>
-        <w:tc>
-          <w:tcPr>
-            <w:tcW w:type="dxa" w:w="1600"/>
+              <w:t xml:space="preserve">完整功能开发、数据对接、测试上线，交付生产可用系统</w:t>
+            </w:r>
+          </w:p>
+        </w:tc>
+        <w:tc>
+          <w:tcPr>
+            <w:tcW w:type="dxa" w:w="2400"/>
             <w:tcBorders>
               <w:top w:val="single" w:color="CCCCCC" w:sz="1"/>
               <w:left w:val="single" w:color="CCCCCC" w:sz="1"/>
@@ -8912,20 +8906,22 @@
                 <w:sz w:val="20"/>
                 <w:szCs w:val="20"/>
               </w:rPr>
-              <w:t xml:space="preserve">标准交付项目</w:t>
-            </w:r>
-          </w:p>
-        </w:tc>
-        <w:tc>
-          <w:tcPr>
-            <w:tcW w:type="dxa" w:w="1100"/>
+              <w:t xml:space="preserve">适合需求明确、数据基础较好的场景</w:t>
+            </w:r>
+          </w:p>
+        </w:tc>
+      </w:tr>
+      <w:tr>
+        <w:tc>
+          <w:tcPr>
+            <w:tcW w:type="dxa" w:w="1600"/>
             <w:tcBorders>
               <w:top w:val="single" w:color="CCCCCC" w:sz="1"/>
               <w:left w:val="single" w:color="CCCCCC" w:sz="1"/>
               <w:bottom w:val="single" w:color="CCCCCC" w:sz="1"/>
               <w:right w:val="single" w:color="CCCCCC" w:sz="1"/>
             </w:tcBorders>
-            <w:shd w:fill="F5F5F5" w:val="clear"/>
+            <w:shd w:fill="FFFFFF" w:val="clear"/>
             <w:tcMar>
               <w:top w:type="dxa" w:w="80"/>
               <w:left w:type="dxa" w:w="120"/>
@@ -8941,20 +8937,20 @@
                 <w:sz w:val="20"/>
                 <w:szCs w:val="20"/>
               </w:rPr>
-              <w:t xml:space="preserve">1–3 个月</w:t>
-            </w:r>
-          </w:p>
-        </w:tc>
-        <w:tc>
-          <w:tcPr>
-            <w:tcW w:type="dxa" w:w="4260"/>
+              <w:t xml:space="preserve">私有化部署</w:t>
+            </w:r>
+          </w:p>
+        </w:tc>
+        <w:tc>
+          <w:tcPr>
+            <w:tcW w:type="dxa" w:w="5360"/>
             <w:tcBorders>
               <w:top w:val="single" w:color="CCCCCC" w:sz="1"/>
               <w:left w:val="single" w:color="CCCCCC" w:sz="1"/>
               <w:bottom w:val="single" w:color="CCCCCC" w:sz="1"/>
               <w:right w:val="single" w:color="CCCCCC" w:sz="1"/>
             </w:tcBorders>
-            <w:shd w:fill="F5F5F5" w:val="clear"/>
+            <w:shd w:fill="FFFFFF" w:val="clear"/>
             <w:tcMar>
               <w:top w:type="dxa" w:w="80"/>
               <w:left w:type="dxa" w:w="120"/>
@@ -8970,7 +8966,7 @@
                 <w:sz w:val="20"/>
                 <w:szCs w:val="20"/>
               </w:rPr>
-              <w:t xml:space="preserve">完整功能开发、数据对接、测试上线，交付生产可用系统</w:t>
+              <w:t xml:space="preserve">模型和系统部署在甲方内网，数据不出域，满足安全合规要求</w:t>
             </w:r>
           </w:p>
         </w:tc>
@@ -8983,7 +8979,7 @@
               <w:bottom w:val="single" w:color="CCCCCC" w:sz="1"/>
               <w:right w:val="single" w:color="CCCCCC" w:sz="1"/>
             </w:tcBorders>
-            <w:shd w:fill="F5F5F5" w:val="clear"/>
+            <w:shd w:fill="FFFFFF" w:val="clear"/>
             <w:tcMar>
               <w:top w:type="dxa" w:w="80"/>
               <w:left w:type="dxa" w:w="120"/>
@@ -8999,7 +8995,7 @@
                 <w:sz w:val="20"/>
                 <w:szCs w:val="20"/>
               </w:rPr>
-              <w:t xml:space="preserve">适合需求明确、数据基础较好的场景</w:t>
+              <w:t xml:space="preserve">适合政府、金融、医疗等高安全要求场景</w:t>
             </w:r>
           </w:p>
         </w:tc>
@@ -9014,7 +9010,7 @@
               <w:bottom w:val="single" w:color="CCCCCC" w:sz="1"/>
               <w:right w:val="single" w:color="CCCCCC" w:sz="1"/>
             </w:tcBorders>
-            <w:shd w:fill="FFFFFF" w:val="clear"/>
+            <w:shd w:fill="F5F5F5" w:val="clear"/>
             <w:tcMar>
               <w:top w:type="dxa" w:w="80"/>
               <w:left w:type="dxa" w:w="120"/>
@@ -9030,160 +9026,13 @@
                 <w:sz w:val="20"/>
                 <w:szCs w:val="20"/>
               </w:rPr>
-              <w:t xml:space="preserve">私有化部署</w:t>
-            </w:r>
-          </w:p>
-        </w:tc>
-        <w:tc>
-          <w:tcPr>
-            <w:tcW w:type="dxa" w:w="1100"/>
-            <w:tcBorders>
-              <w:top w:val="single" w:color="CCCCCC" w:sz="1"/>
-              <w:left w:val="single" w:color="CCCCCC" w:sz="1"/>
-              <w:bottom w:val="single" w:color="CCCCCC" w:sz="1"/>
-              <w:right w:val="single" w:color="CCCCCC" w:sz="1"/>
-            </w:tcBorders>
-            <w:shd w:fill="FFFFFF" w:val="clear"/>
-            <w:tcMar>
-              <w:top w:type="dxa" w:w="80"/>
-              <w:left w:type="dxa" w:w="120"/>
-              <w:bottom w:type="dxa" w:w="80"/>
-              <w:right w:type="dxa" w:w="120"/>
-            </w:tcMar>
-          </w:tcPr>
-          <w:p>
-            <w:r>
-              <w:rPr>
-                <w:rFonts w:ascii="Arial" w:cs="Arial" w:eastAsia="Arial" w:hAnsi="Arial"/>
-                <w:color w:val="1A1A1A"/>
-                <w:sz w:val="20"/>
-                <w:szCs w:val="20"/>
-              </w:rPr>
-              <w:t xml:space="preserve">2–4 个月</w:t>
-            </w:r>
-          </w:p>
-        </w:tc>
-        <w:tc>
-          <w:tcPr>
-            <w:tcW w:type="dxa" w:w="4260"/>
-            <w:tcBorders>
-              <w:top w:val="single" w:color="CCCCCC" w:sz="1"/>
-              <w:left w:val="single" w:color="CCCCCC" w:sz="1"/>
-              <w:bottom w:val="single" w:color="CCCCCC" w:sz="1"/>
-              <w:right w:val="single" w:color="CCCCCC" w:sz="1"/>
-            </w:tcBorders>
-            <w:shd w:fill="FFFFFF" w:val="clear"/>
-            <w:tcMar>
-              <w:top w:type="dxa" w:w="80"/>
-              <w:left w:type="dxa" w:w="120"/>
-              <w:bottom w:type="dxa" w:w="80"/>
-              <w:right w:type="dxa" w:w="120"/>
-            </w:tcMar>
-          </w:tcPr>
-          <w:p>
-            <w:r>
-              <w:rPr>
-                <w:rFonts w:ascii="Arial" w:cs="Arial" w:eastAsia="Arial" w:hAnsi="Arial"/>
-                <w:color w:val="1A1A1A"/>
-                <w:sz w:val="20"/>
-                <w:szCs w:val="20"/>
-              </w:rPr>
-              <w:t xml:space="preserve">模型和系统部署在甲方内网，数据不出域，满足安全合规要求</w:t>
-            </w:r>
-          </w:p>
-        </w:tc>
-        <w:tc>
-          <w:tcPr>
-            <w:tcW w:type="dxa" w:w="2400"/>
-            <w:tcBorders>
-              <w:top w:val="single" w:color="CCCCCC" w:sz="1"/>
-              <w:left w:val="single" w:color="CCCCCC" w:sz="1"/>
-              <w:bottom w:val="single" w:color="CCCCCC" w:sz="1"/>
-              <w:right w:val="single" w:color="CCCCCC" w:sz="1"/>
-            </w:tcBorders>
-            <w:shd w:fill="FFFFFF" w:val="clear"/>
-            <w:tcMar>
-              <w:top w:type="dxa" w:w="80"/>
-              <w:left w:type="dxa" w:w="120"/>
-              <w:bottom w:type="dxa" w:w="80"/>
-              <w:right w:type="dxa" w:w="120"/>
-            </w:tcMar>
-          </w:tcPr>
-          <w:p>
-            <w:r>
-              <w:rPr>
-                <w:rFonts w:ascii="Arial" w:cs="Arial" w:eastAsia="Arial" w:hAnsi="Arial"/>
-                <w:color w:val="1A1A1A"/>
-                <w:sz w:val="20"/>
-                <w:szCs w:val="20"/>
-              </w:rPr>
-              <w:t xml:space="preserve">适合政府、金融、医疗等高安全要求场景</w:t>
-            </w:r>
-          </w:p>
-        </w:tc>
-      </w:tr>
-      <w:tr>
-        <w:tc>
-          <w:tcPr>
-            <w:tcW w:type="dxa" w:w="1600"/>
-            <w:tcBorders>
-              <w:top w:val="single" w:color="CCCCCC" w:sz="1"/>
-              <w:left w:val="single" w:color="CCCCCC" w:sz="1"/>
-              <w:bottom w:val="single" w:color="CCCCCC" w:sz="1"/>
-              <w:right w:val="single" w:color="CCCCCC" w:sz="1"/>
-            </w:tcBorders>
-            <w:shd w:fill="F5F5F5" w:val="clear"/>
-            <w:tcMar>
-              <w:top w:type="dxa" w:w="80"/>
-              <w:left w:type="dxa" w:w="120"/>
-              <w:bottom w:type="dxa" w:w="80"/>
-              <w:right w:type="dxa" w:w="120"/>
-            </w:tcMar>
-          </w:tcPr>
-          <w:p>
-            <w:r>
-              <w:rPr>
-                <w:rFonts w:ascii="Arial" w:cs="Arial" w:eastAsia="Arial" w:hAnsi="Arial"/>
-                <w:color w:val="1A1A1A"/>
-                <w:sz w:val="20"/>
-                <w:szCs w:val="20"/>
-              </w:rPr>
               <w:t xml:space="preserve">长期技术支持</w:t>
             </w:r>
           </w:p>
         </w:tc>
         <w:tc>
           <w:tcPr>
-            <w:tcW w:type="dxa" w:w="1100"/>
-            <w:tcBorders>
-              <w:top w:val="single" w:color="CCCCCC" w:sz="1"/>
-              <w:left w:val="single" w:color="CCCCCC" w:sz="1"/>
-              <w:bottom w:val="single" w:color="CCCCCC" w:sz="1"/>
-              <w:right w:val="single" w:color="CCCCCC" w:sz="1"/>
-            </w:tcBorders>
-            <w:shd w:fill="F5F5F5" w:val="clear"/>
-            <w:tcMar>
-              <w:top w:type="dxa" w:w="80"/>
-              <w:left w:type="dxa" w:w="120"/>
-              <w:bottom w:type="dxa" w:w="80"/>
-              <w:right w:type="dxa" w:w="120"/>
-            </w:tcMar>
-          </w:tcPr>
-          <w:p>
-            <w:r>
-              <w:rPr>
-                <w:rFonts w:ascii="Arial" w:cs="Arial" w:eastAsia="Arial" w:hAnsi="Arial"/>
-                <w:color w:val="1A1A1A"/>
-                <w:sz w:val="20"/>
-                <w:szCs w:val="20"/>
-              </w:rPr>
-              <w:t xml:space="preserve">按年续签</w:t>
-            </w:r>
-          </w:p>
-        </w:tc>
-        <w:tc>
-          <w:tcPr>
-            <w:tcW w:type="dxa" w:w="4260"/>
+            <w:tcW w:type="dxa" w:w="5360"/>
             <w:tcBorders>
               <w:top w:val="single" w:color="CCCCCC" w:sz="1"/>
               <w:left w:val="single" w:color="CCCCCC" w:sz="1"/>
@@ -9245,146 +9094,6 @@
       <w:pPr>
         <w:spacing w:after="240" w:before="0"/>
       </w:pPr>
-    </w:p>
-    <w:p>
-      <w:pPr>
-        <w:pBdr>
-          <w:bottom w:val="single" w:color="1B4F8A" w:sz="6" w:space="6"/>
-        </w:pBdr>
-        <w:spacing w:after="120" w:before="360"/>
-      </w:pPr>
-      <w:r>
-        <w:rPr>
-          <w:rFonts w:ascii="Arial" w:cs="Arial" w:eastAsia="Arial" w:hAnsi="Arial"/>
-          <w:b/>
-          <w:bCs/>
-          <w:color w:val="1B4F8A"/>
-          <w:sz w:val="30"/>
-          <w:szCs w:val="30"/>
-        </w:rPr>
-        <w:t xml:space="preserve">四、我们的立场</w:t>
-      </w:r>
-    </w:p>
-    <w:p>
-      <w:pPr>
-        <w:spacing w:after="120" w:before="0"/>
-      </w:pPr>
-    </w:p>
-    <w:p>
-      <w:pPr>
-        <w:spacing w:after="60" w:before="60"/>
-      </w:pPr>
-      <w:r>
-        <w:rPr>
-          <w:rFonts w:ascii="Arial" w:cs="Arial" w:eastAsia="Arial" w:hAnsi="Arial"/>
-          <w:color w:val="1A1A1A"/>
-          <w:sz w:val="22"/>
-          <w:szCs w:val="22"/>
-        </w:rPr>
-        <w:t xml:space="preserve">我们不做"AI 概念包装"，只交付真正能跑起来的系统。</w:t>
-      </w:r>
-    </w:p>
-    <w:p>
-      <w:pPr>
-        <w:spacing w:after="80" w:before="0"/>
-      </w:pPr>
-    </w:p>
-    <w:p>
-      <w:pPr>
-        <w:pStyle w:val="ListParagraph"/>
-        <w:numPr>
-          <w:ilvl w:val="0"/>
-          <w:numId w:val="2"/>
-        </w:numPr>
-        <w:spacing w:after="40" w:before="40"/>
-      </w:pPr>
-      <w:r>
-        <w:rPr>
-          <w:rFonts w:ascii="Arial" w:cs="Arial" w:eastAsia="Arial" w:hAnsi="Arial"/>
-          <w:color w:val="1A1A1A"/>
-          <w:sz w:val="22"/>
-          <w:szCs w:val="22"/>
-        </w:rPr>
-        <w:t xml:space="preserve">所有方案基于真实业务数据，不允许 AI 编造结论</w:t>
-      </w:r>
-    </w:p>
-    <w:p>
-      <w:pPr>
-        <w:pStyle w:val="ListParagraph"/>
-        <w:numPr>
-          <w:ilvl w:val="0"/>
-          <w:numId w:val="2"/>
-        </w:numPr>
-        <w:spacing w:after="40" w:before="40"/>
-      </w:pPr>
-      <w:r>
-        <w:rPr>
-          <w:rFonts w:ascii="Arial" w:cs="Arial" w:eastAsia="Arial" w:hAnsi="Arial"/>
-          <w:color w:val="1A1A1A"/>
-          <w:sz w:val="22"/>
-          <w:szCs w:val="22"/>
-        </w:rPr>
-        <w:t xml:space="preserve">每个项目先从痛点出发，不堆砌技术</w:t>
-      </w:r>
-    </w:p>
-    <w:p>
-      <w:pPr>
-        <w:pStyle w:val="ListParagraph"/>
-        <w:numPr>
-          <w:ilvl w:val="0"/>
-          <w:numId w:val="2"/>
-        </w:numPr>
-        <w:spacing w:after="40" w:before="40"/>
-      </w:pPr>
-      <w:r>
-        <w:rPr>
-          <w:rFonts w:ascii="Arial" w:cs="Arial" w:eastAsia="Arial" w:hAnsi="Arial"/>
-          <w:color w:val="1A1A1A"/>
-          <w:sz w:val="22"/>
-          <w:szCs w:val="22"/>
-        </w:rPr>
-        <w:t xml:space="preserve">优先推荐小范围验证，见效后再扩展，降低甲方风险</w:t>
-      </w:r>
-    </w:p>
-    <w:p>
-      <w:pPr>
-        <w:pStyle w:val="ListParagraph"/>
-        <w:numPr>
-          <w:ilvl w:val="0"/>
-          <w:numId w:val="2"/>
-        </w:numPr>
-        <w:spacing w:after="40" w:before="40"/>
-      </w:pPr>
-      <w:r>
-        <w:rPr>
-          <w:rFonts w:ascii="Arial" w:cs="Arial" w:eastAsia="Arial" w:hAnsi="Arial"/>
-          <w:color w:val="1A1A1A"/>
-          <w:sz w:val="22"/>
-          <w:szCs w:val="22"/>
-        </w:rPr>
-        <w:t xml:space="preserve">生产环境经过严格测试，不交付只能演示的 demo</w:t>
-      </w:r>
-    </w:p>
-    <w:p>
-      <w:pPr>
-        <w:spacing w:after="240" w:before="0"/>
-      </w:pPr>
-    </w:p>
-    <w:p>
-      <w:pPr>
-        <w:spacing w:after="60" w:before="60"/>
-      </w:pPr>
-      <w:r>
-        <w:rPr>
-          <w:rFonts w:ascii="Arial" w:cs="Arial" w:eastAsia="Arial" w:hAnsi="Arial"/>
-          <w:i/>
-          <w:iCs/>
-          <w:color w:val="555555"/>
-          <w:sz w:val="22"/>
-          <w:szCs w:val="22"/>
-        </w:rPr>
-        <w:t xml:space="preserve">如需进一步了解某个方向的详细方案或报价，欢迎随时沟通。</w:t>
-      </w:r>
     </w:p>
     <w:sectPr>
       <w:footerReference w:type="default" r:id="rId7"/>

</xml_diff>

<commit_message>
docs: add 实现难度 column to capability overview table
Rated low/mid/high (低★☆☆ / 中★★☆ / 高★★★) for cost estimation:
高: 结构化数据问答, AI工作流/多Agent, 视觉识别与智能预警
低: 竞品/行业快速分析, AI培训题库生成, AI文本摘要与总结
中: remaining 7 capabilities

Co-Authored-By: Claude Sonnet 4.6 <noreply@anthropic.com>
</commit_message>
<xml_diff>
--- a/docs/AI能力与解决方案.docx
+++ b/docs/AI能力与解决方案.docx
@@ -163,10 +163,11 @@
         </w:tblBorders>
       </w:tblPr>
       <w:tblGrid>
-        <w:gridCol w:w="2600"/>
-        <w:gridCol w:w="3200"/>
-        <w:gridCol w:w="1780"/>
-        <w:gridCol w:w="1780"/>
+        <w:gridCol w:w="2200"/>
+        <w:gridCol w:w="2800"/>
+        <w:gridCol w:w="1480"/>
+        <w:gridCol w:w="1480"/>
+        <w:gridCol w:w="1400"/>
       </w:tblGrid>
       <w:tr>
         <w:trPr>
@@ -174,7 +175,7 @@
         </w:trPr>
         <w:tc>
           <w:tcPr>
-            <w:tcW w:type="dxa" w:w="2600"/>
+            <w:tcW w:type="dxa" w:w="2200"/>
             <w:tcBorders>
               <w:top w:val="single" w:color="1B4F8A" w:sz="1"/>
               <w:left w:val="single" w:color="1B4F8A" w:sz="1"/>
@@ -208,7 +209,7 @@
         </w:tc>
         <w:tc>
           <w:tcPr>
-            <w:tcW w:type="dxa" w:w="3200"/>
+            <w:tcW w:type="dxa" w:w="2800"/>
             <w:tcBorders>
               <w:top w:val="single" w:color="1B4F8A" w:sz="1"/>
               <w:left w:val="single" w:color="1B4F8A" w:sz="1"/>
@@ -242,7 +243,7 @@
         </w:tc>
         <w:tc>
           <w:tcPr>
-            <w:tcW w:type="dxa" w:w="1780"/>
+            <w:tcW w:type="dxa" w:w="1480"/>
             <w:tcBorders>
               <w:top w:val="single" w:color="1B4F8A" w:sz="1"/>
               <w:left w:val="single" w:color="1B4F8A" w:sz="1"/>
@@ -276,7 +277,7 @@
         </w:tc>
         <w:tc>
           <w:tcPr>
-            <w:tcW w:type="dxa" w:w="1780"/>
+            <w:tcW w:type="dxa" w:w="1480"/>
             <w:tcBorders>
               <w:top w:val="single" w:color="1B4F8A" w:sz="1"/>
               <w:left w:val="single" w:color="1B4F8A" w:sz="1"/>
@@ -308,18 +309,16 @@
             </w:r>
           </w:p>
         </w:tc>
-      </w:tr>
-      <w:tr>
-        <w:tc>
-          <w:tcPr>
-            <w:tcW w:type="dxa" w:w="2600"/>
-            <w:tcBorders>
-              <w:top w:val="single" w:color="CCCCCC" w:sz="1"/>
-              <w:left w:val="single" w:color="CCCCCC" w:sz="1"/>
-              <w:bottom w:val="single" w:color="CCCCCC" w:sz="1"/>
-              <w:right w:val="single" w:color="CCCCCC" w:sz="1"/>
-            </w:tcBorders>
-            <w:shd w:fill="FFFFFF" w:val="clear"/>
+        <w:tc>
+          <w:tcPr>
+            <w:tcW w:type="dxa" w:w="1400"/>
+            <w:tcBorders>
+              <w:top w:val="single" w:color="1B4F8A" w:sz="1"/>
+              <w:left w:val="single" w:color="1B4F8A" w:sz="1"/>
+              <w:bottom w:val="single" w:color="1B4F8A" w:sz="1"/>
+              <w:right w:val="single" w:color="1B4F8A" w:sz="1"/>
+            </w:tcBorders>
+            <w:shd w:fill="1B4F8A" w:val="clear"/>
             <w:tcMar>
               <w:top w:type="dxa" w:w="80"/>
               <w:left w:type="dxa" w:w="120"/>
@@ -329,22 +328,26 @@
           </w:tcPr>
           <w:p>
             <w:pPr>
-              <w:jc w:val="left"/>
-            </w:pPr>
-            <w:r>
-              <w:rPr>
-                <w:rFonts w:ascii="Arial" w:cs="Arial" w:eastAsia="Arial" w:hAnsi="Arial"/>
-                <w:color w:val="1A1A1A"/>
-                <w:sz w:val="20"/>
-                <w:szCs w:val="20"/>
-              </w:rPr>
-              <w:t xml:space="preserve">结构化数据问答</w:t>
-            </w:r>
-          </w:p>
-        </w:tc>
-        <w:tc>
-          <w:tcPr>
-            <w:tcW w:type="dxa" w:w="3200"/>
+              <w:jc w:val="center"/>
+            </w:pPr>
+            <w:r>
+              <w:rPr>
+                <w:rFonts w:ascii="Arial" w:cs="Arial" w:eastAsia="Arial" w:hAnsi="Arial"/>
+                <w:b/>
+                <w:bCs/>
+                <w:color w:val="FFFFFF"/>
+                <w:sz w:val="20"/>
+                <w:szCs w:val="20"/>
+              </w:rPr>
+              <w:t xml:space="preserve">实现难度</w:t>
+            </w:r>
+          </w:p>
+        </w:tc>
+      </w:tr>
+      <w:tr>
+        <w:tc>
+          <w:tcPr>
+            <w:tcW w:type="dxa" w:w="2200"/>
             <w:tcBorders>
               <w:top w:val="single" w:color="CCCCCC" w:sz="1"/>
               <w:left w:val="single" w:color="CCCCCC" w:sz="1"/>
@@ -370,13 +373,13 @@
                 <w:sz w:val="20"/>
                 <w:szCs w:val="20"/>
               </w:rPr>
-              <w:t xml:space="preserve">让非技术人员用自然语言查业务数据库</w:t>
-            </w:r>
-          </w:p>
-        </w:tc>
-        <w:tc>
-          <w:tcPr>
-            <w:tcW w:type="dxa" w:w="1780"/>
+              <w:t xml:space="preserve">结构化数据问答</w:t>
+            </w:r>
+          </w:p>
+        </w:tc>
+        <w:tc>
+          <w:tcPr>
+            <w:tcW w:type="dxa" w:w="2800"/>
             <w:tcBorders>
               <w:top w:val="single" w:color="CCCCCC" w:sz="1"/>
               <w:left w:val="single" w:color="CCCCCC" w:sz="1"/>
@@ -393,22 +396,22 @@
           </w:tcPr>
           <w:p>
             <w:pPr>
-              <w:jc w:val="center"/>
-            </w:pPr>
-            <w:r>
-              <w:rPr>
-                <w:rFonts w:ascii="Arial" w:cs="Arial" w:eastAsia="Arial" w:hAnsi="Arial"/>
-                <w:color w:val="1A1A1A"/>
-                <w:sz w:val="20"/>
-                <w:szCs w:val="20"/>
-              </w:rPr>
-              <w:t xml:space="preserve">已有生产案例</w:t>
-            </w:r>
-          </w:p>
-        </w:tc>
-        <w:tc>
-          <w:tcPr>
-            <w:tcW w:type="dxa" w:w="1780"/>
+              <w:jc w:val="left"/>
+            </w:pPr>
+            <w:r>
+              <w:rPr>
+                <w:rFonts w:ascii="Arial" w:cs="Arial" w:eastAsia="Arial" w:hAnsi="Arial"/>
+                <w:color w:val="1A1A1A"/>
+                <w:sz w:val="20"/>
+                <w:szCs w:val="20"/>
+              </w:rPr>
+              <w:t xml:space="preserve">让非技术人员用自然语言查业务数据库</w:t>
+            </w:r>
+          </w:p>
+        </w:tc>
+        <w:tc>
+          <w:tcPr>
+            <w:tcW w:type="dxa" w:w="1480"/>
             <w:tcBorders>
               <w:top w:val="single" w:color="CCCCCC" w:sz="1"/>
               <w:left w:val="single" w:color="CCCCCC" w:sz="1"/>
@@ -434,22 +437,20 @@
                 <w:sz w:val="20"/>
                 <w:szCs w:val="20"/>
               </w:rPr>
-              <w:t xml:space="preserve">★★★★★</w:t>
-            </w:r>
-          </w:p>
-        </w:tc>
-      </w:tr>
-      <w:tr>
-        <w:tc>
-          <w:tcPr>
-            <w:tcW w:type="dxa" w:w="2600"/>
+              <w:t xml:space="preserve">已有生产案例</w:t>
+            </w:r>
+          </w:p>
+        </w:tc>
+        <w:tc>
+          <w:tcPr>
+            <w:tcW w:type="dxa" w:w="1480"/>
             <w:tcBorders>
               <w:top w:val="single" w:color="CCCCCC" w:sz="1"/>
               <w:left w:val="single" w:color="CCCCCC" w:sz="1"/>
               <w:bottom w:val="single" w:color="CCCCCC" w:sz="1"/>
               <w:right w:val="single" w:color="CCCCCC" w:sz="1"/>
             </w:tcBorders>
-            <w:shd w:fill="F5F5F5" w:val="clear"/>
+            <w:shd w:fill="FFFFFF" w:val="clear"/>
             <w:tcMar>
               <w:top w:type="dxa" w:w="80"/>
               <w:left w:type="dxa" w:w="120"/>
@@ -459,29 +460,29 @@
           </w:tcPr>
           <w:p>
             <w:pPr>
-              <w:jc w:val="left"/>
-            </w:pPr>
-            <w:r>
-              <w:rPr>
-                <w:rFonts w:ascii="Arial" w:cs="Arial" w:eastAsia="Arial" w:hAnsi="Arial"/>
-                <w:color w:val="1A1A1A"/>
-                <w:sz w:val="20"/>
-                <w:szCs w:val="20"/>
-              </w:rPr>
-              <w:t xml:space="preserve">企业知识库问答（RAG）</w:t>
-            </w:r>
-          </w:p>
-        </w:tc>
-        <w:tc>
-          <w:tcPr>
-            <w:tcW w:type="dxa" w:w="3200"/>
+              <w:jc w:val="center"/>
+            </w:pPr>
+            <w:r>
+              <w:rPr>
+                <w:rFonts w:ascii="Arial" w:cs="Arial" w:eastAsia="Arial" w:hAnsi="Arial"/>
+                <w:color w:val="1A1A1A"/>
+                <w:sz w:val="20"/>
+                <w:szCs w:val="20"/>
+              </w:rPr>
+              <w:t xml:space="preserve">★★★★★</w:t>
+            </w:r>
+          </w:p>
+        </w:tc>
+        <w:tc>
+          <w:tcPr>
+            <w:tcW w:type="dxa" w:w="1400"/>
             <w:tcBorders>
               <w:top w:val="single" w:color="CCCCCC" w:sz="1"/>
               <w:left w:val="single" w:color="CCCCCC" w:sz="1"/>
               <w:bottom w:val="single" w:color="CCCCCC" w:sz="1"/>
               <w:right w:val="single" w:color="CCCCCC" w:sz="1"/>
             </w:tcBorders>
-            <w:shd w:fill="F5F5F5" w:val="clear"/>
+            <w:shd w:fill="FFFFFF" w:val="clear"/>
             <w:tcMar>
               <w:top w:type="dxa" w:w="80"/>
               <w:left w:type="dxa" w:w="120"/>
@@ -491,22 +492,24 @@
           </w:tcPr>
           <w:p>
             <w:pPr>
-              <w:jc w:val="left"/>
-            </w:pPr>
-            <w:r>
-              <w:rPr>
-                <w:rFonts w:ascii="Arial" w:cs="Arial" w:eastAsia="Arial" w:hAnsi="Arial"/>
-                <w:color w:val="1A1A1A"/>
-                <w:sz w:val="20"/>
-                <w:szCs w:val="20"/>
-              </w:rPr>
-              <w:t xml:space="preserve">把内部文档变成可问答的知识资产</w:t>
-            </w:r>
-          </w:p>
-        </w:tc>
-        <w:tc>
-          <w:tcPr>
-            <w:tcW w:type="dxa" w:w="1780"/>
+              <w:jc w:val="center"/>
+            </w:pPr>
+            <w:r>
+              <w:rPr>
+                <w:rFonts w:ascii="Arial" w:cs="Arial" w:eastAsia="Arial" w:hAnsi="Arial"/>
+                <w:color w:val="1A1A1A"/>
+                <w:sz w:val="20"/>
+                <w:szCs w:val="20"/>
+              </w:rPr>
+              <w:t xml:space="preserve">高 ★★★</w:t>
+            </w:r>
+          </w:p>
+        </w:tc>
+      </w:tr>
+      <w:tr>
+        <w:tc>
+          <w:tcPr>
+            <w:tcW w:type="dxa" w:w="2200"/>
             <w:tcBorders>
               <w:top w:val="single" w:color="CCCCCC" w:sz="1"/>
               <w:left w:val="single" w:color="CCCCCC" w:sz="1"/>
@@ -523,22 +526,22 @@
           </w:tcPr>
           <w:p>
             <w:pPr>
-              <w:jc w:val="center"/>
-            </w:pPr>
-            <w:r>
-              <w:rPr>
-                <w:rFonts w:ascii="Arial" w:cs="Arial" w:eastAsia="Arial" w:hAnsi="Arial"/>
-                <w:color w:val="1A1A1A"/>
-                <w:sz w:val="20"/>
-                <w:szCs w:val="20"/>
-              </w:rPr>
-              <w:t xml:space="preserve">已有生产案例</w:t>
-            </w:r>
-          </w:p>
-        </w:tc>
-        <w:tc>
-          <w:tcPr>
-            <w:tcW w:type="dxa" w:w="1780"/>
+              <w:jc w:val="left"/>
+            </w:pPr>
+            <w:r>
+              <w:rPr>
+                <w:rFonts w:ascii="Arial" w:cs="Arial" w:eastAsia="Arial" w:hAnsi="Arial"/>
+                <w:color w:val="1A1A1A"/>
+                <w:sz w:val="20"/>
+                <w:szCs w:val="20"/>
+              </w:rPr>
+              <w:t xml:space="preserve">企业知识库问答（RAG）</w:t>
+            </w:r>
+          </w:p>
+        </w:tc>
+        <w:tc>
+          <w:tcPr>
+            <w:tcW w:type="dxa" w:w="2800"/>
             <w:tcBorders>
               <w:top w:val="single" w:color="CCCCCC" w:sz="1"/>
               <w:left w:val="single" w:color="CCCCCC" w:sz="1"/>
@@ -555,31 +558,29 @@
           </w:tcPr>
           <w:p>
             <w:pPr>
-              <w:jc w:val="center"/>
-            </w:pPr>
-            <w:r>
-              <w:rPr>
-                <w:rFonts w:ascii="Arial" w:cs="Arial" w:eastAsia="Arial" w:hAnsi="Arial"/>
-                <w:color w:val="1A1A1A"/>
-                <w:sz w:val="20"/>
-                <w:szCs w:val="20"/>
-              </w:rPr>
-              <w:t xml:space="preserve">★★★★★</w:t>
-            </w:r>
-          </w:p>
-        </w:tc>
-      </w:tr>
-      <w:tr>
-        <w:tc>
-          <w:tcPr>
-            <w:tcW w:type="dxa" w:w="2600"/>
+              <w:jc w:val="left"/>
+            </w:pPr>
+            <w:r>
+              <w:rPr>
+                <w:rFonts w:ascii="Arial" w:cs="Arial" w:eastAsia="Arial" w:hAnsi="Arial"/>
+                <w:color w:val="1A1A1A"/>
+                <w:sz w:val="20"/>
+                <w:szCs w:val="20"/>
+              </w:rPr>
+              <w:t xml:space="preserve">把内部文档变成可问答的知识资产</w:t>
+            </w:r>
+          </w:p>
+        </w:tc>
+        <w:tc>
+          <w:tcPr>
+            <w:tcW w:type="dxa" w:w="1480"/>
             <w:tcBorders>
               <w:top w:val="single" w:color="CCCCCC" w:sz="1"/>
               <w:left w:val="single" w:color="CCCCCC" w:sz="1"/>
               <w:bottom w:val="single" w:color="CCCCCC" w:sz="1"/>
               <w:right w:val="single" w:color="CCCCCC" w:sz="1"/>
             </w:tcBorders>
-            <w:shd w:fill="FFFFFF" w:val="clear"/>
+            <w:shd w:fill="F5F5F5" w:val="clear"/>
             <w:tcMar>
               <w:top w:type="dxa" w:w="80"/>
               <w:left w:type="dxa" w:w="120"/>
@@ -589,29 +590,29 @@
           </w:tcPr>
           <w:p>
             <w:pPr>
-              <w:jc w:val="left"/>
-            </w:pPr>
-            <w:r>
-              <w:rPr>
-                <w:rFonts w:ascii="Arial" w:cs="Arial" w:eastAsia="Arial" w:hAnsi="Arial"/>
-                <w:color w:val="1A1A1A"/>
-                <w:sz w:val="20"/>
-                <w:szCs w:val="20"/>
-              </w:rPr>
-              <w:t xml:space="preserve">文档智能分析</w:t>
-            </w:r>
-          </w:p>
-        </w:tc>
-        <w:tc>
-          <w:tcPr>
-            <w:tcW w:type="dxa" w:w="3200"/>
+              <w:jc w:val="center"/>
+            </w:pPr>
+            <w:r>
+              <w:rPr>
+                <w:rFonts w:ascii="Arial" w:cs="Arial" w:eastAsia="Arial" w:hAnsi="Arial"/>
+                <w:color w:val="1A1A1A"/>
+                <w:sz w:val="20"/>
+                <w:szCs w:val="20"/>
+              </w:rPr>
+              <w:t xml:space="preserve">已有生产案例</w:t>
+            </w:r>
+          </w:p>
+        </w:tc>
+        <w:tc>
+          <w:tcPr>
+            <w:tcW w:type="dxa" w:w="1480"/>
             <w:tcBorders>
               <w:top w:val="single" w:color="CCCCCC" w:sz="1"/>
               <w:left w:val="single" w:color="CCCCCC" w:sz="1"/>
               <w:bottom w:val="single" w:color="CCCCCC" w:sz="1"/>
               <w:right w:val="single" w:color="CCCCCC" w:sz="1"/>
             </w:tcBorders>
-            <w:shd w:fill="FFFFFF" w:val="clear"/>
+            <w:shd w:fill="F5F5F5" w:val="clear"/>
             <w:tcMar>
               <w:top w:type="dxa" w:w="80"/>
               <w:left w:type="dxa" w:w="120"/>
@@ -621,22 +622,22 @@
           </w:tcPr>
           <w:p>
             <w:pPr>
-              <w:jc w:val="left"/>
-            </w:pPr>
-            <w:r>
-              <w:rPr>
-                <w:rFonts w:ascii="Arial" w:cs="Arial" w:eastAsia="Arial" w:hAnsi="Arial"/>
-                <w:color w:val="1A1A1A"/>
-                <w:sz w:val="20"/>
-                <w:szCs w:val="20"/>
-              </w:rPr>
-              <w:t xml:space="preserve">一份文档自动生成多种衍生内容</w:t>
-            </w:r>
-          </w:p>
-        </w:tc>
-        <w:tc>
-          <w:tcPr>
-            <w:tcW w:type="dxa" w:w="1780"/>
+              <w:jc w:val="center"/>
+            </w:pPr>
+            <w:r>
+              <w:rPr>
+                <w:rFonts w:ascii="Arial" w:cs="Arial" w:eastAsia="Arial" w:hAnsi="Arial"/>
+                <w:color w:val="1A1A1A"/>
+                <w:sz w:val="20"/>
+                <w:szCs w:val="20"/>
+              </w:rPr>
+              <w:t xml:space="preserve">★★★★★</w:t>
+            </w:r>
+          </w:p>
+        </w:tc>
+        <w:tc>
+          <w:tcPr>
+            <w:tcW w:type="dxa" w:w="1400"/>
             <w:tcBorders>
               <w:top w:val="single" w:color="CCCCCC" w:sz="1"/>
               <w:left w:val="single" w:color="CCCCCC" w:sz="1"/>
@@ -662,13 +663,15 @@
                 <w:sz w:val="20"/>
                 <w:szCs w:val="20"/>
               </w:rPr>
-              <w:t xml:space="preserve">已有生产案例</w:t>
-            </w:r>
-          </w:p>
-        </w:tc>
-        <w:tc>
-          <w:tcPr>
-            <w:tcW w:type="dxa" w:w="1780"/>
+              <w:t xml:space="preserve">中 ★★☆</w:t>
+            </w:r>
+          </w:p>
+        </w:tc>
+      </w:tr>
+      <w:tr>
+        <w:tc>
+          <w:tcPr>
+            <w:tcW w:type="dxa" w:w="2200"/>
             <w:tcBorders>
               <w:top w:val="single" w:color="CCCCCC" w:sz="1"/>
               <w:left w:val="single" w:color="CCCCCC" w:sz="1"/>
@@ -685,31 +688,29 @@
           </w:tcPr>
           <w:p>
             <w:pPr>
-              <w:jc w:val="center"/>
-            </w:pPr>
-            <w:r>
-              <w:rPr>
-                <w:rFonts w:ascii="Arial" w:cs="Arial" w:eastAsia="Arial" w:hAnsi="Arial"/>
-                <w:color w:val="1A1A1A"/>
-                <w:sz w:val="20"/>
-                <w:szCs w:val="20"/>
-              </w:rPr>
-              <w:t xml:space="preserve">★★★★☆</w:t>
-            </w:r>
-          </w:p>
-        </w:tc>
-      </w:tr>
-      <w:tr>
-        <w:tc>
-          <w:tcPr>
-            <w:tcW w:type="dxa" w:w="2600"/>
+              <w:jc w:val="left"/>
+            </w:pPr>
+            <w:r>
+              <w:rPr>
+                <w:rFonts w:ascii="Arial" w:cs="Arial" w:eastAsia="Arial" w:hAnsi="Arial"/>
+                <w:color w:val="1A1A1A"/>
+                <w:sz w:val="20"/>
+                <w:szCs w:val="20"/>
+              </w:rPr>
+              <w:t xml:space="preserve">文档智能分析</w:t>
+            </w:r>
+          </w:p>
+        </w:tc>
+        <w:tc>
+          <w:tcPr>
+            <w:tcW w:type="dxa" w:w="2800"/>
             <w:tcBorders>
               <w:top w:val="single" w:color="CCCCCC" w:sz="1"/>
               <w:left w:val="single" w:color="CCCCCC" w:sz="1"/>
               <w:bottom w:val="single" w:color="CCCCCC" w:sz="1"/>
               <w:right w:val="single" w:color="CCCCCC" w:sz="1"/>
             </w:tcBorders>
-            <w:shd w:fill="F5F5F5" w:val="clear"/>
+            <w:shd w:fill="FFFFFF" w:val="clear"/>
             <w:tcMar>
               <w:top w:type="dxa" w:w="80"/>
               <w:left w:type="dxa" w:w="120"/>
@@ -728,20 +729,20 @@
                 <w:sz w:val="20"/>
                 <w:szCs w:val="20"/>
               </w:rPr>
-              <w:t xml:space="preserve">AI 工作流 / 多 Agent</w:t>
-            </w:r>
-          </w:p>
-        </w:tc>
-        <w:tc>
-          <w:tcPr>
-            <w:tcW w:type="dxa" w:w="3200"/>
+              <w:t xml:space="preserve">一份文档自动生成多种衍生内容</w:t>
+            </w:r>
+          </w:p>
+        </w:tc>
+        <w:tc>
+          <w:tcPr>
+            <w:tcW w:type="dxa" w:w="1480"/>
             <w:tcBorders>
               <w:top w:val="single" w:color="CCCCCC" w:sz="1"/>
               <w:left w:val="single" w:color="CCCCCC" w:sz="1"/>
               <w:bottom w:val="single" w:color="CCCCCC" w:sz="1"/>
               <w:right w:val="single" w:color="CCCCCC" w:sz="1"/>
             </w:tcBorders>
-            <w:shd w:fill="F5F5F5" w:val="clear"/>
+            <w:shd w:fill="FFFFFF" w:val="clear"/>
             <w:tcMar>
               <w:top w:type="dxa" w:w="80"/>
               <w:left w:type="dxa" w:w="120"/>
@@ -751,29 +752,29 @@
           </w:tcPr>
           <w:p>
             <w:pPr>
-              <w:jc w:val="left"/>
-            </w:pPr>
-            <w:r>
-              <w:rPr>
-                <w:rFonts w:ascii="Arial" w:cs="Arial" w:eastAsia="Arial" w:hAnsi="Arial"/>
-                <w:color w:val="1A1A1A"/>
-                <w:sz w:val="20"/>
-                <w:szCs w:val="20"/>
-              </w:rPr>
-              <w:t xml:space="preserve">把复杂多步骤流程交给 AI 自动完成</w:t>
-            </w:r>
-          </w:p>
-        </w:tc>
-        <w:tc>
-          <w:tcPr>
-            <w:tcW w:type="dxa" w:w="1780"/>
+              <w:jc w:val="center"/>
+            </w:pPr>
+            <w:r>
+              <w:rPr>
+                <w:rFonts w:ascii="Arial" w:cs="Arial" w:eastAsia="Arial" w:hAnsi="Arial"/>
+                <w:color w:val="1A1A1A"/>
+                <w:sz w:val="20"/>
+                <w:szCs w:val="20"/>
+              </w:rPr>
+              <w:t xml:space="preserve">已有生产案例</w:t>
+            </w:r>
+          </w:p>
+        </w:tc>
+        <w:tc>
+          <w:tcPr>
+            <w:tcW w:type="dxa" w:w="1480"/>
             <w:tcBorders>
               <w:top w:val="single" w:color="CCCCCC" w:sz="1"/>
               <w:left w:val="single" w:color="CCCCCC" w:sz="1"/>
               <w:bottom w:val="single" w:color="CCCCCC" w:sz="1"/>
               <w:right w:val="single" w:color="CCCCCC" w:sz="1"/>
             </w:tcBorders>
-            <w:shd w:fill="F5F5F5" w:val="clear"/>
+            <w:shd w:fill="FFFFFF" w:val="clear"/>
             <w:tcMar>
               <w:top w:type="dxa" w:w="80"/>
               <w:left w:type="dxa" w:w="120"/>
@@ -792,20 +793,20 @@
                 <w:sz w:val="20"/>
                 <w:szCs w:val="20"/>
               </w:rPr>
-              <w:t xml:space="preserve">已有生产案例</w:t>
-            </w:r>
-          </w:p>
-        </w:tc>
-        <w:tc>
-          <w:tcPr>
-            <w:tcW w:type="dxa" w:w="1780"/>
+              <w:t xml:space="preserve">★★★★☆</w:t>
+            </w:r>
+          </w:p>
+        </w:tc>
+        <w:tc>
+          <w:tcPr>
+            <w:tcW w:type="dxa" w:w="1400"/>
             <w:tcBorders>
               <w:top w:val="single" w:color="CCCCCC" w:sz="1"/>
               <w:left w:val="single" w:color="CCCCCC" w:sz="1"/>
               <w:bottom w:val="single" w:color="CCCCCC" w:sz="1"/>
               <w:right w:val="single" w:color="CCCCCC" w:sz="1"/>
             </w:tcBorders>
-            <w:shd w:fill="F5F5F5" w:val="clear"/>
+            <w:shd w:fill="FFFFFF" w:val="clear"/>
             <w:tcMar>
               <w:top w:type="dxa" w:w="80"/>
               <w:left w:type="dxa" w:w="120"/>
@@ -824,7 +825,7 @@
                 <w:sz w:val="20"/>
                 <w:szCs w:val="20"/>
               </w:rPr>
-              <w:t xml:space="preserve">★★★★☆</w:t>
+              <w:t xml:space="preserve">中 ★★☆</w:t>
             </w:r>
           </w:p>
         </w:tc>
@@ -832,14 +833,14 @@
       <w:tr>
         <w:tc>
           <w:tcPr>
-            <w:tcW w:type="dxa" w:w="2600"/>
+            <w:tcW w:type="dxa" w:w="2200"/>
             <w:tcBorders>
               <w:top w:val="single" w:color="CCCCCC" w:sz="1"/>
               <w:left w:val="single" w:color="CCCCCC" w:sz="1"/>
               <w:bottom w:val="single" w:color="CCCCCC" w:sz="1"/>
               <w:right w:val="single" w:color="CCCCCC" w:sz="1"/>
             </w:tcBorders>
-            <w:shd w:fill="FFFFFF" w:val="clear"/>
+            <w:shd w:fill="F5F5F5" w:val="clear"/>
             <w:tcMar>
               <w:top w:type="dxa" w:w="80"/>
               <w:left w:type="dxa" w:w="120"/>
@@ -858,20 +859,20 @@
                 <w:sz w:val="20"/>
                 <w:szCs w:val="20"/>
               </w:rPr>
-              <w:t xml:space="preserve">AI 内容创作自动化</w:t>
-            </w:r>
-          </w:p>
-        </w:tc>
-        <w:tc>
-          <w:tcPr>
-            <w:tcW w:type="dxa" w:w="3200"/>
+              <w:t xml:space="preserve">AI 工作流 / 多 Agent</w:t>
+            </w:r>
+          </w:p>
+        </w:tc>
+        <w:tc>
+          <w:tcPr>
+            <w:tcW w:type="dxa" w:w="2800"/>
             <w:tcBorders>
               <w:top w:val="single" w:color="CCCCCC" w:sz="1"/>
               <w:left w:val="single" w:color="CCCCCC" w:sz="1"/>
               <w:bottom w:val="single" w:color="CCCCCC" w:sz="1"/>
               <w:right w:val="single" w:color="CCCCCC" w:sz="1"/>
             </w:tcBorders>
-            <w:shd w:fill="FFFFFF" w:val="clear"/>
+            <w:shd w:fill="F5F5F5" w:val="clear"/>
             <w:tcMar>
               <w:top w:type="dxa" w:w="80"/>
               <w:left w:type="dxa" w:w="120"/>
@@ -890,20 +891,20 @@
                 <w:sz w:val="20"/>
                 <w:szCs w:val="20"/>
               </w:rPr>
-              <w:t xml:space="preserve">从需求到结构化内容，全程 AI 驱动</w:t>
-            </w:r>
-          </w:p>
-        </w:tc>
-        <w:tc>
-          <w:tcPr>
-            <w:tcW w:type="dxa" w:w="1780"/>
+              <w:t xml:space="preserve">把复杂多步骤流程交给 AI 自动完成</w:t>
+            </w:r>
+          </w:p>
+        </w:tc>
+        <w:tc>
+          <w:tcPr>
+            <w:tcW w:type="dxa" w:w="1480"/>
             <w:tcBorders>
               <w:top w:val="single" w:color="CCCCCC" w:sz="1"/>
               <w:left w:val="single" w:color="CCCCCC" w:sz="1"/>
               <w:bottom w:val="single" w:color="CCCCCC" w:sz="1"/>
               <w:right w:val="single" w:color="CCCCCC" w:sz="1"/>
             </w:tcBorders>
-            <w:shd w:fill="FFFFFF" w:val="clear"/>
+            <w:shd w:fill="F5F5F5" w:val="clear"/>
             <w:tcMar>
               <w:top w:type="dxa" w:w="80"/>
               <w:left w:type="dxa" w:w="120"/>
@@ -928,14 +929,14 @@
         </w:tc>
         <w:tc>
           <w:tcPr>
-            <w:tcW w:type="dxa" w:w="1780"/>
+            <w:tcW w:type="dxa" w:w="1480"/>
             <w:tcBorders>
               <w:top w:val="single" w:color="CCCCCC" w:sz="1"/>
               <w:left w:val="single" w:color="CCCCCC" w:sz="1"/>
               <w:bottom w:val="single" w:color="CCCCCC" w:sz="1"/>
               <w:right w:val="single" w:color="CCCCCC" w:sz="1"/>
             </w:tcBorders>
-            <w:shd w:fill="FFFFFF" w:val="clear"/>
+            <w:shd w:fill="F5F5F5" w:val="clear"/>
             <w:tcMar>
               <w:top w:type="dxa" w:w="80"/>
               <w:left w:type="dxa" w:w="120"/>
@@ -958,18 +959,16 @@
             </w:r>
           </w:p>
         </w:tc>
-      </w:tr>
-      <w:tr>
-        <w:tc>
-          <w:tcPr>
-            <w:tcW w:type="dxa" w:w="2600"/>
+        <w:tc>
+          <w:tcPr>
+            <w:tcW w:type="dxa" w:w="1400"/>
             <w:tcBorders>
               <w:top w:val="single" w:color="CCCCCC" w:sz="1"/>
               <w:left w:val="single" w:color="CCCCCC" w:sz="1"/>
               <w:bottom w:val="single" w:color="CCCCCC" w:sz="1"/>
               <w:right w:val="single" w:color="CCCCCC" w:sz="1"/>
             </w:tcBorders>
-            <w:shd w:fill="F5F5F5" w:val="clear"/>
+            <w:shd w:fill="FFFFFF" w:val="clear"/>
             <w:tcMar>
               <w:top w:type="dxa" w:w="80"/>
               <w:left w:type="dxa" w:w="120"/>
@@ -979,29 +978,31 @@
           </w:tcPr>
           <w:p>
             <w:pPr>
-              <w:jc w:val="left"/>
-            </w:pPr>
-            <w:r>
-              <w:rPr>
-                <w:rFonts w:ascii="Arial" w:cs="Arial" w:eastAsia="Arial" w:hAnsi="Arial"/>
-                <w:color w:val="1A1A1A"/>
-                <w:sz w:val="20"/>
-                <w:szCs w:val="20"/>
-              </w:rPr>
-              <w:t xml:space="preserve">视觉识别与智能预警</w:t>
-            </w:r>
-          </w:p>
-        </w:tc>
-        <w:tc>
-          <w:tcPr>
-            <w:tcW w:type="dxa" w:w="3200"/>
+              <w:jc w:val="center"/>
+            </w:pPr>
+            <w:r>
+              <w:rPr>
+                <w:rFonts w:ascii="Arial" w:cs="Arial" w:eastAsia="Arial" w:hAnsi="Arial"/>
+                <w:color w:val="1A1A1A"/>
+                <w:sz w:val="20"/>
+                <w:szCs w:val="20"/>
+              </w:rPr>
+              <w:t xml:space="preserve">高 ★★★</w:t>
+            </w:r>
+          </w:p>
+        </w:tc>
+      </w:tr>
+      <w:tr>
+        <w:tc>
+          <w:tcPr>
+            <w:tcW w:type="dxa" w:w="2200"/>
             <w:tcBorders>
               <w:top w:val="single" w:color="CCCCCC" w:sz="1"/>
               <w:left w:val="single" w:color="CCCCCC" w:sz="1"/>
               <w:bottom w:val="single" w:color="CCCCCC" w:sz="1"/>
               <w:right w:val="single" w:color="CCCCCC" w:sz="1"/>
             </w:tcBorders>
-            <w:shd w:fill="F5F5F5" w:val="clear"/>
+            <w:shd w:fill="FFFFFF" w:val="clear"/>
             <w:tcMar>
               <w:top w:type="dxa" w:w="80"/>
               <w:left w:type="dxa" w:w="120"/>
@@ -1020,20 +1021,20 @@
                 <w:sz w:val="20"/>
                 <w:szCs w:val="20"/>
               </w:rPr>
-              <w:t xml:space="preserve">让摄像头从看见到看懂，自动预警</w:t>
-            </w:r>
-          </w:p>
-        </w:tc>
-        <w:tc>
-          <w:tcPr>
-            <w:tcW w:type="dxa" w:w="1780"/>
+              <w:t xml:space="preserve">AI 内容创作自动化</w:t>
+            </w:r>
+          </w:p>
+        </w:tc>
+        <w:tc>
+          <w:tcPr>
+            <w:tcW w:type="dxa" w:w="2800"/>
             <w:tcBorders>
               <w:top w:val="single" w:color="CCCCCC" w:sz="1"/>
               <w:left w:val="single" w:color="CCCCCC" w:sz="1"/>
               <w:bottom w:val="single" w:color="CCCCCC" w:sz="1"/>
               <w:right w:val="single" w:color="CCCCCC" w:sz="1"/>
             </w:tcBorders>
-            <w:shd w:fill="F5F5F5" w:val="clear"/>
+            <w:shd w:fill="FFFFFF" w:val="clear"/>
             <w:tcMar>
               <w:top w:type="dxa" w:w="80"/>
               <w:left w:type="dxa" w:w="120"/>
@@ -1043,29 +1044,29 @@
           </w:tcPr>
           <w:p>
             <w:pPr>
-              <w:jc w:val="center"/>
-            </w:pPr>
-            <w:r>
-              <w:rPr>
-                <w:rFonts w:ascii="Arial" w:cs="Arial" w:eastAsia="Arial" w:hAnsi="Arial"/>
-                <w:color w:val="1A1A1A"/>
-                <w:sz w:val="20"/>
-                <w:szCs w:val="20"/>
-              </w:rPr>
-              <w:t xml:space="preserve">规划中 / 可定制</w:t>
-            </w:r>
-          </w:p>
-        </w:tc>
-        <w:tc>
-          <w:tcPr>
-            <w:tcW w:type="dxa" w:w="1780"/>
+              <w:jc w:val="left"/>
+            </w:pPr>
+            <w:r>
+              <w:rPr>
+                <w:rFonts w:ascii="Arial" w:cs="Arial" w:eastAsia="Arial" w:hAnsi="Arial"/>
+                <w:color w:val="1A1A1A"/>
+                <w:sz w:val="20"/>
+                <w:szCs w:val="20"/>
+              </w:rPr>
+              <w:t xml:space="preserve">从需求到结构化内容，全程 AI 驱动</w:t>
+            </w:r>
+          </w:p>
+        </w:tc>
+        <w:tc>
+          <w:tcPr>
+            <w:tcW w:type="dxa" w:w="1480"/>
             <w:tcBorders>
               <w:top w:val="single" w:color="CCCCCC" w:sz="1"/>
               <w:left w:val="single" w:color="CCCCCC" w:sz="1"/>
               <w:bottom w:val="single" w:color="CCCCCC" w:sz="1"/>
               <w:right w:val="single" w:color="CCCCCC" w:sz="1"/>
             </w:tcBorders>
-            <w:shd w:fill="F5F5F5" w:val="clear"/>
+            <w:shd w:fill="FFFFFF" w:val="clear"/>
             <w:tcMar>
               <w:top w:type="dxa" w:w="80"/>
               <w:left w:type="dxa" w:w="120"/>
@@ -1084,15 +1085,13 @@
                 <w:sz w:val="20"/>
                 <w:szCs w:val="20"/>
               </w:rPr>
-              <w:t xml:space="preserve">★★★☆☆</w:t>
-            </w:r>
-          </w:p>
-        </w:tc>
-      </w:tr>
-      <w:tr>
-        <w:tc>
-          <w:tcPr>
-            <w:tcW w:type="dxa" w:w="2600"/>
+              <w:t xml:space="preserve">已有生产案例</w:t>
+            </w:r>
+          </w:p>
+        </w:tc>
+        <w:tc>
+          <w:tcPr>
+            <w:tcW w:type="dxa" w:w="1480"/>
             <w:tcBorders>
               <w:top w:val="single" w:color="CCCCCC" w:sz="1"/>
               <w:left w:val="single" w:color="CCCCCC" w:sz="1"/>
@@ -1109,22 +1108,22 @@
           </w:tcPr>
           <w:p>
             <w:pPr>
-              <w:jc w:val="left"/>
-            </w:pPr>
-            <w:r>
-              <w:rPr>
-                <w:rFonts w:ascii="Arial" w:cs="Arial" w:eastAsia="Arial" w:hAnsi="Arial"/>
-                <w:color w:val="1A1A1A"/>
-                <w:sz w:val="20"/>
-                <w:szCs w:val="20"/>
-              </w:rPr>
-              <w:t xml:space="preserve">智能客服 / 多轮对话</w:t>
-            </w:r>
-          </w:p>
-        </w:tc>
-        <w:tc>
-          <w:tcPr>
-            <w:tcW w:type="dxa" w:w="3200"/>
+              <w:jc w:val="center"/>
+            </w:pPr>
+            <w:r>
+              <w:rPr>
+                <w:rFonts w:ascii="Arial" w:cs="Arial" w:eastAsia="Arial" w:hAnsi="Arial"/>
+                <w:color w:val="1A1A1A"/>
+                <w:sz w:val="20"/>
+                <w:szCs w:val="20"/>
+              </w:rPr>
+              <w:t xml:space="preserve">★★★★☆</w:t>
+            </w:r>
+          </w:p>
+        </w:tc>
+        <w:tc>
+          <w:tcPr>
+            <w:tcW w:type="dxa" w:w="1400"/>
             <w:tcBorders>
               <w:top w:val="single" w:color="CCCCCC" w:sz="1"/>
               <w:left w:val="single" w:color="CCCCCC" w:sz="1"/>
@@ -1141,29 +1140,31 @@
           </w:tcPr>
           <w:p>
             <w:pPr>
-              <w:jc w:val="left"/>
-            </w:pPr>
-            <w:r>
-              <w:rPr>
-                <w:rFonts w:ascii="Arial" w:cs="Arial" w:eastAsia="Arial" w:hAnsi="Arial"/>
-                <w:color w:val="1A1A1A"/>
-                <w:sz w:val="20"/>
-                <w:szCs w:val="20"/>
-              </w:rPr>
-              <w:t xml:space="preserve">降低人工客服成本，提升响应质量</w:t>
-            </w:r>
-          </w:p>
-        </w:tc>
-        <w:tc>
-          <w:tcPr>
-            <w:tcW w:type="dxa" w:w="1780"/>
+              <w:jc w:val="center"/>
+            </w:pPr>
+            <w:r>
+              <w:rPr>
+                <w:rFonts w:ascii="Arial" w:cs="Arial" w:eastAsia="Arial" w:hAnsi="Arial"/>
+                <w:color w:val="1A1A1A"/>
+                <w:sz w:val="20"/>
+                <w:szCs w:val="20"/>
+              </w:rPr>
+              <w:t xml:space="preserve">中 ★★☆</w:t>
+            </w:r>
+          </w:p>
+        </w:tc>
+      </w:tr>
+      <w:tr>
+        <w:tc>
+          <w:tcPr>
+            <w:tcW w:type="dxa" w:w="2200"/>
             <w:tcBorders>
               <w:top w:val="single" w:color="CCCCCC" w:sz="1"/>
               <w:left w:val="single" w:color="CCCCCC" w:sz="1"/>
               <w:bottom w:val="single" w:color="CCCCCC" w:sz="1"/>
               <w:right w:val="single" w:color="CCCCCC" w:sz="1"/>
             </w:tcBorders>
-            <w:shd w:fill="FFFFFF" w:val="clear"/>
+            <w:shd w:fill="F5F5F5" w:val="clear"/>
             <w:tcMar>
               <w:top w:type="dxa" w:w="80"/>
               <w:left w:type="dxa" w:w="120"/>
@@ -1173,29 +1174,29 @@
           </w:tcPr>
           <w:p>
             <w:pPr>
-              <w:jc w:val="center"/>
-            </w:pPr>
-            <w:r>
-              <w:rPr>
-                <w:rFonts w:ascii="Arial" w:cs="Arial" w:eastAsia="Arial" w:hAnsi="Arial"/>
-                <w:color w:val="1A1A1A"/>
-                <w:sz w:val="20"/>
-                <w:szCs w:val="20"/>
-              </w:rPr>
-              <w:t xml:space="preserve">可交付</w:t>
-            </w:r>
-          </w:p>
-        </w:tc>
-        <w:tc>
-          <w:tcPr>
-            <w:tcW w:type="dxa" w:w="1780"/>
+              <w:jc w:val="left"/>
+            </w:pPr>
+            <w:r>
+              <w:rPr>
+                <w:rFonts w:ascii="Arial" w:cs="Arial" w:eastAsia="Arial" w:hAnsi="Arial"/>
+                <w:color w:val="1A1A1A"/>
+                <w:sz w:val="20"/>
+                <w:szCs w:val="20"/>
+              </w:rPr>
+              <w:t xml:space="preserve">视觉识别与智能预警</w:t>
+            </w:r>
+          </w:p>
+        </w:tc>
+        <w:tc>
+          <w:tcPr>
+            <w:tcW w:type="dxa" w:w="2800"/>
             <w:tcBorders>
               <w:top w:val="single" w:color="CCCCCC" w:sz="1"/>
               <w:left w:val="single" w:color="CCCCCC" w:sz="1"/>
               <w:bottom w:val="single" w:color="CCCCCC" w:sz="1"/>
               <w:right w:val="single" w:color="CCCCCC" w:sz="1"/>
             </w:tcBorders>
-            <w:shd w:fill="FFFFFF" w:val="clear"/>
+            <w:shd w:fill="F5F5F5" w:val="clear"/>
             <w:tcMar>
               <w:top w:type="dxa" w:w="80"/>
               <w:left w:type="dxa" w:w="120"/>
@@ -1205,31 +1206,29 @@
           </w:tcPr>
           <w:p>
             <w:pPr>
-              <w:jc w:val="center"/>
-            </w:pPr>
-            <w:r>
-              <w:rPr>
-                <w:rFonts w:ascii="Arial" w:cs="Arial" w:eastAsia="Arial" w:hAnsi="Arial"/>
-                <w:color w:val="1A1A1A"/>
-                <w:sz w:val="20"/>
-                <w:szCs w:val="20"/>
-              </w:rPr>
-              <w:t xml:space="preserve">★★★★★</w:t>
-            </w:r>
-          </w:p>
-        </w:tc>
-      </w:tr>
-      <w:tr>
-        <w:tc>
-          <w:tcPr>
-            <w:tcW w:type="dxa" w:w="2600"/>
+              <w:jc w:val="left"/>
+            </w:pPr>
+            <w:r>
+              <w:rPr>
+                <w:rFonts w:ascii="Arial" w:cs="Arial" w:eastAsia="Arial" w:hAnsi="Arial"/>
+                <w:color w:val="1A1A1A"/>
+                <w:sz w:val="20"/>
+                <w:szCs w:val="20"/>
+              </w:rPr>
+              <w:t xml:space="preserve">让摄像头从看见到看懂，自动预警</w:t>
+            </w:r>
+          </w:p>
+        </w:tc>
+        <w:tc>
+          <w:tcPr>
+            <w:tcW w:type="dxa" w:w="1480"/>
             <w:tcBorders>
               <w:top w:val="single" w:color="CCCCCC" w:sz="1"/>
               <w:left w:val="single" w:color="CCCCCC" w:sz="1"/>
               <w:bottom w:val="single" w:color="CCCCCC" w:sz="1"/>
               <w:right w:val="single" w:color="CCCCCC" w:sz="1"/>
             </w:tcBorders>
-            <w:shd w:fill="FFFFFF" w:val="clear"/>
+            <w:shd w:fill="F5F5F5" w:val="clear"/>
             <w:tcMar>
               <w:top w:type="dxa" w:w="80"/>
               <w:left w:type="dxa" w:w="120"/>
@@ -1239,29 +1238,29 @@
           </w:tcPr>
           <w:p>
             <w:pPr>
-              <w:jc w:val="left"/>
-            </w:pPr>
-            <w:r>
-              <w:rPr>
-                <w:rFonts w:ascii="Arial" w:cs="Arial" w:eastAsia="Arial" w:hAnsi="Arial"/>
-                <w:color w:val="1A1A1A"/>
-                <w:sz w:val="20"/>
-                <w:szCs w:val="20"/>
-              </w:rPr>
-              <w:t xml:space="preserve">招聘简历智能筛选</w:t>
-            </w:r>
-          </w:p>
-        </w:tc>
-        <w:tc>
-          <w:tcPr>
-            <w:tcW w:type="dxa" w:w="3200"/>
+              <w:jc w:val="center"/>
+            </w:pPr>
+            <w:r>
+              <w:rPr>
+                <w:rFonts w:ascii="Arial" w:cs="Arial" w:eastAsia="Arial" w:hAnsi="Arial"/>
+                <w:color w:val="1A1A1A"/>
+                <w:sz w:val="20"/>
+                <w:szCs w:val="20"/>
+              </w:rPr>
+              <w:t xml:space="preserve">规划中 / 可定制</w:t>
+            </w:r>
+          </w:p>
+        </w:tc>
+        <w:tc>
+          <w:tcPr>
+            <w:tcW w:type="dxa" w:w="1480"/>
             <w:tcBorders>
               <w:top w:val="single" w:color="CCCCCC" w:sz="1"/>
               <w:left w:val="single" w:color="CCCCCC" w:sz="1"/>
               <w:bottom w:val="single" w:color="CCCCCC" w:sz="1"/>
               <w:right w:val="single" w:color="CCCCCC" w:sz="1"/>
             </w:tcBorders>
-            <w:shd w:fill="FFFFFF" w:val="clear"/>
+            <w:shd w:fill="F5F5F5" w:val="clear"/>
             <w:tcMar>
               <w:top w:type="dxa" w:w="80"/>
               <w:left w:type="dxa" w:w="120"/>
@@ -1271,22 +1270,22 @@
           </w:tcPr>
           <w:p>
             <w:pPr>
-              <w:jc w:val="left"/>
-            </w:pPr>
-            <w:r>
-              <w:rPr>
-                <w:rFonts w:ascii="Arial" w:cs="Arial" w:eastAsia="Arial" w:hAnsi="Arial"/>
-                <w:color w:val="1A1A1A"/>
-                <w:sz w:val="20"/>
-                <w:szCs w:val="20"/>
-              </w:rPr>
-              <w:t xml:space="preserve">替代人工初筛，快速锁定最佳候选人</w:t>
-            </w:r>
-          </w:p>
-        </w:tc>
-        <w:tc>
-          <w:tcPr>
-            <w:tcW w:type="dxa" w:w="1780"/>
+              <w:jc w:val="center"/>
+            </w:pPr>
+            <w:r>
+              <w:rPr>
+                <w:rFonts w:ascii="Arial" w:cs="Arial" w:eastAsia="Arial" w:hAnsi="Arial"/>
+                <w:color w:val="1A1A1A"/>
+                <w:sz w:val="20"/>
+                <w:szCs w:val="20"/>
+              </w:rPr>
+              <w:t xml:space="preserve">★★★☆☆</w:t>
+            </w:r>
+          </w:p>
+        </w:tc>
+        <w:tc>
+          <w:tcPr>
+            <w:tcW w:type="dxa" w:w="1400"/>
             <w:tcBorders>
               <w:top w:val="single" w:color="CCCCCC" w:sz="1"/>
               <w:left w:val="single" w:color="CCCCCC" w:sz="1"/>
@@ -1312,13 +1311,15 @@
                 <w:sz w:val="20"/>
                 <w:szCs w:val="20"/>
               </w:rPr>
-              <w:t xml:space="preserve">可交付</w:t>
-            </w:r>
-          </w:p>
-        </w:tc>
-        <w:tc>
-          <w:tcPr>
-            <w:tcW w:type="dxa" w:w="1780"/>
+              <w:t xml:space="preserve">高 ★★★</w:t>
+            </w:r>
+          </w:p>
+        </w:tc>
+      </w:tr>
+      <w:tr>
+        <w:tc>
+          <w:tcPr>
+            <w:tcW w:type="dxa" w:w="2200"/>
             <w:tcBorders>
               <w:top w:val="single" w:color="CCCCCC" w:sz="1"/>
               <w:left w:val="single" w:color="CCCCCC" w:sz="1"/>
@@ -1335,24 +1336,22 @@
           </w:tcPr>
           <w:p>
             <w:pPr>
-              <w:jc w:val="center"/>
-            </w:pPr>
-            <w:r>
-              <w:rPr>
-                <w:rFonts w:ascii="Arial" w:cs="Arial" w:eastAsia="Arial" w:hAnsi="Arial"/>
-                <w:color w:val="1A1A1A"/>
-                <w:sz w:val="20"/>
-                <w:szCs w:val="20"/>
-              </w:rPr>
-              <w:t xml:space="preserve">★★★★☆</w:t>
-            </w:r>
-          </w:p>
-        </w:tc>
-      </w:tr>
-      <w:tr>
-        <w:tc>
-          <w:tcPr>
-            <w:tcW w:type="dxa" w:w="2600"/>
+              <w:jc w:val="left"/>
+            </w:pPr>
+            <w:r>
+              <w:rPr>
+                <w:rFonts w:ascii="Arial" w:cs="Arial" w:eastAsia="Arial" w:hAnsi="Arial"/>
+                <w:color w:val="1A1A1A"/>
+                <w:sz w:val="20"/>
+                <w:szCs w:val="20"/>
+              </w:rPr>
+              <w:t xml:space="preserve">智能客服 / 多轮对话</w:t>
+            </w:r>
+          </w:p>
+        </w:tc>
+        <w:tc>
+          <w:tcPr>
+            <w:tcW w:type="dxa" w:w="2800"/>
             <w:tcBorders>
               <w:top w:val="single" w:color="CCCCCC" w:sz="1"/>
               <w:left w:val="single" w:color="CCCCCC" w:sz="1"/>
@@ -1378,13 +1377,13 @@
                 <w:sz w:val="20"/>
                 <w:szCs w:val="20"/>
               </w:rPr>
-              <w:t xml:space="preserve">自然语言 Excel 分析</w:t>
-            </w:r>
-          </w:p>
-        </w:tc>
-        <w:tc>
-          <w:tcPr>
-            <w:tcW w:type="dxa" w:w="3200"/>
+              <w:t xml:space="preserve">降低人工客服成本，提升响应质量</w:t>
+            </w:r>
+          </w:p>
+        </w:tc>
+        <w:tc>
+          <w:tcPr>
+            <w:tcW w:type="dxa" w:w="1480"/>
             <w:tcBorders>
               <w:top w:val="single" w:color="CCCCCC" w:sz="1"/>
               <w:left w:val="single" w:color="CCCCCC" w:sz="1"/>
@@ -1401,22 +1400,22 @@
           </w:tcPr>
           <w:p>
             <w:pPr>
-              <w:jc w:val="left"/>
-            </w:pPr>
-            <w:r>
-              <w:rPr>
-                <w:rFonts w:ascii="Arial" w:cs="Arial" w:eastAsia="Arial" w:hAnsi="Arial"/>
-                <w:color w:val="1A1A1A"/>
-                <w:sz w:val="20"/>
-                <w:szCs w:val="20"/>
-              </w:rPr>
-              <w:t xml:space="preserve">不会数据分析也能问出结论</w:t>
-            </w:r>
-          </w:p>
-        </w:tc>
-        <w:tc>
-          <w:tcPr>
-            <w:tcW w:type="dxa" w:w="1780"/>
+              <w:jc w:val="center"/>
+            </w:pPr>
+            <w:r>
+              <w:rPr>
+                <w:rFonts w:ascii="Arial" w:cs="Arial" w:eastAsia="Arial" w:hAnsi="Arial"/>
+                <w:color w:val="1A1A1A"/>
+                <w:sz w:val="20"/>
+                <w:szCs w:val="20"/>
+              </w:rPr>
+              <w:t xml:space="preserve">可交付</w:t>
+            </w:r>
+          </w:p>
+        </w:tc>
+        <w:tc>
+          <w:tcPr>
+            <w:tcW w:type="dxa" w:w="1480"/>
             <w:tcBorders>
               <w:top w:val="single" w:color="CCCCCC" w:sz="1"/>
               <w:left w:val="single" w:color="CCCCCC" w:sz="1"/>
@@ -1442,13 +1441,13 @@
                 <w:sz w:val="20"/>
                 <w:szCs w:val="20"/>
               </w:rPr>
-              <w:t xml:space="preserve">可交付</w:t>
-            </w:r>
-          </w:p>
-        </w:tc>
-        <w:tc>
-          <w:tcPr>
-            <w:tcW w:type="dxa" w:w="1780"/>
+              <w:t xml:space="preserve">★★★★★</w:t>
+            </w:r>
+          </w:p>
+        </w:tc>
+        <w:tc>
+          <w:tcPr>
+            <w:tcW w:type="dxa" w:w="1400"/>
             <w:tcBorders>
               <w:top w:val="single" w:color="CCCCCC" w:sz="1"/>
               <w:left w:val="single" w:color="CCCCCC" w:sz="1"/>
@@ -1474,7 +1473,7 @@
                 <w:sz w:val="20"/>
                 <w:szCs w:val="20"/>
               </w:rPr>
-              <w:t xml:space="preserve">★★★★☆</w:t>
+              <w:t xml:space="preserve">中 ★★☆</w:t>
             </w:r>
           </w:p>
         </w:tc>
@@ -1482,7 +1481,7 @@
       <w:tr>
         <w:tc>
           <w:tcPr>
-            <w:tcW w:type="dxa" w:w="2600"/>
+            <w:tcW w:type="dxa" w:w="2200"/>
             <w:tcBorders>
               <w:top w:val="single" w:color="CCCCCC" w:sz="1"/>
               <w:left w:val="single" w:color="CCCCCC" w:sz="1"/>
@@ -1508,13 +1507,13 @@
                 <w:sz w:val="20"/>
                 <w:szCs w:val="20"/>
               </w:rPr>
-              <w:t xml:space="preserve">竞品 / 行业快速分析</w:t>
-            </w:r>
-          </w:p>
-        </w:tc>
-        <w:tc>
-          <w:tcPr>
-            <w:tcW w:type="dxa" w:w="3200"/>
+              <w:t xml:space="preserve">招聘简历智能筛选</w:t>
+            </w:r>
+          </w:p>
+        </w:tc>
+        <w:tc>
+          <w:tcPr>
+            <w:tcW w:type="dxa" w:w="2800"/>
             <w:tcBorders>
               <w:top w:val="single" w:color="CCCCCC" w:sz="1"/>
               <w:left w:val="single" w:color="CCCCCC" w:sz="1"/>
@@ -1540,13 +1539,13 @@
                 <w:sz w:val="20"/>
                 <w:szCs w:val="20"/>
               </w:rPr>
-              <w:t xml:space="preserve">输入资料，分钟级输出结构化竞品报告</w:t>
-            </w:r>
-          </w:p>
-        </w:tc>
-        <w:tc>
-          <w:tcPr>
-            <w:tcW w:type="dxa" w:w="1780"/>
+              <w:t xml:space="preserve">替代人工初筛，快速锁定最佳候选人</w:t>
+            </w:r>
+          </w:p>
+        </w:tc>
+        <w:tc>
+          <w:tcPr>
+            <w:tcW w:type="dxa" w:w="1480"/>
             <w:tcBorders>
               <w:top w:val="single" w:color="CCCCCC" w:sz="1"/>
               <w:left w:val="single" w:color="CCCCCC" w:sz="1"/>
@@ -1578,7 +1577,7 @@
         </w:tc>
         <w:tc>
           <w:tcPr>
-            <w:tcW w:type="dxa" w:w="1780"/>
+            <w:tcW w:type="dxa" w:w="1480"/>
             <w:tcBorders>
               <w:top w:val="single" w:color="CCCCCC" w:sz="1"/>
               <w:left w:val="single" w:color="CCCCCC" w:sz="1"/>
@@ -1608,11 +1607,9 @@
             </w:r>
           </w:p>
         </w:tc>
-      </w:tr>
-      <w:tr>
-        <w:tc>
-          <w:tcPr>
-            <w:tcW w:type="dxa" w:w="2600"/>
+        <w:tc>
+          <w:tcPr>
+            <w:tcW w:type="dxa" w:w="1400"/>
             <w:tcBorders>
               <w:top w:val="single" w:color="CCCCCC" w:sz="1"/>
               <w:left w:val="single" w:color="CCCCCC" w:sz="1"/>
@@ -1629,22 +1626,24 @@
           </w:tcPr>
           <w:p>
             <w:pPr>
-              <w:jc w:val="left"/>
-            </w:pPr>
-            <w:r>
-              <w:rPr>
-                <w:rFonts w:ascii="Arial" w:cs="Arial" w:eastAsia="Arial" w:hAnsi="Arial"/>
-                <w:color w:val="1A1A1A"/>
-                <w:sz w:val="20"/>
-                <w:szCs w:val="20"/>
-              </w:rPr>
-              <w:t xml:space="preserve">客户画像自动生成</w:t>
-            </w:r>
-          </w:p>
-        </w:tc>
-        <w:tc>
-          <w:tcPr>
-            <w:tcW w:type="dxa" w:w="3200"/>
+              <w:jc w:val="center"/>
+            </w:pPr>
+            <w:r>
+              <w:rPr>
+                <w:rFonts w:ascii="Arial" w:cs="Arial" w:eastAsia="Arial" w:hAnsi="Arial"/>
+                <w:color w:val="1A1A1A"/>
+                <w:sz w:val="20"/>
+                <w:szCs w:val="20"/>
+              </w:rPr>
+              <w:t xml:space="preserve">中 ★★☆</w:t>
+            </w:r>
+          </w:p>
+        </w:tc>
+      </w:tr>
+      <w:tr>
+        <w:tc>
+          <w:tcPr>
+            <w:tcW w:type="dxa" w:w="2200"/>
             <w:tcBorders>
               <w:top w:val="single" w:color="CCCCCC" w:sz="1"/>
               <w:left w:val="single" w:color="CCCCCC" w:sz="1"/>
@@ -1670,13 +1669,13 @@
                 <w:sz w:val="20"/>
                 <w:szCs w:val="20"/>
               </w:rPr>
-              <w:t xml:space="preserve">从对话和行为数据中自动提炼客户洞察</w:t>
-            </w:r>
-          </w:p>
-        </w:tc>
-        <w:tc>
-          <w:tcPr>
-            <w:tcW w:type="dxa" w:w="1780"/>
+              <w:t xml:space="preserve">自然语言 Excel 分析</w:t>
+            </w:r>
+          </w:p>
+        </w:tc>
+        <w:tc>
+          <w:tcPr>
+            <w:tcW w:type="dxa" w:w="2800"/>
             <w:tcBorders>
               <w:top w:val="single" w:color="CCCCCC" w:sz="1"/>
               <w:left w:val="single" w:color="CCCCCC" w:sz="1"/>
@@ -1693,22 +1692,22 @@
           </w:tcPr>
           <w:p>
             <w:pPr>
-              <w:jc w:val="center"/>
-            </w:pPr>
-            <w:r>
-              <w:rPr>
-                <w:rFonts w:ascii="Arial" w:cs="Arial" w:eastAsia="Arial" w:hAnsi="Arial"/>
-                <w:color w:val="1A1A1A"/>
-                <w:sz w:val="20"/>
-                <w:szCs w:val="20"/>
-              </w:rPr>
-              <w:t xml:space="preserve">可交付</w:t>
-            </w:r>
-          </w:p>
-        </w:tc>
-        <w:tc>
-          <w:tcPr>
-            <w:tcW w:type="dxa" w:w="1780"/>
+              <w:jc w:val="left"/>
+            </w:pPr>
+            <w:r>
+              <w:rPr>
+                <w:rFonts w:ascii="Arial" w:cs="Arial" w:eastAsia="Arial" w:hAnsi="Arial"/>
+                <w:color w:val="1A1A1A"/>
+                <w:sz w:val="20"/>
+                <w:szCs w:val="20"/>
+              </w:rPr>
+              <w:t xml:space="preserve">不会数据分析也能问出结论</w:t>
+            </w:r>
+          </w:p>
+        </w:tc>
+        <w:tc>
+          <w:tcPr>
+            <w:tcW w:type="dxa" w:w="1480"/>
             <w:tcBorders>
               <w:top w:val="single" w:color="CCCCCC" w:sz="1"/>
               <w:left w:val="single" w:color="CCCCCC" w:sz="1"/>
@@ -1734,15 +1733,13 @@
                 <w:sz w:val="20"/>
                 <w:szCs w:val="20"/>
               </w:rPr>
-              <w:t xml:space="preserve">★★★★☆</w:t>
-            </w:r>
-          </w:p>
-        </w:tc>
-      </w:tr>
-      <w:tr>
-        <w:tc>
-          <w:tcPr>
-            <w:tcW w:type="dxa" w:w="2600"/>
+              <w:t xml:space="preserve">可交付</w:t>
+            </w:r>
+          </w:p>
+        </w:tc>
+        <w:tc>
+          <w:tcPr>
+            <w:tcW w:type="dxa" w:w="1480"/>
             <w:tcBorders>
               <w:top w:val="single" w:color="CCCCCC" w:sz="1"/>
               <w:left w:val="single" w:color="CCCCCC" w:sz="1"/>
@@ -1759,22 +1756,22 @@
           </w:tcPr>
           <w:p>
             <w:pPr>
-              <w:jc w:val="left"/>
-            </w:pPr>
-            <w:r>
-              <w:rPr>
-                <w:rFonts w:ascii="Arial" w:cs="Arial" w:eastAsia="Arial" w:hAnsi="Arial"/>
-                <w:color w:val="1A1A1A"/>
-                <w:sz w:val="20"/>
-                <w:szCs w:val="20"/>
-              </w:rPr>
-              <w:t xml:space="preserve">AI 培训题库生成</w:t>
-            </w:r>
-          </w:p>
-        </w:tc>
-        <w:tc>
-          <w:tcPr>
-            <w:tcW w:type="dxa" w:w="3200"/>
+              <w:jc w:val="center"/>
+            </w:pPr>
+            <w:r>
+              <w:rPr>
+                <w:rFonts w:ascii="Arial" w:cs="Arial" w:eastAsia="Arial" w:hAnsi="Arial"/>
+                <w:color w:val="1A1A1A"/>
+                <w:sz w:val="20"/>
+                <w:szCs w:val="20"/>
+              </w:rPr>
+              <w:t xml:space="preserve">★★★★☆</w:t>
+            </w:r>
+          </w:p>
+        </w:tc>
+        <w:tc>
+          <w:tcPr>
+            <w:tcW w:type="dxa" w:w="1400"/>
             <w:tcBorders>
               <w:top w:val="single" w:color="CCCCCC" w:sz="1"/>
               <w:left w:val="single" w:color="CCCCCC" w:sz="1"/>
@@ -1791,22 +1788,24 @@
           </w:tcPr>
           <w:p>
             <w:pPr>
-              <w:jc w:val="left"/>
-            </w:pPr>
-            <w:r>
-              <w:rPr>
-                <w:rFonts w:ascii="Arial" w:cs="Arial" w:eastAsia="Arial" w:hAnsi="Arial"/>
-                <w:color w:val="1A1A1A"/>
-                <w:sz w:val="20"/>
-                <w:szCs w:val="20"/>
-              </w:rPr>
-              <w:t xml:space="preserve">上传材料，自动生成覆盖全面的考题和练习</w:t>
-            </w:r>
-          </w:p>
-        </w:tc>
-        <w:tc>
-          <w:tcPr>
-            <w:tcW w:type="dxa" w:w="1780"/>
+              <w:jc w:val="center"/>
+            </w:pPr>
+            <w:r>
+              <w:rPr>
+                <w:rFonts w:ascii="Arial" w:cs="Arial" w:eastAsia="Arial" w:hAnsi="Arial"/>
+                <w:color w:val="1A1A1A"/>
+                <w:sz w:val="20"/>
+                <w:szCs w:val="20"/>
+              </w:rPr>
+              <w:t xml:space="preserve">中 ★★☆</w:t>
+            </w:r>
+          </w:p>
+        </w:tc>
+      </w:tr>
+      <w:tr>
+        <w:tc>
+          <w:tcPr>
+            <w:tcW w:type="dxa" w:w="2200"/>
             <w:tcBorders>
               <w:top w:val="single" w:color="CCCCCC" w:sz="1"/>
               <w:left w:val="single" w:color="CCCCCC" w:sz="1"/>
@@ -1823,22 +1822,22 @@
           </w:tcPr>
           <w:p>
             <w:pPr>
-              <w:jc w:val="center"/>
-            </w:pPr>
-            <w:r>
-              <w:rPr>
-                <w:rFonts w:ascii="Arial" w:cs="Arial" w:eastAsia="Arial" w:hAnsi="Arial"/>
-                <w:color w:val="1A1A1A"/>
-                <w:sz w:val="20"/>
-                <w:szCs w:val="20"/>
-              </w:rPr>
-              <w:t xml:space="preserve">可交付</w:t>
-            </w:r>
-          </w:p>
-        </w:tc>
-        <w:tc>
-          <w:tcPr>
-            <w:tcW w:type="dxa" w:w="1780"/>
+              <w:jc w:val="left"/>
+            </w:pPr>
+            <w:r>
+              <w:rPr>
+                <w:rFonts w:ascii="Arial" w:cs="Arial" w:eastAsia="Arial" w:hAnsi="Arial"/>
+                <w:color w:val="1A1A1A"/>
+                <w:sz w:val="20"/>
+                <w:szCs w:val="20"/>
+              </w:rPr>
+              <w:t xml:space="preserve">竞品 / 行业快速分析</w:t>
+            </w:r>
+          </w:p>
+        </w:tc>
+        <w:tc>
+          <w:tcPr>
+            <w:tcW w:type="dxa" w:w="2800"/>
             <w:tcBorders>
               <w:top w:val="single" w:color="CCCCCC" w:sz="1"/>
               <w:left w:val="single" w:color="CCCCCC" w:sz="1"/>
@@ -1855,24 +1854,22 @@
           </w:tcPr>
           <w:p>
             <w:pPr>
-              <w:jc w:val="center"/>
-            </w:pPr>
-            <w:r>
-              <w:rPr>
-                <w:rFonts w:ascii="Arial" w:cs="Arial" w:eastAsia="Arial" w:hAnsi="Arial"/>
-                <w:color w:val="1A1A1A"/>
-                <w:sz w:val="20"/>
-                <w:szCs w:val="20"/>
-              </w:rPr>
-              <w:t xml:space="preserve">★★★★☆</w:t>
-            </w:r>
-          </w:p>
-        </w:tc>
-      </w:tr>
-      <w:tr>
-        <w:tc>
-          <w:tcPr>
-            <w:tcW w:type="dxa" w:w="2600"/>
+              <w:jc w:val="left"/>
+            </w:pPr>
+            <w:r>
+              <w:rPr>
+                <w:rFonts w:ascii="Arial" w:cs="Arial" w:eastAsia="Arial" w:hAnsi="Arial"/>
+                <w:color w:val="1A1A1A"/>
+                <w:sz w:val="20"/>
+                <w:szCs w:val="20"/>
+              </w:rPr>
+              <w:t xml:space="preserve">输入资料，分钟级输出结构化竞品报告</w:t>
+            </w:r>
+          </w:p>
+        </w:tc>
+        <w:tc>
+          <w:tcPr>
+            <w:tcW w:type="dxa" w:w="1480"/>
             <w:tcBorders>
               <w:top w:val="single" w:color="CCCCCC" w:sz="1"/>
               <w:left w:val="single" w:color="CCCCCC" w:sz="1"/>
@@ -1889,22 +1886,22 @@
           </w:tcPr>
           <w:p>
             <w:pPr>
-              <w:jc w:val="left"/>
-            </w:pPr>
-            <w:r>
-              <w:rPr>
-                <w:rFonts w:ascii="Arial" w:cs="Arial" w:eastAsia="Arial" w:hAnsi="Arial"/>
-                <w:color w:val="1A1A1A"/>
-                <w:sz w:val="20"/>
-                <w:szCs w:val="20"/>
-              </w:rPr>
-              <w:t xml:space="preserve">AI 文本摘要与总结</w:t>
-            </w:r>
-          </w:p>
-        </w:tc>
-        <w:tc>
-          <w:tcPr>
-            <w:tcW w:type="dxa" w:w="3200"/>
+              <w:jc w:val="center"/>
+            </w:pPr>
+            <w:r>
+              <w:rPr>
+                <w:rFonts w:ascii="Arial" w:cs="Arial" w:eastAsia="Arial" w:hAnsi="Arial"/>
+                <w:color w:val="1A1A1A"/>
+                <w:sz w:val="20"/>
+                <w:szCs w:val="20"/>
+              </w:rPr>
+              <w:t xml:space="preserve">可交付</w:t>
+            </w:r>
+          </w:p>
+        </w:tc>
+        <w:tc>
+          <w:tcPr>
+            <w:tcW w:type="dxa" w:w="1480"/>
             <w:tcBorders>
               <w:top w:val="single" w:color="CCCCCC" w:sz="1"/>
               <w:left w:val="single" w:color="CCCCCC" w:sz="1"/>
@@ -1921,22 +1918,22 @@
           </w:tcPr>
           <w:p>
             <w:pPr>
-              <w:jc w:val="left"/>
-            </w:pPr>
-            <w:r>
-              <w:rPr>
-                <w:rFonts w:ascii="Arial" w:cs="Arial" w:eastAsia="Arial" w:hAnsi="Arial"/>
-                <w:color w:val="1A1A1A"/>
-                <w:sz w:val="20"/>
-                <w:szCs w:val="20"/>
-              </w:rPr>
-              <w:t xml:space="preserve">长文档秒变精华，关键信息不遗漏</w:t>
-            </w:r>
-          </w:p>
-        </w:tc>
-        <w:tc>
-          <w:tcPr>
-            <w:tcW w:type="dxa" w:w="1780"/>
+              <w:jc w:val="center"/>
+            </w:pPr>
+            <w:r>
+              <w:rPr>
+                <w:rFonts w:ascii="Arial" w:cs="Arial" w:eastAsia="Arial" w:hAnsi="Arial"/>
+                <w:color w:val="1A1A1A"/>
+                <w:sz w:val="20"/>
+                <w:szCs w:val="20"/>
+              </w:rPr>
+              <w:t xml:space="preserve">★★★★☆</w:t>
+            </w:r>
+          </w:p>
+        </w:tc>
+        <w:tc>
+          <w:tcPr>
+            <w:tcW w:type="dxa" w:w="1400"/>
             <w:tcBorders>
               <w:top w:val="single" w:color="CCCCCC" w:sz="1"/>
               <w:left w:val="single" w:color="CCCCCC" w:sz="1"/>
@@ -1962,13 +1959,15 @@
                 <w:sz w:val="20"/>
                 <w:szCs w:val="20"/>
               </w:rPr>
-              <w:t xml:space="preserve">可交付</w:t>
-            </w:r>
-          </w:p>
-        </w:tc>
-        <w:tc>
-          <w:tcPr>
-            <w:tcW w:type="dxa" w:w="1780"/>
+              <w:t xml:space="preserve">低 ★☆☆</w:t>
+            </w:r>
+          </w:p>
+        </w:tc>
+      </w:tr>
+      <w:tr>
+        <w:tc>
+          <w:tcPr>
+            <w:tcW w:type="dxa" w:w="2200"/>
             <w:tcBorders>
               <w:top w:val="single" w:color="CCCCCC" w:sz="1"/>
               <w:left w:val="single" w:color="CCCCCC" w:sz="1"/>
@@ -1985,6 +1984,70 @@
           </w:tcPr>
           <w:p>
             <w:pPr>
+              <w:jc w:val="left"/>
+            </w:pPr>
+            <w:r>
+              <w:rPr>
+                <w:rFonts w:ascii="Arial" w:cs="Arial" w:eastAsia="Arial" w:hAnsi="Arial"/>
+                <w:color w:val="1A1A1A"/>
+                <w:sz w:val="20"/>
+                <w:szCs w:val="20"/>
+              </w:rPr>
+              <w:t xml:space="preserve">客户画像自动生成</w:t>
+            </w:r>
+          </w:p>
+        </w:tc>
+        <w:tc>
+          <w:tcPr>
+            <w:tcW w:type="dxa" w:w="2800"/>
+            <w:tcBorders>
+              <w:top w:val="single" w:color="CCCCCC" w:sz="1"/>
+              <w:left w:val="single" w:color="CCCCCC" w:sz="1"/>
+              <w:bottom w:val="single" w:color="CCCCCC" w:sz="1"/>
+              <w:right w:val="single" w:color="CCCCCC" w:sz="1"/>
+            </w:tcBorders>
+            <w:shd w:fill="FFFFFF" w:val="clear"/>
+            <w:tcMar>
+              <w:top w:type="dxa" w:w="80"/>
+              <w:left w:type="dxa" w:w="120"/>
+              <w:bottom w:type="dxa" w:w="80"/>
+              <w:right w:type="dxa" w:w="120"/>
+            </w:tcMar>
+          </w:tcPr>
+          <w:p>
+            <w:pPr>
+              <w:jc w:val="left"/>
+            </w:pPr>
+            <w:r>
+              <w:rPr>
+                <w:rFonts w:ascii="Arial" w:cs="Arial" w:eastAsia="Arial" w:hAnsi="Arial"/>
+                <w:color w:val="1A1A1A"/>
+                <w:sz w:val="20"/>
+                <w:szCs w:val="20"/>
+              </w:rPr>
+              <w:t xml:space="preserve">从对话和行为数据中自动提炼客户洞察</w:t>
+            </w:r>
+          </w:p>
+        </w:tc>
+        <w:tc>
+          <w:tcPr>
+            <w:tcW w:type="dxa" w:w="1480"/>
+            <w:tcBorders>
+              <w:top w:val="single" w:color="CCCCCC" w:sz="1"/>
+              <w:left w:val="single" w:color="CCCCCC" w:sz="1"/>
+              <w:bottom w:val="single" w:color="CCCCCC" w:sz="1"/>
+              <w:right w:val="single" w:color="CCCCCC" w:sz="1"/>
+            </w:tcBorders>
+            <w:shd w:fill="FFFFFF" w:val="clear"/>
+            <w:tcMar>
+              <w:top w:type="dxa" w:w="80"/>
+              <w:left w:type="dxa" w:w="120"/>
+              <w:bottom w:type="dxa" w:w="80"/>
+              <w:right w:type="dxa" w:w="120"/>
+            </w:tcMar>
+          </w:tcPr>
+          <w:p>
+            <w:pPr>
               <w:jc w:val="center"/>
             </w:pPr>
             <w:r>
@@ -1994,7 +2057,395 @@
                 <w:sz w:val="20"/>
                 <w:szCs w:val="20"/>
               </w:rPr>
+              <w:t xml:space="preserve">可交付</w:t>
+            </w:r>
+          </w:p>
+        </w:tc>
+        <w:tc>
+          <w:tcPr>
+            <w:tcW w:type="dxa" w:w="1480"/>
+            <w:tcBorders>
+              <w:top w:val="single" w:color="CCCCCC" w:sz="1"/>
+              <w:left w:val="single" w:color="CCCCCC" w:sz="1"/>
+              <w:bottom w:val="single" w:color="CCCCCC" w:sz="1"/>
+              <w:right w:val="single" w:color="CCCCCC" w:sz="1"/>
+            </w:tcBorders>
+            <w:shd w:fill="FFFFFF" w:val="clear"/>
+            <w:tcMar>
+              <w:top w:type="dxa" w:w="80"/>
+              <w:left w:type="dxa" w:w="120"/>
+              <w:bottom w:type="dxa" w:w="80"/>
+              <w:right w:type="dxa" w:w="120"/>
+            </w:tcMar>
+          </w:tcPr>
+          <w:p>
+            <w:pPr>
+              <w:jc w:val="center"/>
+            </w:pPr>
+            <w:r>
+              <w:rPr>
+                <w:rFonts w:ascii="Arial" w:cs="Arial" w:eastAsia="Arial" w:hAnsi="Arial"/>
+                <w:color w:val="1A1A1A"/>
+                <w:sz w:val="20"/>
+                <w:szCs w:val="20"/>
+              </w:rPr>
               <w:t xml:space="preserve">★★★★☆</w:t>
+            </w:r>
+          </w:p>
+        </w:tc>
+        <w:tc>
+          <w:tcPr>
+            <w:tcW w:type="dxa" w:w="1400"/>
+            <w:tcBorders>
+              <w:top w:val="single" w:color="CCCCCC" w:sz="1"/>
+              <w:left w:val="single" w:color="CCCCCC" w:sz="1"/>
+              <w:bottom w:val="single" w:color="CCCCCC" w:sz="1"/>
+              <w:right w:val="single" w:color="CCCCCC" w:sz="1"/>
+            </w:tcBorders>
+            <w:shd w:fill="FFFFFF" w:val="clear"/>
+            <w:tcMar>
+              <w:top w:type="dxa" w:w="80"/>
+              <w:left w:type="dxa" w:w="120"/>
+              <w:bottom w:type="dxa" w:w="80"/>
+              <w:right w:type="dxa" w:w="120"/>
+            </w:tcMar>
+          </w:tcPr>
+          <w:p>
+            <w:pPr>
+              <w:jc w:val="center"/>
+            </w:pPr>
+            <w:r>
+              <w:rPr>
+                <w:rFonts w:ascii="Arial" w:cs="Arial" w:eastAsia="Arial" w:hAnsi="Arial"/>
+                <w:color w:val="1A1A1A"/>
+                <w:sz w:val="20"/>
+                <w:szCs w:val="20"/>
+              </w:rPr>
+              <w:t xml:space="preserve">中 ★★☆</w:t>
+            </w:r>
+          </w:p>
+        </w:tc>
+      </w:tr>
+      <w:tr>
+        <w:tc>
+          <w:tcPr>
+            <w:tcW w:type="dxa" w:w="2200"/>
+            <w:tcBorders>
+              <w:top w:val="single" w:color="CCCCCC" w:sz="1"/>
+              <w:left w:val="single" w:color="CCCCCC" w:sz="1"/>
+              <w:bottom w:val="single" w:color="CCCCCC" w:sz="1"/>
+              <w:right w:val="single" w:color="CCCCCC" w:sz="1"/>
+            </w:tcBorders>
+            <w:shd w:fill="FFFFFF" w:val="clear"/>
+            <w:tcMar>
+              <w:top w:type="dxa" w:w="80"/>
+              <w:left w:type="dxa" w:w="120"/>
+              <w:bottom w:type="dxa" w:w="80"/>
+              <w:right w:type="dxa" w:w="120"/>
+            </w:tcMar>
+          </w:tcPr>
+          <w:p>
+            <w:pPr>
+              <w:jc w:val="left"/>
+            </w:pPr>
+            <w:r>
+              <w:rPr>
+                <w:rFonts w:ascii="Arial" w:cs="Arial" w:eastAsia="Arial" w:hAnsi="Arial"/>
+                <w:color w:val="1A1A1A"/>
+                <w:sz w:val="20"/>
+                <w:szCs w:val="20"/>
+              </w:rPr>
+              <w:t xml:space="preserve">AI 培训题库生成</w:t>
+            </w:r>
+          </w:p>
+        </w:tc>
+        <w:tc>
+          <w:tcPr>
+            <w:tcW w:type="dxa" w:w="2800"/>
+            <w:tcBorders>
+              <w:top w:val="single" w:color="CCCCCC" w:sz="1"/>
+              <w:left w:val="single" w:color="CCCCCC" w:sz="1"/>
+              <w:bottom w:val="single" w:color="CCCCCC" w:sz="1"/>
+              <w:right w:val="single" w:color="CCCCCC" w:sz="1"/>
+            </w:tcBorders>
+            <w:shd w:fill="FFFFFF" w:val="clear"/>
+            <w:tcMar>
+              <w:top w:type="dxa" w:w="80"/>
+              <w:left w:type="dxa" w:w="120"/>
+              <w:bottom w:type="dxa" w:w="80"/>
+              <w:right w:type="dxa" w:w="120"/>
+            </w:tcMar>
+          </w:tcPr>
+          <w:p>
+            <w:pPr>
+              <w:jc w:val="left"/>
+            </w:pPr>
+            <w:r>
+              <w:rPr>
+                <w:rFonts w:ascii="Arial" w:cs="Arial" w:eastAsia="Arial" w:hAnsi="Arial"/>
+                <w:color w:val="1A1A1A"/>
+                <w:sz w:val="20"/>
+                <w:szCs w:val="20"/>
+              </w:rPr>
+              <w:t xml:space="preserve">上传材料，自动生成覆盖全面的考题和练习</w:t>
+            </w:r>
+          </w:p>
+        </w:tc>
+        <w:tc>
+          <w:tcPr>
+            <w:tcW w:type="dxa" w:w="1480"/>
+            <w:tcBorders>
+              <w:top w:val="single" w:color="CCCCCC" w:sz="1"/>
+              <w:left w:val="single" w:color="CCCCCC" w:sz="1"/>
+              <w:bottom w:val="single" w:color="CCCCCC" w:sz="1"/>
+              <w:right w:val="single" w:color="CCCCCC" w:sz="1"/>
+            </w:tcBorders>
+            <w:shd w:fill="FFFFFF" w:val="clear"/>
+            <w:tcMar>
+              <w:top w:type="dxa" w:w="80"/>
+              <w:left w:type="dxa" w:w="120"/>
+              <w:bottom w:type="dxa" w:w="80"/>
+              <w:right w:type="dxa" w:w="120"/>
+            </w:tcMar>
+          </w:tcPr>
+          <w:p>
+            <w:pPr>
+              <w:jc w:val="center"/>
+            </w:pPr>
+            <w:r>
+              <w:rPr>
+                <w:rFonts w:ascii="Arial" w:cs="Arial" w:eastAsia="Arial" w:hAnsi="Arial"/>
+                <w:color w:val="1A1A1A"/>
+                <w:sz w:val="20"/>
+                <w:szCs w:val="20"/>
+              </w:rPr>
+              <w:t xml:space="preserve">可交付</w:t>
+            </w:r>
+          </w:p>
+        </w:tc>
+        <w:tc>
+          <w:tcPr>
+            <w:tcW w:type="dxa" w:w="1480"/>
+            <w:tcBorders>
+              <w:top w:val="single" w:color="CCCCCC" w:sz="1"/>
+              <w:left w:val="single" w:color="CCCCCC" w:sz="1"/>
+              <w:bottom w:val="single" w:color="CCCCCC" w:sz="1"/>
+              <w:right w:val="single" w:color="CCCCCC" w:sz="1"/>
+            </w:tcBorders>
+            <w:shd w:fill="FFFFFF" w:val="clear"/>
+            <w:tcMar>
+              <w:top w:type="dxa" w:w="80"/>
+              <w:left w:type="dxa" w:w="120"/>
+              <w:bottom w:type="dxa" w:w="80"/>
+              <w:right w:type="dxa" w:w="120"/>
+            </w:tcMar>
+          </w:tcPr>
+          <w:p>
+            <w:pPr>
+              <w:jc w:val="center"/>
+            </w:pPr>
+            <w:r>
+              <w:rPr>
+                <w:rFonts w:ascii="Arial" w:cs="Arial" w:eastAsia="Arial" w:hAnsi="Arial"/>
+                <w:color w:val="1A1A1A"/>
+                <w:sz w:val="20"/>
+                <w:szCs w:val="20"/>
+              </w:rPr>
+              <w:t xml:space="preserve">★★★★☆</w:t>
+            </w:r>
+          </w:p>
+        </w:tc>
+        <w:tc>
+          <w:tcPr>
+            <w:tcW w:type="dxa" w:w="1400"/>
+            <w:tcBorders>
+              <w:top w:val="single" w:color="CCCCCC" w:sz="1"/>
+              <w:left w:val="single" w:color="CCCCCC" w:sz="1"/>
+              <w:bottom w:val="single" w:color="CCCCCC" w:sz="1"/>
+              <w:right w:val="single" w:color="CCCCCC" w:sz="1"/>
+            </w:tcBorders>
+            <w:shd w:fill="FFFFFF" w:val="clear"/>
+            <w:tcMar>
+              <w:top w:type="dxa" w:w="80"/>
+              <w:left w:type="dxa" w:w="120"/>
+              <w:bottom w:type="dxa" w:w="80"/>
+              <w:right w:type="dxa" w:w="120"/>
+            </w:tcMar>
+          </w:tcPr>
+          <w:p>
+            <w:pPr>
+              <w:jc w:val="center"/>
+            </w:pPr>
+            <w:r>
+              <w:rPr>
+                <w:rFonts w:ascii="Arial" w:cs="Arial" w:eastAsia="Arial" w:hAnsi="Arial"/>
+                <w:color w:val="1A1A1A"/>
+                <w:sz w:val="20"/>
+                <w:szCs w:val="20"/>
+              </w:rPr>
+              <w:t xml:space="preserve">低 ★☆☆</w:t>
+            </w:r>
+          </w:p>
+        </w:tc>
+      </w:tr>
+      <w:tr>
+        <w:tc>
+          <w:tcPr>
+            <w:tcW w:type="dxa" w:w="2200"/>
+            <w:tcBorders>
+              <w:top w:val="single" w:color="CCCCCC" w:sz="1"/>
+              <w:left w:val="single" w:color="CCCCCC" w:sz="1"/>
+              <w:bottom w:val="single" w:color="CCCCCC" w:sz="1"/>
+              <w:right w:val="single" w:color="CCCCCC" w:sz="1"/>
+            </w:tcBorders>
+            <w:shd w:fill="FFFFFF" w:val="clear"/>
+            <w:tcMar>
+              <w:top w:type="dxa" w:w="80"/>
+              <w:left w:type="dxa" w:w="120"/>
+              <w:bottom w:type="dxa" w:w="80"/>
+              <w:right w:type="dxa" w:w="120"/>
+            </w:tcMar>
+          </w:tcPr>
+          <w:p>
+            <w:pPr>
+              <w:jc w:val="left"/>
+            </w:pPr>
+            <w:r>
+              <w:rPr>
+                <w:rFonts w:ascii="Arial" w:cs="Arial" w:eastAsia="Arial" w:hAnsi="Arial"/>
+                <w:color w:val="1A1A1A"/>
+                <w:sz w:val="20"/>
+                <w:szCs w:val="20"/>
+              </w:rPr>
+              <w:t xml:space="preserve">AI 文本摘要与总结</w:t>
+            </w:r>
+          </w:p>
+        </w:tc>
+        <w:tc>
+          <w:tcPr>
+            <w:tcW w:type="dxa" w:w="2800"/>
+            <w:tcBorders>
+              <w:top w:val="single" w:color="CCCCCC" w:sz="1"/>
+              <w:left w:val="single" w:color="CCCCCC" w:sz="1"/>
+              <w:bottom w:val="single" w:color="CCCCCC" w:sz="1"/>
+              <w:right w:val="single" w:color="CCCCCC" w:sz="1"/>
+            </w:tcBorders>
+            <w:shd w:fill="FFFFFF" w:val="clear"/>
+            <w:tcMar>
+              <w:top w:type="dxa" w:w="80"/>
+              <w:left w:type="dxa" w:w="120"/>
+              <w:bottom w:type="dxa" w:w="80"/>
+              <w:right w:type="dxa" w:w="120"/>
+            </w:tcMar>
+          </w:tcPr>
+          <w:p>
+            <w:pPr>
+              <w:jc w:val="left"/>
+            </w:pPr>
+            <w:r>
+              <w:rPr>
+                <w:rFonts w:ascii="Arial" w:cs="Arial" w:eastAsia="Arial" w:hAnsi="Arial"/>
+                <w:color w:val="1A1A1A"/>
+                <w:sz w:val="20"/>
+                <w:szCs w:val="20"/>
+              </w:rPr>
+              <w:t xml:space="preserve">长文档秒变精华，关键信息不遗漏</w:t>
+            </w:r>
+          </w:p>
+        </w:tc>
+        <w:tc>
+          <w:tcPr>
+            <w:tcW w:type="dxa" w:w="1480"/>
+            <w:tcBorders>
+              <w:top w:val="single" w:color="CCCCCC" w:sz="1"/>
+              <w:left w:val="single" w:color="CCCCCC" w:sz="1"/>
+              <w:bottom w:val="single" w:color="CCCCCC" w:sz="1"/>
+              <w:right w:val="single" w:color="CCCCCC" w:sz="1"/>
+            </w:tcBorders>
+            <w:shd w:fill="FFFFFF" w:val="clear"/>
+            <w:tcMar>
+              <w:top w:type="dxa" w:w="80"/>
+              <w:left w:type="dxa" w:w="120"/>
+              <w:bottom w:type="dxa" w:w="80"/>
+              <w:right w:type="dxa" w:w="120"/>
+            </w:tcMar>
+          </w:tcPr>
+          <w:p>
+            <w:pPr>
+              <w:jc w:val="center"/>
+            </w:pPr>
+            <w:r>
+              <w:rPr>
+                <w:rFonts w:ascii="Arial" w:cs="Arial" w:eastAsia="Arial" w:hAnsi="Arial"/>
+                <w:color w:val="1A1A1A"/>
+                <w:sz w:val="20"/>
+                <w:szCs w:val="20"/>
+              </w:rPr>
+              <w:t xml:space="preserve">可交付</w:t>
+            </w:r>
+          </w:p>
+        </w:tc>
+        <w:tc>
+          <w:tcPr>
+            <w:tcW w:type="dxa" w:w="1480"/>
+            <w:tcBorders>
+              <w:top w:val="single" w:color="CCCCCC" w:sz="1"/>
+              <w:left w:val="single" w:color="CCCCCC" w:sz="1"/>
+              <w:bottom w:val="single" w:color="CCCCCC" w:sz="1"/>
+              <w:right w:val="single" w:color="CCCCCC" w:sz="1"/>
+            </w:tcBorders>
+            <w:shd w:fill="FFFFFF" w:val="clear"/>
+            <w:tcMar>
+              <w:top w:type="dxa" w:w="80"/>
+              <w:left w:type="dxa" w:w="120"/>
+              <w:bottom w:type="dxa" w:w="80"/>
+              <w:right w:type="dxa" w:w="120"/>
+            </w:tcMar>
+          </w:tcPr>
+          <w:p>
+            <w:pPr>
+              <w:jc w:val="center"/>
+            </w:pPr>
+            <w:r>
+              <w:rPr>
+                <w:rFonts w:ascii="Arial" w:cs="Arial" w:eastAsia="Arial" w:hAnsi="Arial"/>
+                <w:color w:val="1A1A1A"/>
+                <w:sz w:val="20"/>
+                <w:szCs w:val="20"/>
+              </w:rPr>
+              <w:t xml:space="preserve">★★★★☆</w:t>
+            </w:r>
+          </w:p>
+        </w:tc>
+        <w:tc>
+          <w:tcPr>
+            <w:tcW w:type="dxa" w:w="1400"/>
+            <w:tcBorders>
+              <w:top w:val="single" w:color="CCCCCC" w:sz="1"/>
+              <w:left w:val="single" w:color="CCCCCC" w:sz="1"/>
+              <w:bottom w:val="single" w:color="CCCCCC" w:sz="1"/>
+              <w:right w:val="single" w:color="CCCCCC" w:sz="1"/>
+            </w:tcBorders>
+            <w:shd w:fill="FFFFFF" w:val="clear"/>
+            <w:tcMar>
+              <w:top w:type="dxa" w:w="80"/>
+              <w:left w:type="dxa" w:w="120"/>
+              <w:bottom w:type="dxa" w:w="80"/>
+              <w:right w:type="dxa" w:w="120"/>
+            </w:tcMar>
+          </w:tcPr>
+          <w:p>
+            <w:pPr>
+              <w:jc w:val="center"/>
+            </w:pPr>
+            <w:r>
+              <w:rPr>
+                <w:rFonts w:ascii="Arial" w:cs="Arial" w:eastAsia="Arial" w:hAnsi="Arial"/>
+                <w:color w:val="1A1A1A"/>
+                <w:sz w:val="20"/>
+                <w:szCs w:val="20"/>
+              </w:rPr>
+              <w:t xml:space="preserve">低 ★☆☆</w:t>
             </w:r>
           </w:p>
         </w:tc>

</xml_diff>

<commit_message>
docs: add 参考报价 column to capability overview table
Based on 3000元/人天, ranges from 1万 (文本摘要) to 13.5万 (视觉识别)

Co-Authored-By: Claude Sonnet 4.6 <noreply@anthropic.com>
</commit_message>
<xml_diff>
--- a/docs/AI能力与解决方案.docx
+++ b/docs/AI能力与解决方案.docx
@@ -163,11 +163,12 @@
         </w:tblBorders>
       </w:tblPr>
       <w:tblGrid>
-        <w:gridCol w:w="2200"/>
-        <w:gridCol w:w="2800"/>
-        <w:gridCol w:w="1480"/>
-        <w:gridCol w:w="1480"/>
-        <w:gridCol w:w="1400"/>
+        <w:gridCol w:w="1960"/>
+        <w:gridCol w:w="2560"/>
+        <w:gridCol w:w="1080"/>
+        <w:gridCol w:w="880"/>
+        <w:gridCol w:w="880"/>
+        <w:gridCol w:w="2000"/>
       </w:tblGrid>
       <w:tr>
         <w:trPr>
@@ -175,7 +176,7 @@
         </w:trPr>
         <w:tc>
           <w:tcPr>
-            <w:tcW w:type="dxa" w:w="2200"/>
+            <w:tcW w:type="dxa" w:w="1960"/>
             <w:tcBorders>
               <w:top w:val="single" w:color="1B4F8A" w:sz="1"/>
               <w:left w:val="single" w:color="1B4F8A" w:sz="1"/>
@@ -209,7 +210,7 @@
         </w:tc>
         <w:tc>
           <w:tcPr>
-            <w:tcW w:type="dxa" w:w="2800"/>
+            <w:tcW w:type="dxa" w:w="2560"/>
             <w:tcBorders>
               <w:top w:val="single" w:color="1B4F8A" w:sz="1"/>
               <w:left w:val="single" w:color="1B4F8A" w:sz="1"/>
@@ -243,7 +244,7 @@
         </w:tc>
         <w:tc>
           <w:tcPr>
-            <w:tcW w:type="dxa" w:w="1480"/>
+            <w:tcW w:type="dxa" w:w="1080"/>
             <w:tcBorders>
               <w:top w:val="single" w:color="1B4F8A" w:sz="1"/>
               <w:left w:val="single" w:color="1B4F8A" w:sz="1"/>
@@ -277,7 +278,7 @@
         </w:tc>
         <w:tc>
           <w:tcPr>
-            <w:tcW w:type="dxa" w:w="1480"/>
+            <w:tcW w:type="dxa" w:w="880"/>
             <w:tcBorders>
               <w:top w:val="single" w:color="1B4F8A" w:sz="1"/>
               <w:left w:val="single" w:color="1B4F8A" w:sz="1"/>
@@ -311,7 +312,7 @@
         </w:tc>
         <w:tc>
           <w:tcPr>
-            <w:tcW w:type="dxa" w:w="1400"/>
+            <w:tcW w:type="dxa" w:w="880"/>
             <w:tcBorders>
               <w:top w:val="single" w:color="1B4F8A" w:sz="1"/>
               <w:left w:val="single" w:color="1B4F8A" w:sz="1"/>
@@ -343,18 +344,16 @@
             </w:r>
           </w:p>
         </w:tc>
-      </w:tr>
-      <w:tr>
-        <w:tc>
-          <w:tcPr>
-            <w:tcW w:type="dxa" w:w="2200"/>
-            <w:tcBorders>
-              <w:top w:val="single" w:color="CCCCCC" w:sz="1"/>
-              <w:left w:val="single" w:color="CCCCCC" w:sz="1"/>
-              <w:bottom w:val="single" w:color="CCCCCC" w:sz="1"/>
-              <w:right w:val="single" w:color="CCCCCC" w:sz="1"/>
-            </w:tcBorders>
-            <w:shd w:fill="FFFFFF" w:val="clear"/>
+        <w:tc>
+          <w:tcPr>
+            <w:tcW w:type="dxa" w:w="2000"/>
+            <w:tcBorders>
+              <w:top w:val="single" w:color="1B4F8A" w:sz="1"/>
+              <w:left w:val="single" w:color="1B4F8A" w:sz="1"/>
+              <w:bottom w:val="single" w:color="1B4F8A" w:sz="1"/>
+              <w:right w:val="single" w:color="1B4F8A" w:sz="1"/>
+            </w:tcBorders>
+            <w:shd w:fill="1B4F8A" w:val="clear"/>
             <w:tcMar>
               <w:top w:type="dxa" w:w="80"/>
               <w:left w:type="dxa" w:w="120"/>
@@ -364,22 +363,26 @@
           </w:tcPr>
           <w:p>
             <w:pPr>
-              <w:jc w:val="left"/>
-            </w:pPr>
-            <w:r>
-              <w:rPr>
-                <w:rFonts w:ascii="Arial" w:cs="Arial" w:eastAsia="Arial" w:hAnsi="Arial"/>
-                <w:color w:val="1A1A1A"/>
-                <w:sz w:val="20"/>
-                <w:szCs w:val="20"/>
-              </w:rPr>
-              <w:t xml:space="preserve">结构化数据问答</w:t>
-            </w:r>
-          </w:p>
-        </w:tc>
-        <w:tc>
-          <w:tcPr>
-            <w:tcW w:type="dxa" w:w="2800"/>
+              <w:jc w:val="center"/>
+            </w:pPr>
+            <w:r>
+              <w:rPr>
+                <w:rFonts w:ascii="Arial" w:cs="Arial" w:eastAsia="Arial" w:hAnsi="Arial"/>
+                <w:b/>
+                <w:bCs/>
+                <w:color w:val="FFFFFF"/>
+                <w:sz w:val="20"/>
+                <w:szCs w:val="20"/>
+              </w:rPr>
+              <w:t xml:space="preserve">参考报价</w:t>
+            </w:r>
+          </w:p>
+        </w:tc>
+      </w:tr>
+      <w:tr>
+        <w:tc>
+          <w:tcPr>
+            <w:tcW w:type="dxa" w:w="1960"/>
             <w:tcBorders>
               <w:top w:val="single" w:color="CCCCCC" w:sz="1"/>
               <w:left w:val="single" w:color="CCCCCC" w:sz="1"/>
@@ -405,13 +408,13 @@
                 <w:sz w:val="20"/>
                 <w:szCs w:val="20"/>
               </w:rPr>
-              <w:t xml:space="preserve">让非技术人员用自然语言查业务数据库</w:t>
-            </w:r>
-          </w:p>
-        </w:tc>
-        <w:tc>
-          <w:tcPr>
-            <w:tcW w:type="dxa" w:w="1480"/>
+              <w:t xml:space="preserve">结构化数据问答</w:t>
+            </w:r>
+          </w:p>
+        </w:tc>
+        <w:tc>
+          <w:tcPr>
+            <w:tcW w:type="dxa" w:w="2560"/>
             <w:tcBorders>
               <w:top w:val="single" w:color="CCCCCC" w:sz="1"/>
               <w:left w:val="single" w:color="CCCCCC" w:sz="1"/>
@@ -428,22 +431,22 @@
           </w:tcPr>
           <w:p>
             <w:pPr>
-              <w:jc w:val="center"/>
-            </w:pPr>
-            <w:r>
-              <w:rPr>
-                <w:rFonts w:ascii="Arial" w:cs="Arial" w:eastAsia="Arial" w:hAnsi="Arial"/>
-                <w:color w:val="1A1A1A"/>
-                <w:sz w:val="20"/>
-                <w:szCs w:val="20"/>
-              </w:rPr>
-              <w:t xml:space="preserve">已有生产案例</w:t>
-            </w:r>
-          </w:p>
-        </w:tc>
-        <w:tc>
-          <w:tcPr>
-            <w:tcW w:type="dxa" w:w="1480"/>
+              <w:jc w:val="left"/>
+            </w:pPr>
+            <w:r>
+              <w:rPr>
+                <w:rFonts w:ascii="Arial" w:cs="Arial" w:eastAsia="Arial" w:hAnsi="Arial"/>
+                <w:color w:val="1A1A1A"/>
+                <w:sz w:val="20"/>
+                <w:szCs w:val="20"/>
+              </w:rPr>
+              <w:t xml:space="preserve">让非技术人员用自然语言查业务数据库</w:t>
+            </w:r>
+          </w:p>
+        </w:tc>
+        <w:tc>
+          <w:tcPr>
+            <w:tcW w:type="dxa" w:w="1080"/>
             <w:tcBorders>
               <w:top w:val="single" w:color="CCCCCC" w:sz="1"/>
               <w:left w:val="single" w:color="CCCCCC" w:sz="1"/>
@@ -469,13 +472,13 @@
                 <w:sz w:val="20"/>
                 <w:szCs w:val="20"/>
               </w:rPr>
-              <w:t xml:space="preserve">★★★★★</w:t>
-            </w:r>
-          </w:p>
-        </w:tc>
-        <w:tc>
-          <w:tcPr>
-            <w:tcW w:type="dxa" w:w="1400"/>
+              <w:t xml:space="preserve">已有生产案例</w:t>
+            </w:r>
+          </w:p>
+        </w:tc>
+        <w:tc>
+          <w:tcPr>
+            <w:tcW w:type="dxa" w:w="880"/>
             <w:tcBorders>
               <w:top w:val="single" w:color="CCCCCC" w:sz="1"/>
               <w:left w:val="single" w:color="CCCCCC" w:sz="1"/>
@@ -501,22 +504,20 @@
                 <w:sz w:val="20"/>
                 <w:szCs w:val="20"/>
               </w:rPr>
-              <w:t xml:space="preserve">高 ★★★</w:t>
-            </w:r>
-          </w:p>
-        </w:tc>
-      </w:tr>
-      <w:tr>
-        <w:tc>
-          <w:tcPr>
-            <w:tcW w:type="dxa" w:w="2200"/>
+              <w:t xml:space="preserve">★★★★★</w:t>
+            </w:r>
+          </w:p>
+        </w:tc>
+        <w:tc>
+          <w:tcPr>
+            <w:tcW w:type="dxa" w:w="880"/>
             <w:tcBorders>
               <w:top w:val="single" w:color="CCCCCC" w:sz="1"/>
               <w:left w:val="single" w:color="CCCCCC" w:sz="1"/>
               <w:bottom w:val="single" w:color="CCCCCC" w:sz="1"/>
               <w:right w:val="single" w:color="CCCCCC" w:sz="1"/>
             </w:tcBorders>
-            <w:shd w:fill="F5F5F5" w:val="clear"/>
+            <w:shd w:fill="FFFFFF" w:val="clear"/>
             <w:tcMar>
               <w:top w:type="dxa" w:w="80"/>
               <w:left w:type="dxa" w:w="120"/>
@@ -526,29 +527,29 @@
           </w:tcPr>
           <w:p>
             <w:pPr>
-              <w:jc w:val="left"/>
-            </w:pPr>
-            <w:r>
-              <w:rPr>
-                <w:rFonts w:ascii="Arial" w:cs="Arial" w:eastAsia="Arial" w:hAnsi="Arial"/>
-                <w:color w:val="1A1A1A"/>
-                <w:sz w:val="20"/>
-                <w:szCs w:val="20"/>
-              </w:rPr>
-              <w:t xml:space="preserve">企业知识库问答（RAG）</w:t>
-            </w:r>
-          </w:p>
-        </w:tc>
-        <w:tc>
-          <w:tcPr>
-            <w:tcW w:type="dxa" w:w="2800"/>
+              <w:jc w:val="center"/>
+            </w:pPr>
+            <w:r>
+              <w:rPr>
+                <w:rFonts w:ascii="Arial" w:cs="Arial" w:eastAsia="Arial" w:hAnsi="Arial"/>
+                <w:color w:val="1A1A1A"/>
+                <w:sz w:val="20"/>
+                <w:szCs w:val="20"/>
+              </w:rPr>
+              <w:t xml:space="preserve">高 ★★★</w:t>
+            </w:r>
+          </w:p>
+        </w:tc>
+        <w:tc>
+          <w:tcPr>
+            <w:tcW w:type="dxa" w:w="2000"/>
             <w:tcBorders>
               <w:top w:val="single" w:color="CCCCCC" w:sz="1"/>
               <w:left w:val="single" w:color="CCCCCC" w:sz="1"/>
               <w:bottom w:val="single" w:color="CCCCCC" w:sz="1"/>
               <w:right w:val="single" w:color="CCCCCC" w:sz="1"/>
             </w:tcBorders>
-            <w:shd w:fill="F5F5F5" w:val="clear"/>
+            <w:shd w:fill="FFFFFF" w:val="clear"/>
             <w:tcMar>
               <w:top w:type="dxa" w:w="80"/>
               <w:left w:type="dxa" w:w="120"/>
@@ -558,22 +559,24 @@
           </w:tcPr>
           <w:p>
             <w:pPr>
-              <w:jc w:val="left"/>
-            </w:pPr>
-            <w:r>
-              <w:rPr>
-                <w:rFonts w:ascii="Arial" w:cs="Arial" w:eastAsia="Arial" w:hAnsi="Arial"/>
-                <w:color w:val="1A1A1A"/>
-                <w:sz w:val="20"/>
-                <w:szCs w:val="20"/>
-              </w:rPr>
-              <w:t xml:space="preserve">把内部文档变成可问答的知识资产</w:t>
-            </w:r>
-          </w:p>
-        </w:tc>
-        <w:tc>
-          <w:tcPr>
-            <w:tcW w:type="dxa" w:w="1480"/>
+              <w:jc w:val="center"/>
+            </w:pPr>
+            <w:r>
+              <w:rPr>
+                <w:rFonts w:ascii="Arial" w:cs="Arial" w:eastAsia="Arial" w:hAnsi="Arial"/>
+                <w:color w:val="1A1A1A"/>
+                <w:sz w:val="20"/>
+                <w:szCs w:val="20"/>
+              </w:rPr>
+              <w:t xml:space="preserve">6–9万</w:t>
+            </w:r>
+          </w:p>
+        </w:tc>
+      </w:tr>
+      <w:tr>
+        <w:tc>
+          <w:tcPr>
+            <w:tcW w:type="dxa" w:w="1960"/>
             <w:tcBorders>
               <w:top w:val="single" w:color="CCCCCC" w:sz="1"/>
               <w:left w:val="single" w:color="CCCCCC" w:sz="1"/>
@@ -590,22 +593,22 @@
           </w:tcPr>
           <w:p>
             <w:pPr>
-              <w:jc w:val="center"/>
-            </w:pPr>
-            <w:r>
-              <w:rPr>
-                <w:rFonts w:ascii="Arial" w:cs="Arial" w:eastAsia="Arial" w:hAnsi="Arial"/>
-                <w:color w:val="1A1A1A"/>
-                <w:sz w:val="20"/>
-                <w:szCs w:val="20"/>
-              </w:rPr>
-              <w:t xml:space="preserve">已有生产案例</w:t>
-            </w:r>
-          </w:p>
-        </w:tc>
-        <w:tc>
-          <w:tcPr>
-            <w:tcW w:type="dxa" w:w="1480"/>
+              <w:jc w:val="left"/>
+            </w:pPr>
+            <w:r>
+              <w:rPr>
+                <w:rFonts w:ascii="Arial" w:cs="Arial" w:eastAsia="Arial" w:hAnsi="Arial"/>
+                <w:color w:val="1A1A1A"/>
+                <w:sz w:val="20"/>
+                <w:szCs w:val="20"/>
+              </w:rPr>
+              <w:t xml:space="preserve">企业知识库问答（RAG）</w:t>
+            </w:r>
+          </w:p>
+        </w:tc>
+        <w:tc>
+          <w:tcPr>
+            <w:tcW w:type="dxa" w:w="2560"/>
             <w:tcBorders>
               <w:top w:val="single" w:color="CCCCCC" w:sz="1"/>
               <w:left w:val="single" w:color="CCCCCC" w:sz="1"/>
@@ -622,29 +625,29 @@
           </w:tcPr>
           <w:p>
             <w:pPr>
-              <w:jc w:val="center"/>
-            </w:pPr>
-            <w:r>
-              <w:rPr>
-                <w:rFonts w:ascii="Arial" w:cs="Arial" w:eastAsia="Arial" w:hAnsi="Arial"/>
-                <w:color w:val="1A1A1A"/>
-                <w:sz w:val="20"/>
-                <w:szCs w:val="20"/>
-              </w:rPr>
-              <w:t xml:space="preserve">★★★★★</w:t>
-            </w:r>
-          </w:p>
-        </w:tc>
-        <w:tc>
-          <w:tcPr>
-            <w:tcW w:type="dxa" w:w="1400"/>
+              <w:jc w:val="left"/>
+            </w:pPr>
+            <w:r>
+              <w:rPr>
+                <w:rFonts w:ascii="Arial" w:cs="Arial" w:eastAsia="Arial" w:hAnsi="Arial"/>
+                <w:color w:val="1A1A1A"/>
+                <w:sz w:val="20"/>
+                <w:szCs w:val="20"/>
+              </w:rPr>
+              <w:t xml:space="preserve">把内部文档变成可问答的知识资产</w:t>
+            </w:r>
+          </w:p>
+        </w:tc>
+        <w:tc>
+          <w:tcPr>
+            <w:tcW w:type="dxa" w:w="1080"/>
             <w:tcBorders>
               <w:top w:val="single" w:color="CCCCCC" w:sz="1"/>
               <w:left w:val="single" w:color="CCCCCC" w:sz="1"/>
               <w:bottom w:val="single" w:color="CCCCCC" w:sz="1"/>
               <w:right w:val="single" w:color="CCCCCC" w:sz="1"/>
             </w:tcBorders>
-            <w:shd w:fill="FFFFFF" w:val="clear"/>
+            <w:shd w:fill="F5F5F5" w:val="clear"/>
             <w:tcMar>
               <w:top w:type="dxa" w:w="80"/>
               <w:left w:type="dxa" w:w="120"/>
@@ -663,22 +666,20 @@
                 <w:sz w:val="20"/>
                 <w:szCs w:val="20"/>
               </w:rPr>
-              <w:t xml:space="preserve">中 ★★☆</w:t>
-            </w:r>
-          </w:p>
-        </w:tc>
-      </w:tr>
-      <w:tr>
-        <w:tc>
-          <w:tcPr>
-            <w:tcW w:type="dxa" w:w="2200"/>
+              <w:t xml:space="preserve">已有生产案例</w:t>
+            </w:r>
+          </w:p>
+        </w:tc>
+        <w:tc>
+          <w:tcPr>
+            <w:tcW w:type="dxa" w:w="880"/>
             <w:tcBorders>
               <w:top w:val="single" w:color="CCCCCC" w:sz="1"/>
               <w:left w:val="single" w:color="CCCCCC" w:sz="1"/>
               <w:bottom w:val="single" w:color="CCCCCC" w:sz="1"/>
               <w:right w:val="single" w:color="CCCCCC" w:sz="1"/>
             </w:tcBorders>
-            <w:shd w:fill="FFFFFF" w:val="clear"/>
+            <w:shd w:fill="F5F5F5" w:val="clear"/>
             <w:tcMar>
               <w:top w:type="dxa" w:w="80"/>
               <w:left w:type="dxa" w:w="120"/>
@@ -688,22 +689,22 @@
           </w:tcPr>
           <w:p>
             <w:pPr>
-              <w:jc w:val="left"/>
-            </w:pPr>
-            <w:r>
-              <w:rPr>
-                <w:rFonts w:ascii="Arial" w:cs="Arial" w:eastAsia="Arial" w:hAnsi="Arial"/>
-                <w:color w:val="1A1A1A"/>
-                <w:sz w:val="20"/>
-                <w:szCs w:val="20"/>
-              </w:rPr>
-              <w:t xml:space="preserve">文档智能分析</w:t>
-            </w:r>
-          </w:p>
-        </w:tc>
-        <w:tc>
-          <w:tcPr>
-            <w:tcW w:type="dxa" w:w="2800"/>
+              <w:jc w:val="center"/>
+            </w:pPr>
+            <w:r>
+              <w:rPr>
+                <w:rFonts w:ascii="Arial" w:cs="Arial" w:eastAsia="Arial" w:hAnsi="Arial"/>
+                <w:color w:val="1A1A1A"/>
+                <w:sz w:val="20"/>
+                <w:szCs w:val="20"/>
+              </w:rPr>
+              <w:t xml:space="preserve">★★★★★</w:t>
+            </w:r>
+          </w:p>
+        </w:tc>
+        <w:tc>
+          <w:tcPr>
+            <w:tcW w:type="dxa" w:w="880"/>
             <w:tcBorders>
               <w:top w:val="single" w:color="CCCCCC" w:sz="1"/>
               <w:left w:val="single" w:color="CCCCCC" w:sz="1"/>
@@ -720,22 +721,22 @@
           </w:tcPr>
           <w:p>
             <w:pPr>
-              <w:jc w:val="left"/>
-            </w:pPr>
-            <w:r>
-              <w:rPr>
-                <w:rFonts w:ascii="Arial" w:cs="Arial" w:eastAsia="Arial" w:hAnsi="Arial"/>
-                <w:color w:val="1A1A1A"/>
-                <w:sz w:val="20"/>
-                <w:szCs w:val="20"/>
-              </w:rPr>
-              <w:t xml:space="preserve">一份文档自动生成多种衍生内容</w:t>
-            </w:r>
-          </w:p>
-        </w:tc>
-        <w:tc>
-          <w:tcPr>
-            <w:tcW w:type="dxa" w:w="1480"/>
+              <w:jc w:val="center"/>
+            </w:pPr>
+            <w:r>
+              <w:rPr>
+                <w:rFonts w:ascii="Arial" w:cs="Arial" w:eastAsia="Arial" w:hAnsi="Arial"/>
+                <w:color w:val="1A1A1A"/>
+                <w:sz w:val="20"/>
+                <w:szCs w:val="20"/>
+              </w:rPr>
+              <w:t xml:space="preserve">中 ★★☆</w:t>
+            </w:r>
+          </w:p>
+        </w:tc>
+        <w:tc>
+          <w:tcPr>
+            <w:tcW w:type="dxa" w:w="2000"/>
             <w:tcBorders>
               <w:top w:val="single" w:color="CCCCCC" w:sz="1"/>
               <w:left w:val="single" w:color="CCCCCC" w:sz="1"/>
@@ -761,13 +762,15 @@
                 <w:sz w:val="20"/>
                 <w:szCs w:val="20"/>
               </w:rPr>
-              <w:t xml:space="preserve">已有生产案例</w:t>
-            </w:r>
-          </w:p>
-        </w:tc>
-        <w:tc>
-          <w:tcPr>
-            <w:tcW w:type="dxa" w:w="1480"/>
+              <w:t xml:space="preserve">3.6–6万</w:t>
+            </w:r>
+          </w:p>
+        </w:tc>
+      </w:tr>
+      <w:tr>
+        <w:tc>
+          <w:tcPr>
+            <w:tcW w:type="dxa" w:w="1960"/>
             <w:tcBorders>
               <w:top w:val="single" w:color="CCCCCC" w:sz="1"/>
               <w:left w:val="single" w:color="CCCCCC" w:sz="1"/>
@@ -784,22 +787,22 @@
           </w:tcPr>
           <w:p>
             <w:pPr>
-              <w:jc w:val="center"/>
-            </w:pPr>
-            <w:r>
-              <w:rPr>
-                <w:rFonts w:ascii="Arial" w:cs="Arial" w:eastAsia="Arial" w:hAnsi="Arial"/>
-                <w:color w:val="1A1A1A"/>
-                <w:sz w:val="20"/>
-                <w:szCs w:val="20"/>
-              </w:rPr>
-              <w:t xml:space="preserve">★★★★☆</w:t>
-            </w:r>
-          </w:p>
-        </w:tc>
-        <w:tc>
-          <w:tcPr>
-            <w:tcW w:type="dxa" w:w="1400"/>
+              <w:jc w:val="left"/>
+            </w:pPr>
+            <w:r>
+              <w:rPr>
+                <w:rFonts w:ascii="Arial" w:cs="Arial" w:eastAsia="Arial" w:hAnsi="Arial"/>
+                <w:color w:val="1A1A1A"/>
+                <w:sz w:val="20"/>
+                <w:szCs w:val="20"/>
+              </w:rPr>
+              <w:t xml:space="preserve">文档智能分析</w:t>
+            </w:r>
+          </w:p>
+        </w:tc>
+        <w:tc>
+          <w:tcPr>
+            <w:tcW w:type="dxa" w:w="2560"/>
             <w:tcBorders>
               <w:top w:val="single" w:color="CCCCCC" w:sz="1"/>
               <w:left w:val="single" w:color="CCCCCC" w:sz="1"/>
@@ -816,31 +819,29 @@
           </w:tcPr>
           <w:p>
             <w:pPr>
-              <w:jc w:val="center"/>
-            </w:pPr>
-            <w:r>
-              <w:rPr>
-                <w:rFonts w:ascii="Arial" w:cs="Arial" w:eastAsia="Arial" w:hAnsi="Arial"/>
-                <w:color w:val="1A1A1A"/>
-                <w:sz w:val="20"/>
-                <w:szCs w:val="20"/>
-              </w:rPr>
-              <w:t xml:space="preserve">中 ★★☆</w:t>
-            </w:r>
-          </w:p>
-        </w:tc>
-      </w:tr>
-      <w:tr>
-        <w:tc>
-          <w:tcPr>
-            <w:tcW w:type="dxa" w:w="2200"/>
+              <w:jc w:val="left"/>
+            </w:pPr>
+            <w:r>
+              <w:rPr>
+                <w:rFonts w:ascii="Arial" w:cs="Arial" w:eastAsia="Arial" w:hAnsi="Arial"/>
+                <w:color w:val="1A1A1A"/>
+                <w:sz w:val="20"/>
+                <w:szCs w:val="20"/>
+              </w:rPr>
+              <w:t xml:space="preserve">一份文档自动生成多种衍生内容</w:t>
+            </w:r>
+          </w:p>
+        </w:tc>
+        <w:tc>
+          <w:tcPr>
+            <w:tcW w:type="dxa" w:w="1080"/>
             <w:tcBorders>
               <w:top w:val="single" w:color="CCCCCC" w:sz="1"/>
               <w:left w:val="single" w:color="CCCCCC" w:sz="1"/>
               <w:bottom w:val="single" w:color="CCCCCC" w:sz="1"/>
               <w:right w:val="single" w:color="CCCCCC" w:sz="1"/>
             </w:tcBorders>
-            <w:shd w:fill="F5F5F5" w:val="clear"/>
+            <w:shd w:fill="FFFFFF" w:val="clear"/>
             <w:tcMar>
               <w:top w:type="dxa" w:w="80"/>
               <w:left w:type="dxa" w:w="120"/>
@@ -850,29 +851,29 @@
           </w:tcPr>
           <w:p>
             <w:pPr>
-              <w:jc w:val="left"/>
-            </w:pPr>
-            <w:r>
-              <w:rPr>
-                <w:rFonts w:ascii="Arial" w:cs="Arial" w:eastAsia="Arial" w:hAnsi="Arial"/>
-                <w:color w:val="1A1A1A"/>
-                <w:sz w:val="20"/>
-                <w:szCs w:val="20"/>
-              </w:rPr>
-              <w:t xml:space="preserve">AI 工作流 / 多 Agent</w:t>
-            </w:r>
-          </w:p>
-        </w:tc>
-        <w:tc>
-          <w:tcPr>
-            <w:tcW w:type="dxa" w:w="2800"/>
+              <w:jc w:val="center"/>
+            </w:pPr>
+            <w:r>
+              <w:rPr>
+                <w:rFonts w:ascii="Arial" w:cs="Arial" w:eastAsia="Arial" w:hAnsi="Arial"/>
+                <w:color w:val="1A1A1A"/>
+                <w:sz w:val="20"/>
+                <w:szCs w:val="20"/>
+              </w:rPr>
+              <w:t xml:space="preserve">已有生产案例</w:t>
+            </w:r>
+          </w:p>
+        </w:tc>
+        <w:tc>
+          <w:tcPr>
+            <w:tcW w:type="dxa" w:w="880"/>
             <w:tcBorders>
               <w:top w:val="single" w:color="CCCCCC" w:sz="1"/>
               <w:left w:val="single" w:color="CCCCCC" w:sz="1"/>
               <w:bottom w:val="single" w:color="CCCCCC" w:sz="1"/>
               <w:right w:val="single" w:color="CCCCCC" w:sz="1"/>
             </w:tcBorders>
-            <w:shd w:fill="F5F5F5" w:val="clear"/>
+            <w:shd w:fill="FFFFFF" w:val="clear"/>
             <w:tcMar>
               <w:top w:type="dxa" w:w="80"/>
               <w:left w:type="dxa" w:w="120"/>
@@ -882,29 +883,29 @@
           </w:tcPr>
           <w:p>
             <w:pPr>
-              <w:jc w:val="left"/>
-            </w:pPr>
-            <w:r>
-              <w:rPr>
-                <w:rFonts w:ascii="Arial" w:cs="Arial" w:eastAsia="Arial" w:hAnsi="Arial"/>
-                <w:color w:val="1A1A1A"/>
-                <w:sz w:val="20"/>
-                <w:szCs w:val="20"/>
-              </w:rPr>
-              <w:t xml:space="preserve">把复杂多步骤流程交给 AI 自动完成</w:t>
-            </w:r>
-          </w:p>
-        </w:tc>
-        <w:tc>
-          <w:tcPr>
-            <w:tcW w:type="dxa" w:w="1480"/>
+              <w:jc w:val="center"/>
+            </w:pPr>
+            <w:r>
+              <w:rPr>
+                <w:rFonts w:ascii="Arial" w:cs="Arial" w:eastAsia="Arial" w:hAnsi="Arial"/>
+                <w:color w:val="1A1A1A"/>
+                <w:sz w:val="20"/>
+                <w:szCs w:val="20"/>
+              </w:rPr>
+              <w:t xml:space="preserve">★★★★☆</w:t>
+            </w:r>
+          </w:p>
+        </w:tc>
+        <w:tc>
+          <w:tcPr>
+            <w:tcW w:type="dxa" w:w="880"/>
             <w:tcBorders>
               <w:top w:val="single" w:color="CCCCCC" w:sz="1"/>
               <w:left w:val="single" w:color="CCCCCC" w:sz="1"/>
               <w:bottom w:val="single" w:color="CCCCCC" w:sz="1"/>
               <w:right w:val="single" w:color="CCCCCC" w:sz="1"/>
             </w:tcBorders>
-            <w:shd w:fill="F5F5F5" w:val="clear"/>
+            <w:shd w:fill="FFFFFF" w:val="clear"/>
             <w:tcMar>
               <w:top w:type="dxa" w:w="80"/>
               <w:left w:type="dxa" w:w="120"/>
@@ -923,20 +924,20 @@
                 <w:sz w:val="20"/>
                 <w:szCs w:val="20"/>
               </w:rPr>
-              <w:t xml:space="preserve">已有生产案例</w:t>
-            </w:r>
-          </w:p>
-        </w:tc>
-        <w:tc>
-          <w:tcPr>
-            <w:tcW w:type="dxa" w:w="1480"/>
+              <w:t xml:space="preserve">中 ★★☆</w:t>
+            </w:r>
+          </w:p>
+        </w:tc>
+        <w:tc>
+          <w:tcPr>
+            <w:tcW w:type="dxa" w:w="2000"/>
             <w:tcBorders>
               <w:top w:val="single" w:color="CCCCCC" w:sz="1"/>
               <w:left w:val="single" w:color="CCCCCC" w:sz="1"/>
               <w:bottom w:val="single" w:color="CCCCCC" w:sz="1"/>
               <w:right w:val="single" w:color="CCCCCC" w:sz="1"/>
             </w:tcBorders>
-            <w:shd w:fill="F5F5F5" w:val="clear"/>
+            <w:shd w:fill="FFFFFF" w:val="clear"/>
             <w:tcMar>
               <w:top w:type="dxa" w:w="80"/>
               <w:left w:type="dxa" w:w="120"/>
@@ -955,20 +956,22 @@
                 <w:sz w:val="20"/>
                 <w:szCs w:val="20"/>
               </w:rPr>
-              <w:t xml:space="preserve">★★★★☆</w:t>
-            </w:r>
-          </w:p>
-        </w:tc>
-        <w:tc>
-          <w:tcPr>
-            <w:tcW w:type="dxa" w:w="1400"/>
+              <w:t xml:space="preserve">3–4.5万</w:t>
+            </w:r>
+          </w:p>
+        </w:tc>
+      </w:tr>
+      <w:tr>
+        <w:tc>
+          <w:tcPr>
+            <w:tcW w:type="dxa" w:w="1960"/>
             <w:tcBorders>
               <w:top w:val="single" w:color="CCCCCC" w:sz="1"/>
               <w:left w:val="single" w:color="CCCCCC" w:sz="1"/>
               <w:bottom w:val="single" w:color="CCCCCC" w:sz="1"/>
               <w:right w:val="single" w:color="CCCCCC" w:sz="1"/>
             </w:tcBorders>
-            <w:shd w:fill="FFFFFF" w:val="clear"/>
+            <w:shd w:fill="F5F5F5" w:val="clear"/>
             <w:tcMar>
               <w:top w:type="dxa" w:w="80"/>
               <w:left w:type="dxa" w:w="120"/>
@@ -978,31 +981,29 @@
           </w:tcPr>
           <w:p>
             <w:pPr>
-              <w:jc w:val="center"/>
-            </w:pPr>
-            <w:r>
-              <w:rPr>
-                <w:rFonts w:ascii="Arial" w:cs="Arial" w:eastAsia="Arial" w:hAnsi="Arial"/>
-                <w:color w:val="1A1A1A"/>
-                <w:sz w:val="20"/>
-                <w:szCs w:val="20"/>
-              </w:rPr>
-              <w:t xml:space="preserve">高 ★★★</w:t>
-            </w:r>
-          </w:p>
-        </w:tc>
-      </w:tr>
-      <w:tr>
-        <w:tc>
-          <w:tcPr>
-            <w:tcW w:type="dxa" w:w="2200"/>
+              <w:jc w:val="left"/>
+            </w:pPr>
+            <w:r>
+              <w:rPr>
+                <w:rFonts w:ascii="Arial" w:cs="Arial" w:eastAsia="Arial" w:hAnsi="Arial"/>
+                <w:color w:val="1A1A1A"/>
+                <w:sz w:val="20"/>
+                <w:szCs w:val="20"/>
+              </w:rPr>
+              <w:t xml:space="preserve">AI 工作流 / 多 Agent</w:t>
+            </w:r>
+          </w:p>
+        </w:tc>
+        <w:tc>
+          <w:tcPr>
+            <w:tcW w:type="dxa" w:w="2560"/>
             <w:tcBorders>
               <w:top w:val="single" w:color="CCCCCC" w:sz="1"/>
               <w:left w:val="single" w:color="CCCCCC" w:sz="1"/>
               <w:bottom w:val="single" w:color="CCCCCC" w:sz="1"/>
               <w:right w:val="single" w:color="CCCCCC" w:sz="1"/>
             </w:tcBorders>
-            <w:shd w:fill="FFFFFF" w:val="clear"/>
+            <w:shd w:fill="F5F5F5" w:val="clear"/>
             <w:tcMar>
               <w:top w:type="dxa" w:w="80"/>
               <w:left w:type="dxa" w:w="120"/>
@@ -1021,20 +1022,20 @@
                 <w:sz w:val="20"/>
                 <w:szCs w:val="20"/>
               </w:rPr>
-              <w:t xml:space="preserve">AI 内容创作自动化</w:t>
-            </w:r>
-          </w:p>
-        </w:tc>
-        <w:tc>
-          <w:tcPr>
-            <w:tcW w:type="dxa" w:w="2800"/>
+              <w:t xml:space="preserve">把复杂多步骤流程交给 AI 自动完成</w:t>
+            </w:r>
+          </w:p>
+        </w:tc>
+        <w:tc>
+          <w:tcPr>
+            <w:tcW w:type="dxa" w:w="1080"/>
             <w:tcBorders>
               <w:top w:val="single" w:color="CCCCCC" w:sz="1"/>
               <w:left w:val="single" w:color="CCCCCC" w:sz="1"/>
               <w:bottom w:val="single" w:color="CCCCCC" w:sz="1"/>
               <w:right w:val="single" w:color="CCCCCC" w:sz="1"/>
             </w:tcBorders>
-            <w:shd w:fill="FFFFFF" w:val="clear"/>
+            <w:shd w:fill="F5F5F5" w:val="clear"/>
             <w:tcMar>
               <w:top w:type="dxa" w:w="80"/>
               <w:left w:type="dxa" w:w="120"/>
@@ -1044,29 +1045,29 @@
           </w:tcPr>
           <w:p>
             <w:pPr>
-              <w:jc w:val="left"/>
-            </w:pPr>
-            <w:r>
-              <w:rPr>
-                <w:rFonts w:ascii="Arial" w:cs="Arial" w:eastAsia="Arial" w:hAnsi="Arial"/>
-                <w:color w:val="1A1A1A"/>
-                <w:sz w:val="20"/>
-                <w:szCs w:val="20"/>
-              </w:rPr>
-              <w:t xml:space="preserve">从需求到结构化内容，全程 AI 驱动</w:t>
-            </w:r>
-          </w:p>
-        </w:tc>
-        <w:tc>
-          <w:tcPr>
-            <w:tcW w:type="dxa" w:w="1480"/>
+              <w:jc w:val="center"/>
+            </w:pPr>
+            <w:r>
+              <w:rPr>
+                <w:rFonts w:ascii="Arial" w:cs="Arial" w:eastAsia="Arial" w:hAnsi="Arial"/>
+                <w:color w:val="1A1A1A"/>
+                <w:sz w:val="20"/>
+                <w:szCs w:val="20"/>
+              </w:rPr>
+              <w:t xml:space="preserve">已有生产案例</w:t>
+            </w:r>
+          </w:p>
+        </w:tc>
+        <w:tc>
+          <w:tcPr>
+            <w:tcW w:type="dxa" w:w="880"/>
             <w:tcBorders>
               <w:top w:val="single" w:color="CCCCCC" w:sz="1"/>
               <w:left w:val="single" w:color="CCCCCC" w:sz="1"/>
               <w:bottom w:val="single" w:color="CCCCCC" w:sz="1"/>
               <w:right w:val="single" w:color="CCCCCC" w:sz="1"/>
             </w:tcBorders>
-            <w:shd w:fill="FFFFFF" w:val="clear"/>
+            <w:shd w:fill="F5F5F5" w:val="clear"/>
             <w:tcMar>
               <w:top w:type="dxa" w:w="80"/>
               <w:left w:type="dxa" w:w="120"/>
@@ -1085,13 +1086,13 @@
                 <w:sz w:val="20"/>
                 <w:szCs w:val="20"/>
               </w:rPr>
-              <w:t xml:space="preserve">已有生产案例</w:t>
-            </w:r>
-          </w:p>
-        </w:tc>
-        <w:tc>
-          <w:tcPr>
-            <w:tcW w:type="dxa" w:w="1480"/>
+              <w:t xml:space="preserve">★★★★☆</w:t>
+            </w:r>
+          </w:p>
+        </w:tc>
+        <w:tc>
+          <w:tcPr>
+            <w:tcW w:type="dxa" w:w="880"/>
             <w:tcBorders>
               <w:top w:val="single" w:color="CCCCCC" w:sz="1"/>
               <w:left w:val="single" w:color="CCCCCC" w:sz="1"/>
@@ -1117,13 +1118,13 @@
                 <w:sz w:val="20"/>
                 <w:szCs w:val="20"/>
               </w:rPr>
-              <w:t xml:space="preserve">★★★★☆</w:t>
-            </w:r>
-          </w:p>
-        </w:tc>
-        <w:tc>
-          <w:tcPr>
-            <w:tcW w:type="dxa" w:w="1400"/>
+              <w:t xml:space="preserve">高 ★★★</w:t>
+            </w:r>
+          </w:p>
+        </w:tc>
+        <w:tc>
+          <w:tcPr>
+            <w:tcW w:type="dxa" w:w="2000"/>
             <w:tcBorders>
               <w:top w:val="single" w:color="CCCCCC" w:sz="1"/>
               <w:left w:val="single" w:color="CCCCCC" w:sz="1"/>
@@ -1149,7 +1150,7 @@
                 <w:sz w:val="20"/>
                 <w:szCs w:val="20"/>
               </w:rPr>
-              <w:t xml:space="preserve">中 ★★☆</w:t>
+              <w:t xml:space="preserve">7.5–12万</w:t>
             </w:r>
           </w:p>
         </w:tc>
@@ -1157,14 +1158,14 @@
       <w:tr>
         <w:tc>
           <w:tcPr>
-            <w:tcW w:type="dxa" w:w="2200"/>
+            <w:tcW w:type="dxa" w:w="1960"/>
             <w:tcBorders>
               <w:top w:val="single" w:color="CCCCCC" w:sz="1"/>
               <w:left w:val="single" w:color="CCCCCC" w:sz="1"/>
               <w:bottom w:val="single" w:color="CCCCCC" w:sz="1"/>
               <w:right w:val="single" w:color="CCCCCC" w:sz="1"/>
             </w:tcBorders>
-            <w:shd w:fill="F5F5F5" w:val="clear"/>
+            <w:shd w:fill="FFFFFF" w:val="clear"/>
             <w:tcMar>
               <w:top w:type="dxa" w:w="80"/>
               <w:left w:type="dxa" w:w="120"/>
@@ -1183,20 +1184,20 @@
                 <w:sz w:val="20"/>
                 <w:szCs w:val="20"/>
               </w:rPr>
-              <w:t xml:space="preserve">视觉识别与智能预警</w:t>
-            </w:r>
-          </w:p>
-        </w:tc>
-        <w:tc>
-          <w:tcPr>
-            <w:tcW w:type="dxa" w:w="2800"/>
+              <w:t xml:space="preserve">AI 内容创作自动化</w:t>
+            </w:r>
+          </w:p>
+        </w:tc>
+        <w:tc>
+          <w:tcPr>
+            <w:tcW w:type="dxa" w:w="2560"/>
             <w:tcBorders>
               <w:top w:val="single" w:color="CCCCCC" w:sz="1"/>
               <w:left w:val="single" w:color="CCCCCC" w:sz="1"/>
               <w:bottom w:val="single" w:color="CCCCCC" w:sz="1"/>
               <w:right w:val="single" w:color="CCCCCC" w:sz="1"/>
             </w:tcBorders>
-            <w:shd w:fill="F5F5F5" w:val="clear"/>
+            <w:shd w:fill="FFFFFF" w:val="clear"/>
             <w:tcMar>
               <w:top w:type="dxa" w:w="80"/>
               <w:left w:type="dxa" w:w="120"/>
@@ -1215,20 +1216,20 @@
                 <w:sz w:val="20"/>
                 <w:szCs w:val="20"/>
               </w:rPr>
-              <w:t xml:space="preserve">让摄像头从看见到看懂，自动预警</w:t>
-            </w:r>
-          </w:p>
-        </w:tc>
-        <w:tc>
-          <w:tcPr>
-            <w:tcW w:type="dxa" w:w="1480"/>
+              <w:t xml:space="preserve">从需求到结构化内容，全程 AI 驱动</w:t>
+            </w:r>
+          </w:p>
+        </w:tc>
+        <w:tc>
+          <w:tcPr>
+            <w:tcW w:type="dxa" w:w="1080"/>
             <w:tcBorders>
               <w:top w:val="single" w:color="CCCCCC" w:sz="1"/>
               <w:left w:val="single" w:color="CCCCCC" w:sz="1"/>
               <w:bottom w:val="single" w:color="CCCCCC" w:sz="1"/>
               <w:right w:val="single" w:color="CCCCCC" w:sz="1"/>
             </w:tcBorders>
-            <w:shd w:fill="F5F5F5" w:val="clear"/>
+            <w:shd w:fill="FFFFFF" w:val="clear"/>
             <w:tcMar>
               <w:top w:type="dxa" w:w="80"/>
               <w:left w:type="dxa" w:w="120"/>
@@ -1247,20 +1248,20 @@
                 <w:sz w:val="20"/>
                 <w:szCs w:val="20"/>
               </w:rPr>
-              <w:t xml:space="preserve">规划中 / 可定制</w:t>
-            </w:r>
-          </w:p>
-        </w:tc>
-        <w:tc>
-          <w:tcPr>
-            <w:tcW w:type="dxa" w:w="1480"/>
+              <w:t xml:space="preserve">已有生产案例</w:t>
+            </w:r>
+          </w:p>
+        </w:tc>
+        <w:tc>
+          <w:tcPr>
+            <w:tcW w:type="dxa" w:w="880"/>
             <w:tcBorders>
               <w:top w:val="single" w:color="CCCCCC" w:sz="1"/>
               <w:left w:val="single" w:color="CCCCCC" w:sz="1"/>
               <w:bottom w:val="single" w:color="CCCCCC" w:sz="1"/>
               <w:right w:val="single" w:color="CCCCCC" w:sz="1"/>
             </w:tcBorders>
-            <w:shd w:fill="F5F5F5" w:val="clear"/>
+            <w:shd w:fill="FFFFFF" w:val="clear"/>
             <w:tcMar>
               <w:top w:type="dxa" w:w="80"/>
               <w:left w:type="dxa" w:w="120"/>
@@ -1279,13 +1280,13 @@
                 <w:sz w:val="20"/>
                 <w:szCs w:val="20"/>
               </w:rPr>
-              <w:t xml:space="preserve">★★★☆☆</w:t>
-            </w:r>
-          </w:p>
-        </w:tc>
-        <w:tc>
-          <w:tcPr>
-            <w:tcW w:type="dxa" w:w="1400"/>
+              <w:t xml:space="preserve">★★★★☆</w:t>
+            </w:r>
+          </w:p>
+        </w:tc>
+        <w:tc>
+          <w:tcPr>
+            <w:tcW w:type="dxa" w:w="880"/>
             <w:tcBorders>
               <w:top w:val="single" w:color="CCCCCC" w:sz="1"/>
               <w:left w:val="single" w:color="CCCCCC" w:sz="1"/>
@@ -1311,15 +1312,13 @@
                 <w:sz w:val="20"/>
                 <w:szCs w:val="20"/>
               </w:rPr>
-              <w:t xml:space="preserve">高 ★★★</w:t>
-            </w:r>
-          </w:p>
-        </w:tc>
-      </w:tr>
-      <w:tr>
-        <w:tc>
-          <w:tcPr>
-            <w:tcW w:type="dxa" w:w="2200"/>
+              <w:t xml:space="preserve">中 ★★☆</w:t>
+            </w:r>
+          </w:p>
+        </w:tc>
+        <w:tc>
+          <w:tcPr>
+            <w:tcW w:type="dxa" w:w="2000"/>
             <w:tcBorders>
               <w:top w:val="single" w:color="CCCCCC" w:sz="1"/>
               <w:left w:val="single" w:color="CCCCCC" w:sz="1"/>
@@ -1336,29 +1335,31 @@
           </w:tcPr>
           <w:p>
             <w:pPr>
-              <w:jc w:val="left"/>
-            </w:pPr>
-            <w:r>
-              <w:rPr>
-                <w:rFonts w:ascii="Arial" w:cs="Arial" w:eastAsia="Arial" w:hAnsi="Arial"/>
-                <w:color w:val="1A1A1A"/>
-                <w:sz w:val="20"/>
-                <w:szCs w:val="20"/>
-              </w:rPr>
-              <w:t xml:space="preserve">智能客服 / 多轮对话</w:t>
-            </w:r>
-          </w:p>
-        </w:tc>
-        <w:tc>
-          <w:tcPr>
-            <w:tcW w:type="dxa" w:w="2800"/>
+              <w:jc w:val="center"/>
+            </w:pPr>
+            <w:r>
+              <w:rPr>
+                <w:rFonts w:ascii="Arial" w:cs="Arial" w:eastAsia="Arial" w:hAnsi="Arial"/>
+                <w:color w:val="1A1A1A"/>
+                <w:sz w:val="20"/>
+                <w:szCs w:val="20"/>
+              </w:rPr>
+              <w:t xml:space="preserve">3–4.5万</w:t>
+            </w:r>
+          </w:p>
+        </w:tc>
+      </w:tr>
+      <w:tr>
+        <w:tc>
+          <w:tcPr>
+            <w:tcW w:type="dxa" w:w="1960"/>
             <w:tcBorders>
               <w:top w:val="single" w:color="CCCCCC" w:sz="1"/>
               <w:left w:val="single" w:color="CCCCCC" w:sz="1"/>
               <w:bottom w:val="single" w:color="CCCCCC" w:sz="1"/>
               <w:right w:val="single" w:color="CCCCCC" w:sz="1"/>
             </w:tcBorders>
-            <w:shd w:fill="FFFFFF" w:val="clear"/>
+            <w:shd w:fill="F5F5F5" w:val="clear"/>
             <w:tcMar>
               <w:top w:type="dxa" w:w="80"/>
               <w:left w:type="dxa" w:w="120"/>
@@ -1377,20 +1378,20 @@
                 <w:sz w:val="20"/>
                 <w:szCs w:val="20"/>
               </w:rPr>
-              <w:t xml:space="preserve">降低人工客服成本，提升响应质量</w:t>
-            </w:r>
-          </w:p>
-        </w:tc>
-        <w:tc>
-          <w:tcPr>
-            <w:tcW w:type="dxa" w:w="1480"/>
+              <w:t xml:space="preserve">视觉识别与智能预警</w:t>
+            </w:r>
+          </w:p>
+        </w:tc>
+        <w:tc>
+          <w:tcPr>
+            <w:tcW w:type="dxa" w:w="2560"/>
             <w:tcBorders>
               <w:top w:val="single" w:color="CCCCCC" w:sz="1"/>
               <w:left w:val="single" w:color="CCCCCC" w:sz="1"/>
               <w:bottom w:val="single" w:color="CCCCCC" w:sz="1"/>
               <w:right w:val="single" w:color="CCCCCC" w:sz="1"/>
             </w:tcBorders>
-            <w:shd w:fill="FFFFFF" w:val="clear"/>
+            <w:shd w:fill="F5F5F5" w:val="clear"/>
             <w:tcMar>
               <w:top w:type="dxa" w:w="80"/>
               <w:left w:type="dxa" w:w="120"/>
@@ -1400,29 +1401,29 @@
           </w:tcPr>
           <w:p>
             <w:pPr>
-              <w:jc w:val="center"/>
-            </w:pPr>
-            <w:r>
-              <w:rPr>
-                <w:rFonts w:ascii="Arial" w:cs="Arial" w:eastAsia="Arial" w:hAnsi="Arial"/>
-                <w:color w:val="1A1A1A"/>
-                <w:sz w:val="20"/>
-                <w:szCs w:val="20"/>
-              </w:rPr>
-              <w:t xml:space="preserve">可交付</w:t>
-            </w:r>
-          </w:p>
-        </w:tc>
-        <w:tc>
-          <w:tcPr>
-            <w:tcW w:type="dxa" w:w="1480"/>
+              <w:jc w:val="left"/>
+            </w:pPr>
+            <w:r>
+              <w:rPr>
+                <w:rFonts w:ascii="Arial" w:cs="Arial" w:eastAsia="Arial" w:hAnsi="Arial"/>
+                <w:color w:val="1A1A1A"/>
+                <w:sz w:val="20"/>
+                <w:szCs w:val="20"/>
+              </w:rPr>
+              <w:t xml:space="preserve">让摄像头从看见到看懂，自动预警</w:t>
+            </w:r>
+          </w:p>
+        </w:tc>
+        <w:tc>
+          <w:tcPr>
+            <w:tcW w:type="dxa" w:w="1080"/>
             <w:tcBorders>
               <w:top w:val="single" w:color="CCCCCC" w:sz="1"/>
               <w:left w:val="single" w:color="CCCCCC" w:sz="1"/>
               <w:bottom w:val="single" w:color="CCCCCC" w:sz="1"/>
               <w:right w:val="single" w:color="CCCCCC" w:sz="1"/>
             </w:tcBorders>
-            <w:shd w:fill="FFFFFF" w:val="clear"/>
+            <w:shd w:fill="F5F5F5" w:val="clear"/>
             <w:tcMar>
               <w:top w:type="dxa" w:w="80"/>
               <w:left w:type="dxa" w:w="120"/>
@@ -1441,20 +1442,20 @@
                 <w:sz w:val="20"/>
                 <w:szCs w:val="20"/>
               </w:rPr>
-              <w:t xml:space="preserve">★★★★★</w:t>
-            </w:r>
-          </w:p>
-        </w:tc>
-        <w:tc>
-          <w:tcPr>
-            <w:tcW w:type="dxa" w:w="1400"/>
+              <w:t xml:space="preserve">规划中 / 可定制</w:t>
+            </w:r>
+          </w:p>
+        </w:tc>
+        <w:tc>
+          <w:tcPr>
+            <w:tcW w:type="dxa" w:w="880"/>
             <w:tcBorders>
               <w:top w:val="single" w:color="CCCCCC" w:sz="1"/>
               <w:left w:val="single" w:color="CCCCCC" w:sz="1"/>
               <w:bottom w:val="single" w:color="CCCCCC" w:sz="1"/>
               <w:right w:val="single" w:color="CCCCCC" w:sz="1"/>
             </w:tcBorders>
-            <w:shd w:fill="FFFFFF" w:val="clear"/>
+            <w:shd w:fill="F5F5F5" w:val="clear"/>
             <w:tcMar>
               <w:top w:type="dxa" w:w="80"/>
               <w:left w:type="dxa" w:w="120"/>
@@ -1473,15 +1474,13 @@
                 <w:sz w:val="20"/>
                 <w:szCs w:val="20"/>
               </w:rPr>
-              <w:t xml:space="preserve">中 ★★☆</w:t>
-            </w:r>
-          </w:p>
-        </w:tc>
-      </w:tr>
-      <w:tr>
-        <w:tc>
-          <w:tcPr>
-            <w:tcW w:type="dxa" w:w="2200"/>
+              <w:t xml:space="preserve">★★★☆☆</w:t>
+            </w:r>
+          </w:p>
+        </w:tc>
+        <w:tc>
+          <w:tcPr>
+            <w:tcW w:type="dxa" w:w="880"/>
             <w:tcBorders>
               <w:top w:val="single" w:color="CCCCCC" w:sz="1"/>
               <w:left w:val="single" w:color="CCCCCC" w:sz="1"/>
@@ -1498,22 +1497,22 @@
           </w:tcPr>
           <w:p>
             <w:pPr>
-              <w:jc w:val="left"/>
-            </w:pPr>
-            <w:r>
-              <w:rPr>
-                <w:rFonts w:ascii="Arial" w:cs="Arial" w:eastAsia="Arial" w:hAnsi="Arial"/>
-                <w:color w:val="1A1A1A"/>
-                <w:sz w:val="20"/>
-                <w:szCs w:val="20"/>
-              </w:rPr>
-              <w:t xml:space="preserve">招聘简历智能筛选</w:t>
-            </w:r>
-          </w:p>
-        </w:tc>
-        <w:tc>
-          <w:tcPr>
-            <w:tcW w:type="dxa" w:w="2800"/>
+              <w:jc w:val="center"/>
+            </w:pPr>
+            <w:r>
+              <w:rPr>
+                <w:rFonts w:ascii="Arial" w:cs="Arial" w:eastAsia="Arial" w:hAnsi="Arial"/>
+                <w:color w:val="1A1A1A"/>
+                <w:sz w:val="20"/>
+                <w:szCs w:val="20"/>
+              </w:rPr>
+              <w:t xml:space="preserve">高 ★★★</w:t>
+            </w:r>
+          </w:p>
+        </w:tc>
+        <w:tc>
+          <w:tcPr>
+            <w:tcW w:type="dxa" w:w="2000"/>
             <w:tcBorders>
               <w:top w:val="single" w:color="CCCCCC" w:sz="1"/>
               <w:left w:val="single" w:color="CCCCCC" w:sz="1"/>
@@ -1530,22 +1529,24 @@
           </w:tcPr>
           <w:p>
             <w:pPr>
-              <w:jc w:val="left"/>
-            </w:pPr>
-            <w:r>
-              <w:rPr>
-                <w:rFonts w:ascii="Arial" w:cs="Arial" w:eastAsia="Arial" w:hAnsi="Arial"/>
-                <w:color w:val="1A1A1A"/>
-                <w:sz w:val="20"/>
-                <w:szCs w:val="20"/>
-              </w:rPr>
-              <w:t xml:space="preserve">替代人工初筛，快速锁定最佳候选人</w:t>
-            </w:r>
-          </w:p>
-        </w:tc>
-        <w:tc>
-          <w:tcPr>
-            <w:tcW w:type="dxa" w:w="1480"/>
+              <w:jc w:val="center"/>
+            </w:pPr>
+            <w:r>
+              <w:rPr>
+                <w:rFonts w:ascii="Arial" w:cs="Arial" w:eastAsia="Arial" w:hAnsi="Arial"/>
+                <w:color w:val="1A1A1A"/>
+                <w:sz w:val="20"/>
+                <w:szCs w:val="20"/>
+              </w:rPr>
+              <w:t xml:space="preserve">9–13.5万</w:t>
+            </w:r>
+          </w:p>
+        </w:tc>
+      </w:tr>
+      <w:tr>
+        <w:tc>
+          <w:tcPr>
+            <w:tcW w:type="dxa" w:w="1960"/>
             <w:tcBorders>
               <w:top w:val="single" w:color="CCCCCC" w:sz="1"/>
               <w:left w:val="single" w:color="CCCCCC" w:sz="1"/>
@@ -1562,22 +1563,22 @@
           </w:tcPr>
           <w:p>
             <w:pPr>
-              <w:jc w:val="center"/>
-            </w:pPr>
-            <w:r>
-              <w:rPr>
-                <w:rFonts w:ascii="Arial" w:cs="Arial" w:eastAsia="Arial" w:hAnsi="Arial"/>
-                <w:color w:val="1A1A1A"/>
-                <w:sz w:val="20"/>
-                <w:szCs w:val="20"/>
-              </w:rPr>
-              <w:t xml:space="preserve">可交付</w:t>
-            </w:r>
-          </w:p>
-        </w:tc>
-        <w:tc>
-          <w:tcPr>
-            <w:tcW w:type="dxa" w:w="1480"/>
+              <w:jc w:val="left"/>
+            </w:pPr>
+            <w:r>
+              <w:rPr>
+                <w:rFonts w:ascii="Arial" w:cs="Arial" w:eastAsia="Arial" w:hAnsi="Arial"/>
+                <w:color w:val="1A1A1A"/>
+                <w:sz w:val="20"/>
+                <w:szCs w:val="20"/>
+              </w:rPr>
+              <w:t xml:space="preserve">智能客服 / 多轮对话</w:t>
+            </w:r>
+          </w:p>
+        </w:tc>
+        <w:tc>
+          <w:tcPr>
+            <w:tcW w:type="dxa" w:w="2560"/>
             <w:tcBorders>
               <w:top w:val="single" w:color="CCCCCC" w:sz="1"/>
               <w:left w:val="single" w:color="CCCCCC" w:sz="1"/>
@@ -1594,22 +1595,22 @@
           </w:tcPr>
           <w:p>
             <w:pPr>
-              <w:jc w:val="center"/>
-            </w:pPr>
-            <w:r>
-              <w:rPr>
-                <w:rFonts w:ascii="Arial" w:cs="Arial" w:eastAsia="Arial" w:hAnsi="Arial"/>
-                <w:color w:val="1A1A1A"/>
-                <w:sz w:val="20"/>
-                <w:szCs w:val="20"/>
-              </w:rPr>
-              <w:t xml:space="preserve">★★★★☆</w:t>
-            </w:r>
-          </w:p>
-        </w:tc>
-        <w:tc>
-          <w:tcPr>
-            <w:tcW w:type="dxa" w:w="1400"/>
+              <w:jc w:val="left"/>
+            </w:pPr>
+            <w:r>
+              <w:rPr>
+                <w:rFonts w:ascii="Arial" w:cs="Arial" w:eastAsia="Arial" w:hAnsi="Arial"/>
+                <w:color w:val="1A1A1A"/>
+                <w:sz w:val="20"/>
+                <w:szCs w:val="20"/>
+              </w:rPr>
+              <w:t xml:space="preserve">降低人工客服成本，提升响应质量</w:t>
+            </w:r>
+          </w:p>
+        </w:tc>
+        <w:tc>
+          <w:tcPr>
+            <w:tcW w:type="dxa" w:w="1080"/>
             <w:tcBorders>
               <w:top w:val="single" w:color="CCCCCC" w:sz="1"/>
               <w:left w:val="single" w:color="CCCCCC" w:sz="1"/>
@@ -1635,15 +1636,13 @@
                 <w:sz w:val="20"/>
                 <w:szCs w:val="20"/>
               </w:rPr>
-              <w:t xml:space="preserve">中 ★★☆</w:t>
-            </w:r>
-          </w:p>
-        </w:tc>
-      </w:tr>
-      <w:tr>
-        <w:tc>
-          <w:tcPr>
-            <w:tcW w:type="dxa" w:w="2200"/>
+              <w:t xml:space="preserve">可交付</w:t>
+            </w:r>
+          </w:p>
+        </w:tc>
+        <w:tc>
+          <w:tcPr>
+            <w:tcW w:type="dxa" w:w="880"/>
             <w:tcBorders>
               <w:top w:val="single" w:color="CCCCCC" w:sz="1"/>
               <w:left w:val="single" w:color="CCCCCC" w:sz="1"/>
@@ -1660,22 +1659,22 @@
           </w:tcPr>
           <w:p>
             <w:pPr>
-              <w:jc w:val="left"/>
-            </w:pPr>
-            <w:r>
-              <w:rPr>
-                <w:rFonts w:ascii="Arial" w:cs="Arial" w:eastAsia="Arial" w:hAnsi="Arial"/>
-                <w:color w:val="1A1A1A"/>
-                <w:sz w:val="20"/>
-                <w:szCs w:val="20"/>
-              </w:rPr>
-              <w:t xml:space="preserve">自然语言 Excel 分析</w:t>
-            </w:r>
-          </w:p>
-        </w:tc>
-        <w:tc>
-          <w:tcPr>
-            <w:tcW w:type="dxa" w:w="2800"/>
+              <w:jc w:val="center"/>
+            </w:pPr>
+            <w:r>
+              <w:rPr>
+                <w:rFonts w:ascii="Arial" w:cs="Arial" w:eastAsia="Arial" w:hAnsi="Arial"/>
+                <w:color w:val="1A1A1A"/>
+                <w:sz w:val="20"/>
+                <w:szCs w:val="20"/>
+              </w:rPr>
+              <w:t xml:space="preserve">★★★★★</w:t>
+            </w:r>
+          </w:p>
+        </w:tc>
+        <w:tc>
+          <w:tcPr>
+            <w:tcW w:type="dxa" w:w="880"/>
             <w:tcBorders>
               <w:top w:val="single" w:color="CCCCCC" w:sz="1"/>
               <w:left w:val="single" w:color="CCCCCC" w:sz="1"/>
@@ -1692,22 +1691,22 @@
           </w:tcPr>
           <w:p>
             <w:pPr>
-              <w:jc w:val="left"/>
-            </w:pPr>
-            <w:r>
-              <w:rPr>
-                <w:rFonts w:ascii="Arial" w:cs="Arial" w:eastAsia="Arial" w:hAnsi="Arial"/>
-                <w:color w:val="1A1A1A"/>
-                <w:sz w:val="20"/>
-                <w:szCs w:val="20"/>
-              </w:rPr>
-              <w:t xml:space="preserve">不会数据分析也能问出结论</w:t>
-            </w:r>
-          </w:p>
-        </w:tc>
-        <w:tc>
-          <w:tcPr>
-            <w:tcW w:type="dxa" w:w="1480"/>
+              <w:jc w:val="center"/>
+            </w:pPr>
+            <w:r>
+              <w:rPr>
+                <w:rFonts w:ascii="Arial" w:cs="Arial" w:eastAsia="Arial" w:hAnsi="Arial"/>
+                <w:color w:val="1A1A1A"/>
+                <w:sz w:val="20"/>
+                <w:szCs w:val="20"/>
+              </w:rPr>
+              <w:t xml:space="preserve">中 ★★☆</w:t>
+            </w:r>
+          </w:p>
+        </w:tc>
+        <w:tc>
+          <w:tcPr>
+            <w:tcW w:type="dxa" w:w="2000"/>
             <w:tcBorders>
               <w:top w:val="single" w:color="CCCCCC" w:sz="1"/>
               <w:left w:val="single" w:color="CCCCCC" w:sz="1"/>
@@ -1733,13 +1732,15 @@
                 <w:sz w:val="20"/>
                 <w:szCs w:val="20"/>
               </w:rPr>
-              <w:t xml:space="preserve">可交付</w:t>
-            </w:r>
-          </w:p>
-        </w:tc>
-        <w:tc>
-          <w:tcPr>
-            <w:tcW w:type="dxa" w:w="1480"/>
+              <w:t xml:space="preserve">4.5–6万</w:t>
+            </w:r>
+          </w:p>
+        </w:tc>
+      </w:tr>
+      <w:tr>
+        <w:tc>
+          <w:tcPr>
+            <w:tcW w:type="dxa" w:w="1960"/>
             <w:tcBorders>
               <w:top w:val="single" w:color="CCCCCC" w:sz="1"/>
               <w:left w:val="single" w:color="CCCCCC" w:sz="1"/>
@@ -1756,22 +1757,22 @@
           </w:tcPr>
           <w:p>
             <w:pPr>
-              <w:jc w:val="center"/>
-            </w:pPr>
-            <w:r>
-              <w:rPr>
-                <w:rFonts w:ascii="Arial" w:cs="Arial" w:eastAsia="Arial" w:hAnsi="Arial"/>
-                <w:color w:val="1A1A1A"/>
-                <w:sz w:val="20"/>
-                <w:szCs w:val="20"/>
-              </w:rPr>
-              <w:t xml:space="preserve">★★★★☆</w:t>
-            </w:r>
-          </w:p>
-        </w:tc>
-        <w:tc>
-          <w:tcPr>
-            <w:tcW w:type="dxa" w:w="1400"/>
+              <w:jc w:val="left"/>
+            </w:pPr>
+            <w:r>
+              <w:rPr>
+                <w:rFonts w:ascii="Arial" w:cs="Arial" w:eastAsia="Arial" w:hAnsi="Arial"/>
+                <w:color w:val="1A1A1A"/>
+                <w:sz w:val="20"/>
+                <w:szCs w:val="20"/>
+              </w:rPr>
+              <w:t xml:space="preserve">招聘简历智能筛选</w:t>
+            </w:r>
+          </w:p>
+        </w:tc>
+        <w:tc>
+          <w:tcPr>
+            <w:tcW w:type="dxa" w:w="2560"/>
             <w:tcBorders>
               <w:top w:val="single" w:color="CCCCCC" w:sz="1"/>
               <w:left w:val="single" w:color="CCCCCC" w:sz="1"/>
@@ -1788,24 +1789,22 @@
           </w:tcPr>
           <w:p>
             <w:pPr>
-              <w:jc w:val="center"/>
-            </w:pPr>
-            <w:r>
-              <w:rPr>
-                <w:rFonts w:ascii="Arial" w:cs="Arial" w:eastAsia="Arial" w:hAnsi="Arial"/>
-                <w:color w:val="1A1A1A"/>
-                <w:sz w:val="20"/>
-                <w:szCs w:val="20"/>
-              </w:rPr>
-              <w:t xml:space="preserve">中 ★★☆</w:t>
-            </w:r>
-          </w:p>
-        </w:tc>
-      </w:tr>
-      <w:tr>
-        <w:tc>
-          <w:tcPr>
-            <w:tcW w:type="dxa" w:w="2200"/>
+              <w:jc w:val="left"/>
+            </w:pPr>
+            <w:r>
+              <w:rPr>
+                <w:rFonts w:ascii="Arial" w:cs="Arial" w:eastAsia="Arial" w:hAnsi="Arial"/>
+                <w:color w:val="1A1A1A"/>
+                <w:sz w:val="20"/>
+                <w:szCs w:val="20"/>
+              </w:rPr>
+              <w:t xml:space="preserve">替代人工初筛，快速锁定最佳候选人</w:t>
+            </w:r>
+          </w:p>
+        </w:tc>
+        <w:tc>
+          <w:tcPr>
+            <w:tcW w:type="dxa" w:w="1080"/>
             <w:tcBorders>
               <w:top w:val="single" w:color="CCCCCC" w:sz="1"/>
               <w:left w:val="single" w:color="CCCCCC" w:sz="1"/>
@@ -1822,22 +1821,22 @@
           </w:tcPr>
           <w:p>
             <w:pPr>
-              <w:jc w:val="left"/>
-            </w:pPr>
-            <w:r>
-              <w:rPr>
-                <w:rFonts w:ascii="Arial" w:cs="Arial" w:eastAsia="Arial" w:hAnsi="Arial"/>
-                <w:color w:val="1A1A1A"/>
-                <w:sz w:val="20"/>
-                <w:szCs w:val="20"/>
-              </w:rPr>
-              <w:t xml:space="preserve">竞品 / 行业快速分析</w:t>
-            </w:r>
-          </w:p>
-        </w:tc>
-        <w:tc>
-          <w:tcPr>
-            <w:tcW w:type="dxa" w:w="2800"/>
+              <w:jc w:val="center"/>
+            </w:pPr>
+            <w:r>
+              <w:rPr>
+                <w:rFonts w:ascii="Arial" w:cs="Arial" w:eastAsia="Arial" w:hAnsi="Arial"/>
+                <w:color w:val="1A1A1A"/>
+                <w:sz w:val="20"/>
+                <w:szCs w:val="20"/>
+              </w:rPr>
+              <w:t xml:space="preserve">可交付</w:t>
+            </w:r>
+          </w:p>
+        </w:tc>
+        <w:tc>
+          <w:tcPr>
+            <w:tcW w:type="dxa" w:w="880"/>
             <w:tcBorders>
               <w:top w:val="single" w:color="CCCCCC" w:sz="1"/>
               <w:left w:val="single" w:color="CCCCCC" w:sz="1"/>
@@ -1854,22 +1853,22 @@
           </w:tcPr>
           <w:p>
             <w:pPr>
-              <w:jc w:val="left"/>
-            </w:pPr>
-            <w:r>
-              <w:rPr>
-                <w:rFonts w:ascii="Arial" w:cs="Arial" w:eastAsia="Arial" w:hAnsi="Arial"/>
-                <w:color w:val="1A1A1A"/>
-                <w:sz w:val="20"/>
-                <w:szCs w:val="20"/>
-              </w:rPr>
-              <w:t xml:space="preserve">输入资料，分钟级输出结构化竞品报告</w:t>
-            </w:r>
-          </w:p>
-        </w:tc>
-        <w:tc>
-          <w:tcPr>
-            <w:tcW w:type="dxa" w:w="1480"/>
+              <w:jc w:val="center"/>
+            </w:pPr>
+            <w:r>
+              <w:rPr>
+                <w:rFonts w:ascii="Arial" w:cs="Arial" w:eastAsia="Arial" w:hAnsi="Arial"/>
+                <w:color w:val="1A1A1A"/>
+                <w:sz w:val="20"/>
+                <w:szCs w:val="20"/>
+              </w:rPr>
+              <w:t xml:space="preserve">★★★★☆</w:t>
+            </w:r>
+          </w:p>
+        </w:tc>
+        <w:tc>
+          <w:tcPr>
+            <w:tcW w:type="dxa" w:w="880"/>
             <w:tcBorders>
               <w:top w:val="single" w:color="CCCCCC" w:sz="1"/>
               <w:left w:val="single" w:color="CCCCCC" w:sz="1"/>
@@ -1895,13 +1894,13 @@
                 <w:sz w:val="20"/>
                 <w:szCs w:val="20"/>
               </w:rPr>
-              <w:t xml:space="preserve">可交付</w:t>
-            </w:r>
-          </w:p>
-        </w:tc>
-        <w:tc>
-          <w:tcPr>
-            <w:tcW w:type="dxa" w:w="1480"/>
+              <w:t xml:space="preserve">中 ★★☆</w:t>
+            </w:r>
+          </w:p>
+        </w:tc>
+        <w:tc>
+          <w:tcPr>
+            <w:tcW w:type="dxa" w:w="2000"/>
             <w:tcBorders>
               <w:top w:val="single" w:color="CCCCCC" w:sz="1"/>
               <w:left w:val="single" w:color="CCCCCC" w:sz="1"/>
@@ -1927,13 +1926,15 @@
                 <w:sz w:val="20"/>
                 <w:szCs w:val="20"/>
               </w:rPr>
-              <w:t xml:space="preserve">★★★★☆</w:t>
-            </w:r>
-          </w:p>
-        </w:tc>
-        <w:tc>
-          <w:tcPr>
-            <w:tcW w:type="dxa" w:w="1400"/>
+              <w:t xml:space="preserve">3–4.5万</w:t>
+            </w:r>
+          </w:p>
+        </w:tc>
+      </w:tr>
+      <w:tr>
+        <w:tc>
+          <w:tcPr>
+            <w:tcW w:type="dxa" w:w="1960"/>
             <w:tcBorders>
               <w:top w:val="single" w:color="CCCCCC" w:sz="1"/>
               <w:left w:val="single" w:color="CCCCCC" w:sz="1"/>
@@ -1950,24 +1951,22 @@
           </w:tcPr>
           <w:p>
             <w:pPr>
-              <w:jc w:val="center"/>
-            </w:pPr>
-            <w:r>
-              <w:rPr>
-                <w:rFonts w:ascii="Arial" w:cs="Arial" w:eastAsia="Arial" w:hAnsi="Arial"/>
-                <w:color w:val="1A1A1A"/>
-                <w:sz w:val="20"/>
-                <w:szCs w:val="20"/>
-              </w:rPr>
-              <w:t xml:space="preserve">低 ★☆☆</w:t>
-            </w:r>
-          </w:p>
-        </w:tc>
-      </w:tr>
-      <w:tr>
-        <w:tc>
-          <w:tcPr>
-            <w:tcW w:type="dxa" w:w="2200"/>
+              <w:jc w:val="left"/>
+            </w:pPr>
+            <w:r>
+              <w:rPr>
+                <w:rFonts w:ascii="Arial" w:cs="Arial" w:eastAsia="Arial" w:hAnsi="Arial"/>
+                <w:color w:val="1A1A1A"/>
+                <w:sz w:val="20"/>
+                <w:szCs w:val="20"/>
+              </w:rPr>
+              <w:t xml:space="preserve">自然语言 Excel 分析</w:t>
+            </w:r>
+          </w:p>
+        </w:tc>
+        <w:tc>
+          <w:tcPr>
+            <w:tcW w:type="dxa" w:w="2560"/>
             <w:tcBorders>
               <w:top w:val="single" w:color="CCCCCC" w:sz="1"/>
               <w:left w:val="single" w:color="CCCCCC" w:sz="1"/>
@@ -1993,13 +1992,13 @@
                 <w:sz w:val="20"/>
                 <w:szCs w:val="20"/>
               </w:rPr>
-              <w:t xml:space="preserve">客户画像自动生成</w:t>
-            </w:r>
-          </w:p>
-        </w:tc>
-        <w:tc>
-          <w:tcPr>
-            <w:tcW w:type="dxa" w:w="2800"/>
+              <w:t xml:space="preserve">不会数据分析也能问出结论</w:t>
+            </w:r>
+          </w:p>
+        </w:tc>
+        <w:tc>
+          <w:tcPr>
+            <w:tcW w:type="dxa" w:w="1080"/>
             <w:tcBorders>
               <w:top w:val="single" w:color="CCCCCC" w:sz="1"/>
               <w:left w:val="single" w:color="CCCCCC" w:sz="1"/>
@@ -2016,22 +2015,22 @@
           </w:tcPr>
           <w:p>
             <w:pPr>
-              <w:jc w:val="left"/>
-            </w:pPr>
-            <w:r>
-              <w:rPr>
-                <w:rFonts w:ascii="Arial" w:cs="Arial" w:eastAsia="Arial" w:hAnsi="Arial"/>
-                <w:color w:val="1A1A1A"/>
-                <w:sz w:val="20"/>
-                <w:szCs w:val="20"/>
-              </w:rPr>
-              <w:t xml:space="preserve">从对话和行为数据中自动提炼客户洞察</w:t>
-            </w:r>
-          </w:p>
-        </w:tc>
-        <w:tc>
-          <w:tcPr>
-            <w:tcW w:type="dxa" w:w="1480"/>
+              <w:jc w:val="center"/>
+            </w:pPr>
+            <w:r>
+              <w:rPr>
+                <w:rFonts w:ascii="Arial" w:cs="Arial" w:eastAsia="Arial" w:hAnsi="Arial"/>
+                <w:color w:val="1A1A1A"/>
+                <w:sz w:val="20"/>
+                <w:szCs w:val="20"/>
+              </w:rPr>
+              <w:t xml:space="preserve">可交付</w:t>
+            </w:r>
+          </w:p>
+        </w:tc>
+        <w:tc>
+          <w:tcPr>
+            <w:tcW w:type="dxa" w:w="880"/>
             <w:tcBorders>
               <w:top w:val="single" w:color="CCCCCC" w:sz="1"/>
               <w:left w:val="single" w:color="CCCCCC" w:sz="1"/>
@@ -2057,13 +2056,13 @@
                 <w:sz w:val="20"/>
                 <w:szCs w:val="20"/>
               </w:rPr>
-              <w:t xml:space="preserve">可交付</w:t>
-            </w:r>
-          </w:p>
-        </w:tc>
-        <w:tc>
-          <w:tcPr>
-            <w:tcW w:type="dxa" w:w="1480"/>
+              <w:t xml:space="preserve">★★★★☆</w:t>
+            </w:r>
+          </w:p>
+        </w:tc>
+        <w:tc>
+          <w:tcPr>
+            <w:tcW w:type="dxa" w:w="880"/>
             <w:tcBorders>
               <w:top w:val="single" w:color="CCCCCC" w:sz="1"/>
               <w:left w:val="single" w:color="CCCCCC" w:sz="1"/>
@@ -2089,13 +2088,13 @@
                 <w:sz w:val="20"/>
                 <w:szCs w:val="20"/>
               </w:rPr>
-              <w:t xml:space="preserve">★★★★☆</w:t>
-            </w:r>
-          </w:p>
-        </w:tc>
-        <w:tc>
-          <w:tcPr>
-            <w:tcW w:type="dxa" w:w="1400"/>
+              <w:t xml:space="preserve">中 ★★☆</w:t>
+            </w:r>
+          </w:p>
+        </w:tc>
+        <w:tc>
+          <w:tcPr>
+            <w:tcW w:type="dxa" w:w="2000"/>
             <w:tcBorders>
               <w:top w:val="single" w:color="CCCCCC" w:sz="1"/>
               <w:left w:val="single" w:color="CCCCCC" w:sz="1"/>
@@ -2121,7 +2120,7 @@
                 <w:sz w:val="20"/>
                 <w:szCs w:val="20"/>
               </w:rPr>
-              <w:t xml:space="preserve">中 ★★☆</w:t>
+              <w:t xml:space="preserve">3–4.5万</w:t>
             </w:r>
           </w:p>
         </w:tc>
@@ -2129,7 +2128,7 @@
       <w:tr>
         <w:tc>
           <w:tcPr>
-            <w:tcW w:type="dxa" w:w="2200"/>
+            <w:tcW w:type="dxa" w:w="1960"/>
             <w:tcBorders>
               <w:top w:val="single" w:color="CCCCCC" w:sz="1"/>
               <w:left w:val="single" w:color="CCCCCC" w:sz="1"/>
@@ -2155,13 +2154,13 @@
                 <w:sz w:val="20"/>
                 <w:szCs w:val="20"/>
               </w:rPr>
-              <w:t xml:space="preserve">AI 培训题库生成</w:t>
-            </w:r>
-          </w:p>
-        </w:tc>
-        <w:tc>
-          <w:tcPr>
-            <w:tcW w:type="dxa" w:w="2800"/>
+              <w:t xml:space="preserve">竞品 / 行业快速分析</w:t>
+            </w:r>
+          </w:p>
+        </w:tc>
+        <w:tc>
+          <w:tcPr>
+            <w:tcW w:type="dxa" w:w="2560"/>
             <w:tcBorders>
               <w:top w:val="single" w:color="CCCCCC" w:sz="1"/>
               <w:left w:val="single" w:color="CCCCCC" w:sz="1"/>
@@ -2187,13 +2186,13 @@
                 <w:sz w:val="20"/>
                 <w:szCs w:val="20"/>
               </w:rPr>
-              <w:t xml:space="preserve">上传材料，自动生成覆盖全面的考题和练习</w:t>
-            </w:r>
-          </w:p>
-        </w:tc>
-        <w:tc>
-          <w:tcPr>
-            <w:tcW w:type="dxa" w:w="1480"/>
+              <w:t xml:space="preserve">输入资料，分钟级输出结构化竞品报告</w:t>
+            </w:r>
+          </w:p>
+        </w:tc>
+        <w:tc>
+          <w:tcPr>
+            <w:tcW w:type="dxa" w:w="1080"/>
             <w:tcBorders>
               <w:top w:val="single" w:color="CCCCCC" w:sz="1"/>
               <w:left w:val="single" w:color="CCCCCC" w:sz="1"/>
@@ -2225,7 +2224,7 @@
         </w:tc>
         <w:tc>
           <w:tcPr>
-            <w:tcW w:type="dxa" w:w="1480"/>
+            <w:tcW w:type="dxa" w:w="880"/>
             <w:tcBorders>
               <w:top w:val="single" w:color="CCCCCC" w:sz="1"/>
               <w:left w:val="single" w:color="CCCCCC" w:sz="1"/>
@@ -2257,7 +2256,7 @@
         </w:tc>
         <w:tc>
           <w:tcPr>
-            <w:tcW w:type="dxa" w:w="1400"/>
+            <w:tcW w:type="dxa" w:w="880"/>
             <w:tcBorders>
               <w:top w:val="single" w:color="CCCCCC" w:sz="1"/>
               <w:left w:val="single" w:color="CCCCCC" w:sz="1"/>
@@ -2287,11 +2286,9 @@
             </w:r>
           </w:p>
         </w:tc>
-      </w:tr>
-      <w:tr>
-        <w:tc>
-          <w:tcPr>
-            <w:tcW w:type="dxa" w:w="2200"/>
+        <w:tc>
+          <w:tcPr>
+            <w:tcW w:type="dxa" w:w="2000"/>
             <w:tcBorders>
               <w:top w:val="single" w:color="CCCCCC" w:sz="1"/>
               <w:left w:val="single" w:color="CCCCCC" w:sz="1"/>
@@ -2308,22 +2305,24 @@
           </w:tcPr>
           <w:p>
             <w:pPr>
-              <w:jc w:val="left"/>
-            </w:pPr>
-            <w:r>
-              <w:rPr>
-                <w:rFonts w:ascii="Arial" w:cs="Arial" w:eastAsia="Arial" w:hAnsi="Arial"/>
-                <w:color w:val="1A1A1A"/>
-                <w:sz w:val="20"/>
-                <w:szCs w:val="20"/>
-              </w:rPr>
-              <w:t xml:space="preserve">AI 文本摘要与总结</w:t>
-            </w:r>
-          </w:p>
-        </w:tc>
-        <w:tc>
-          <w:tcPr>
-            <w:tcW w:type="dxa" w:w="2800"/>
+              <w:jc w:val="center"/>
+            </w:pPr>
+            <w:r>
+              <w:rPr>
+                <w:rFonts w:ascii="Arial" w:cs="Arial" w:eastAsia="Arial" w:hAnsi="Arial"/>
+                <w:color w:val="1A1A1A"/>
+                <w:sz w:val="20"/>
+                <w:szCs w:val="20"/>
+              </w:rPr>
+              <w:t xml:space="preserve">1.5–2.5万</w:t>
+            </w:r>
+          </w:p>
+        </w:tc>
+      </w:tr>
+      <w:tr>
+        <w:tc>
+          <w:tcPr>
+            <w:tcW w:type="dxa" w:w="1960"/>
             <w:tcBorders>
               <w:top w:val="single" w:color="CCCCCC" w:sz="1"/>
               <w:left w:val="single" w:color="CCCCCC" w:sz="1"/>
@@ -2349,13 +2348,13 @@
                 <w:sz w:val="20"/>
                 <w:szCs w:val="20"/>
               </w:rPr>
-              <w:t xml:space="preserve">长文档秒变精华，关键信息不遗漏</w:t>
-            </w:r>
-          </w:p>
-        </w:tc>
-        <w:tc>
-          <w:tcPr>
-            <w:tcW w:type="dxa" w:w="1480"/>
+              <w:t xml:space="preserve">客户画像自动生成</w:t>
+            </w:r>
+          </w:p>
+        </w:tc>
+        <w:tc>
+          <w:tcPr>
+            <w:tcW w:type="dxa" w:w="2560"/>
             <w:tcBorders>
               <w:top w:val="single" w:color="CCCCCC" w:sz="1"/>
               <w:left w:val="single" w:color="CCCCCC" w:sz="1"/>
@@ -2372,22 +2371,22 @@
           </w:tcPr>
           <w:p>
             <w:pPr>
-              <w:jc w:val="center"/>
-            </w:pPr>
-            <w:r>
-              <w:rPr>
-                <w:rFonts w:ascii="Arial" w:cs="Arial" w:eastAsia="Arial" w:hAnsi="Arial"/>
-                <w:color w:val="1A1A1A"/>
-                <w:sz w:val="20"/>
-                <w:szCs w:val="20"/>
-              </w:rPr>
-              <w:t xml:space="preserve">可交付</w:t>
-            </w:r>
-          </w:p>
-        </w:tc>
-        <w:tc>
-          <w:tcPr>
-            <w:tcW w:type="dxa" w:w="1480"/>
+              <w:jc w:val="left"/>
+            </w:pPr>
+            <w:r>
+              <w:rPr>
+                <w:rFonts w:ascii="Arial" w:cs="Arial" w:eastAsia="Arial" w:hAnsi="Arial"/>
+                <w:color w:val="1A1A1A"/>
+                <w:sz w:val="20"/>
+                <w:szCs w:val="20"/>
+              </w:rPr>
+              <w:t xml:space="preserve">从对话和行为数据中自动提炼客户洞察</w:t>
+            </w:r>
+          </w:p>
+        </w:tc>
+        <w:tc>
+          <w:tcPr>
+            <w:tcW w:type="dxa" w:w="1080"/>
             <w:tcBorders>
               <w:top w:val="single" w:color="CCCCCC" w:sz="1"/>
               <w:left w:val="single" w:color="CCCCCC" w:sz="1"/>
@@ -2413,13 +2412,13 @@
                 <w:sz w:val="20"/>
                 <w:szCs w:val="20"/>
               </w:rPr>
-              <w:t xml:space="preserve">★★★★☆</w:t>
-            </w:r>
-          </w:p>
-        </w:tc>
-        <w:tc>
-          <w:tcPr>
-            <w:tcW w:type="dxa" w:w="1400"/>
+              <w:t xml:space="preserve">可交付</w:t>
+            </w:r>
+          </w:p>
+        </w:tc>
+        <w:tc>
+          <w:tcPr>
+            <w:tcW w:type="dxa" w:w="880"/>
             <w:tcBorders>
               <w:top w:val="single" w:color="CCCCCC" w:sz="1"/>
               <w:left w:val="single" w:color="CCCCCC" w:sz="1"/>
@@ -2445,7 +2444,459 @@
                 <w:sz w:val="20"/>
                 <w:szCs w:val="20"/>
               </w:rPr>
+              <w:t xml:space="preserve">★★★★☆</w:t>
+            </w:r>
+          </w:p>
+        </w:tc>
+        <w:tc>
+          <w:tcPr>
+            <w:tcW w:type="dxa" w:w="880"/>
+            <w:tcBorders>
+              <w:top w:val="single" w:color="CCCCCC" w:sz="1"/>
+              <w:left w:val="single" w:color="CCCCCC" w:sz="1"/>
+              <w:bottom w:val="single" w:color="CCCCCC" w:sz="1"/>
+              <w:right w:val="single" w:color="CCCCCC" w:sz="1"/>
+            </w:tcBorders>
+            <w:shd w:fill="FFFFFF" w:val="clear"/>
+            <w:tcMar>
+              <w:top w:type="dxa" w:w="80"/>
+              <w:left w:type="dxa" w:w="120"/>
+              <w:bottom w:type="dxa" w:w="80"/>
+              <w:right w:type="dxa" w:w="120"/>
+            </w:tcMar>
+          </w:tcPr>
+          <w:p>
+            <w:pPr>
+              <w:jc w:val="center"/>
+            </w:pPr>
+            <w:r>
+              <w:rPr>
+                <w:rFonts w:ascii="Arial" w:cs="Arial" w:eastAsia="Arial" w:hAnsi="Arial"/>
+                <w:color w:val="1A1A1A"/>
+                <w:sz w:val="20"/>
+                <w:szCs w:val="20"/>
+              </w:rPr>
+              <w:t xml:space="preserve">中 ★★☆</w:t>
+            </w:r>
+          </w:p>
+        </w:tc>
+        <w:tc>
+          <w:tcPr>
+            <w:tcW w:type="dxa" w:w="2000"/>
+            <w:tcBorders>
+              <w:top w:val="single" w:color="CCCCCC" w:sz="1"/>
+              <w:left w:val="single" w:color="CCCCCC" w:sz="1"/>
+              <w:bottom w:val="single" w:color="CCCCCC" w:sz="1"/>
+              <w:right w:val="single" w:color="CCCCCC" w:sz="1"/>
+            </w:tcBorders>
+            <w:shd w:fill="FFFFFF" w:val="clear"/>
+            <w:tcMar>
+              <w:top w:type="dxa" w:w="80"/>
+              <w:left w:type="dxa" w:w="120"/>
+              <w:bottom w:type="dxa" w:w="80"/>
+              <w:right w:type="dxa" w:w="120"/>
+            </w:tcMar>
+          </w:tcPr>
+          <w:p>
+            <w:pPr>
+              <w:jc w:val="center"/>
+            </w:pPr>
+            <w:r>
+              <w:rPr>
+                <w:rFonts w:ascii="Arial" w:cs="Arial" w:eastAsia="Arial" w:hAnsi="Arial"/>
+                <w:color w:val="1A1A1A"/>
+                <w:sz w:val="20"/>
+                <w:szCs w:val="20"/>
+              </w:rPr>
+              <w:t xml:space="preserve">3–4.5万</w:t>
+            </w:r>
+          </w:p>
+        </w:tc>
+      </w:tr>
+      <w:tr>
+        <w:tc>
+          <w:tcPr>
+            <w:tcW w:type="dxa" w:w="1960"/>
+            <w:tcBorders>
+              <w:top w:val="single" w:color="CCCCCC" w:sz="1"/>
+              <w:left w:val="single" w:color="CCCCCC" w:sz="1"/>
+              <w:bottom w:val="single" w:color="CCCCCC" w:sz="1"/>
+              <w:right w:val="single" w:color="CCCCCC" w:sz="1"/>
+            </w:tcBorders>
+            <w:shd w:fill="FFFFFF" w:val="clear"/>
+            <w:tcMar>
+              <w:top w:type="dxa" w:w="80"/>
+              <w:left w:type="dxa" w:w="120"/>
+              <w:bottom w:type="dxa" w:w="80"/>
+              <w:right w:type="dxa" w:w="120"/>
+            </w:tcMar>
+          </w:tcPr>
+          <w:p>
+            <w:pPr>
+              <w:jc w:val="left"/>
+            </w:pPr>
+            <w:r>
+              <w:rPr>
+                <w:rFonts w:ascii="Arial" w:cs="Arial" w:eastAsia="Arial" w:hAnsi="Arial"/>
+                <w:color w:val="1A1A1A"/>
+                <w:sz w:val="20"/>
+                <w:szCs w:val="20"/>
+              </w:rPr>
+              <w:t xml:space="preserve">AI 培训题库生成</w:t>
+            </w:r>
+          </w:p>
+        </w:tc>
+        <w:tc>
+          <w:tcPr>
+            <w:tcW w:type="dxa" w:w="2560"/>
+            <w:tcBorders>
+              <w:top w:val="single" w:color="CCCCCC" w:sz="1"/>
+              <w:left w:val="single" w:color="CCCCCC" w:sz="1"/>
+              <w:bottom w:val="single" w:color="CCCCCC" w:sz="1"/>
+              <w:right w:val="single" w:color="CCCCCC" w:sz="1"/>
+            </w:tcBorders>
+            <w:shd w:fill="FFFFFF" w:val="clear"/>
+            <w:tcMar>
+              <w:top w:type="dxa" w:w="80"/>
+              <w:left w:type="dxa" w:w="120"/>
+              <w:bottom w:type="dxa" w:w="80"/>
+              <w:right w:type="dxa" w:w="120"/>
+            </w:tcMar>
+          </w:tcPr>
+          <w:p>
+            <w:pPr>
+              <w:jc w:val="left"/>
+            </w:pPr>
+            <w:r>
+              <w:rPr>
+                <w:rFonts w:ascii="Arial" w:cs="Arial" w:eastAsia="Arial" w:hAnsi="Arial"/>
+                <w:color w:val="1A1A1A"/>
+                <w:sz w:val="20"/>
+                <w:szCs w:val="20"/>
+              </w:rPr>
+              <w:t xml:space="preserve">上传材料，自动生成覆盖全面的考题和练习</w:t>
+            </w:r>
+          </w:p>
+        </w:tc>
+        <w:tc>
+          <w:tcPr>
+            <w:tcW w:type="dxa" w:w="1080"/>
+            <w:tcBorders>
+              <w:top w:val="single" w:color="CCCCCC" w:sz="1"/>
+              <w:left w:val="single" w:color="CCCCCC" w:sz="1"/>
+              <w:bottom w:val="single" w:color="CCCCCC" w:sz="1"/>
+              <w:right w:val="single" w:color="CCCCCC" w:sz="1"/>
+            </w:tcBorders>
+            <w:shd w:fill="FFFFFF" w:val="clear"/>
+            <w:tcMar>
+              <w:top w:type="dxa" w:w="80"/>
+              <w:left w:type="dxa" w:w="120"/>
+              <w:bottom w:type="dxa" w:w="80"/>
+              <w:right w:type="dxa" w:w="120"/>
+            </w:tcMar>
+          </w:tcPr>
+          <w:p>
+            <w:pPr>
+              <w:jc w:val="center"/>
+            </w:pPr>
+            <w:r>
+              <w:rPr>
+                <w:rFonts w:ascii="Arial" w:cs="Arial" w:eastAsia="Arial" w:hAnsi="Arial"/>
+                <w:color w:val="1A1A1A"/>
+                <w:sz w:val="20"/>
+                <w:szCs w:val="20"/>
+              </w:rPr>
+              <w:t xml:space="preserve">可交付</w:t>
+            </w:r>
+          </w:p>
+        </w:tc>
+        <w:tc>
+          <w:tcPr>
+            <w:tcW w:type="dxa" w:w="880"/>
+            <w:tcBorders>
+              <w:top w:val="single" w:color="CCCCCC" w:sz="1"/>
+              <w:left w:val="single" w:color="CCCCCC" w:sz="1"/>
+              <w:bottom w:val="single" w:color="CCCCCC" w:sz="1"/>
+              <w:right w:val="single" w:color="CCCCCC" w:sz="1"/>
+            </w:tcBorders>
+            <w:shd w:fill="FFFFFF" w:val="clear"/>
+            <w:tcMar>
+              <w:top w:type="dxa" w:w="80"/>
+              <w:left w:type="dxa" w:w="120"/>
+              <w:bottom w:type="dxa" w:w="80"/>
+              <w:right w:type="dxa" w:w="120"/>
+            </w:tcMar>
+          </w:tcPr>
+          <w:p>
+            <w:pPr>
+              <w:jc w:val="center"/>
+            </w:pPr>
+            <w:r>
+              <w:rPr>
+                <w:rFonts w:ascii="Arial" w:cs="Arial" w:eastAsia="Arial" w:hAnsi="Arial"/>
+                <w:color w:val="1A1A1A"/>
+                <w:sz w:val="20"/>
+                <w:szCs w:val="20"/>
+              </w:rPr>
+              <w:t xml:space="preserve">★★★★☆</w:t>
+            </w:r>
+          </w:p>
+        </w:tc>
+        <w:tc>
+          <w:tcPr>
+            <w:tcW w:type="dxa" w:w="880"/>
+            <w:tcBorders>
+              <w:top w:val="single" w:color="CCCCCC" w:sz="1"/>
+              <w:left w:val="single" w:color="CCCCCC" w:sz="1"/>
+              <w:bottom w:val="single" w:color="CCCCCC" w:sz="1"/>
+              <w:right w:val="single" w:color="CCCCCC" w:sz="1"/>
+            </w:tcBorders>
+            <w:shd w:fill="FFFFFF" w:val="clear"/>
+            <w:tcMar>
+              <w:top w:type="dxa" w:w="80"/>
+              <w:left w:type="dxa" w:w="120"/>
+              <w:bottom w:type="dxa" w:w="80"/>
+              <w:right w:type="dxa" w:w="120"/>
+            </w:tcMar>
+          </w:tcPr>
+          <w:p>
+            <w:pPr>
+              <w:jc w:val="center"/>
+            </w:pPr>
+            <w:r>
+              <w:rPr>
+                <w:rFonts w:ascii="Arial" w:cs="Arial" w:eastAsia="Arial" w:hAnsi="Arial"/>
+                <w:color w:val="1A1A1A"/>
+                <w:sz w:val="20"/>
+                <w:szCs w:val="20"/>
+              </w:rPr>
               <w:t xml:space="preserve">低 ★☆☆</w:t>
+            </w:r>
+          </w:p>
+        </w:tc>
+        <w:tc>
+          <w:tcPr>
+            <w:tcW w:type="dxa" w:w="2000"/>
+            <w:tcBorders>
+              <w:top w:val="single" w:color="CCCCCC" w:sz="1"/>
+              <w:left w:val="single" w:color="CCCCCC" w:sz="1"/>
+              <w:bottom w:val="single" w:color="CCCCCC" w:sz="1"/>
+              <w:right w:val="single" w:color="CCCCCC" w:sz="1"/>
+            </w:tcBorders>
+            <w:shd w:fill="FFFFFF" w:val="clear"/>
+            <w:tcMar>
+              <w:top w:type="dxa" w:w="80"/>
+              <w:left w:type="dxa" w:w="120"/>
+              <w:bottom w:type="dxa" w:w="80"/>
+              <w:right w:type="dxa" w:w="120"/>
+            </w:tcMar>
+          </w:tcPr>
+          <w:p>
+            <w:pPr>
+              <w:jc w:val="center"/>
+            </w:pPr>
+            <w:r>
+              <w:rPr>
+                <w:rFonts w:ascii="Arial" w:cs="Arial" w:eastAsia="Arial" w:hAnsi="Arial"/>
+                <w:color w:val="1A1A1A"/>
+                <w:sz w:val="20"/>
+                <w:szCs w:val="20"/>
+              </w:rPr>
+              <w:t xml:space="preserve">1.5–2.5万</w:t>
+            </w:r>
+          </w:p>
+        </w:tc>
+      </w:tr>
+      <w:tr>
+        <w:tc>
+          <w:tcPr>
+            <w:tcW w:type="dxa" w:w="1960"/>
+            <w:tcBorders>
+              <w:top w:val="single" w:color="CCCCCC" w:sz="1"/>
+              <w:left w:val="single" w:color="CCCCCC" w:sz="1"/>
+              <w:bottom w:val="single" w:color="CCCCCC" w:sz="1"/>
+              <w:right w:val="single" w:color="CCCCCC" w:sz="1"/>
+            </w:tcBorders>
+            <w:shd w:fill="FFFFFF" w:val="clear"/>
+            <w:tcMar>
+              <w:top w:type="dxa" w:w="80"/>
+              <w:left w:type="dxa" w:w="120"/>
+              <w:bottom w:type="dxa" w:w="80"/>
+              <w:right w:type="dxa" w:w="120"/>
+            </w:tcMar>
+          </w:tcPr>
+          <w:p>
+            <w:pPr>
+              <w:jc w:val="left"/>
+            </w:pPr>
+            <w:r>
+              <w:rPr>
+                <w:rFonts w:ascii="Arial" w:cs="Arial" w:eastAsia="Arial" w:hAnsi="Arial"/>
+                <w:color w:val="1A1A1A"/>
+                <w:sz w:val="20"/>
+                <w:szCs w:val="20"/>
+              </w:rPr>
+              <w:t xml:space="preserve">AI 文本摘要与总结</w:t>
+            </w:r>
+          </w:p>
+        </w:tc>
+        <w:tc>
+          <w:tcPr>
+            <w:tcW w:type="dxa" w:w="2560"/>
+            <w:tcBorders>
+              <w:top w:val="single" w:color="CCCCCC" w:sz="1"/>
+              <w:left w:val="single" w:color="CCCCCC" w:sz="1"/>
+              <w:bottom w:val="single" w:color="CCCCCC" w:sz="1"/>
+              <w:right w:val="single" w:color="CCCCCC" w:sz="1"/>
+            </w:tcBorders>
+            <w:shd w:fill="FFFFFF" w:val="clear"/>
+            <w:tcMar>
+              <w:top w:type="dxa" w:w="80"/>
+              <w:left w:type="dxa" w:w="120"/>
+              <w:bottom w:type="dxa" w:w="80"/>
+              <w:right w:type="dxa" w:w="120"/>
+            </w:tcMar>
+          </w:tcPr>
+          <w:p>
+            <w:pPr>
+              <w:jc w:val="left"/>
+            </w:pPr>
+            <w:r>
+              <w:rPr>
+                <w:rFonts w:ascii="Arial" w:cs="Arial" w:eastAsia="Arial" w:hAnsi="Arial"/>
+                <w:color w:val="1A1A1A"/>
+                <w:sz w:val="20"/>
+                <w:szCs w:val="20"/>
+              </w:rPr>
+              <w:t xml:space="preserve">长文档秒变精华，关键信息不遗漏</w:t>
+            </w:r>
+          </w:p>
+        </w:tc>
+        <w:tc>
+          <w:tcPr>
+            <w:tcW w:type="dxa" w:w="1080"/>
+            <w:tcBorders>
+              <w:top w:val="single" w:color="CCCCCC" w:sz="1"/>
+              <w:left w:val="single" w:color="CCCCCC" w:sz="1"/>
+              <w:bottom w:val="single" w:color="CCCCCC" w:sz="1"/>
+              <w:right w:val="single" w:color="CCCCCC" w:sz="1"/>
+            </w:tcBorders>
+            <w:shd w:fill="FFFFFF" w:val="clear"/>
+            <w:tcMar>
+              <w:top w:type="dxa" w:w="80"/>
+              <w:left w:type="dxa" w:w="120"/>
+              <w:bottom w:type="dxa" w:w="80"/>
+              <w:right w:type="dxa" w:w="120"/>
+            </w:tcMar>
+          </w:tcPr>
+          <w:p>
+            <w:pPr>
+              <w:jc w:val="center"/>
+            </w:pPr>
+            <w:r>
+              <w:rPr>
+                <w:rFonts w:ascii="Arial" w:cs="Arial" w:eastAsia="Arial" w:hAnsi="Arial"/>
+                <w:color w:val="1A1A1A"/>
+                <w:sz w:val="20"/>
+                <w:szCs w:val="20"/>
+              </w:rPr>
+              <w:t xml:space="preserve">可交付</w:t>
+            </w:r>
+          </w:p>
+        </w:tc>
+        <w:tc>
+          <w:tcPr>
+            <w:tcW w:type="dxa" w:w="880"/>
+            <w:tcBorders>
+              <w:top w:val="single" w:color="CCCCCC" w:sz="1"/>
+              <w:left w:val="single" w:color="CCCCCC" w:sz="1"/>
+              <w:bottom w:val="single" w:color="CCCCCC" w:sz="1"/>
+              <w:right w:val="single" w:color="CCCCCC" w:sz="1"/>
+            </w:tcBorders>
+            <w:shd w:fill="FFFFFF" w:val="clear"/>
+            <w:tcMar>
+              <w:top w:type="dxa" w:w="80"/>
+              <w:left w:type="dxa" w:w="120"/>
+              <w:bottom w:type="dxa" w:w="80"/>
+              <w:right w:type="dxa" w:w="120"/>
+            </w:tcMar>
+          </w:tcPr>
+          <w:p>
+            <w:pPr>
+              <w:jc w:val="center"/>
+            </w:pPr>
+            <w:r>
+              <w:rPr>
+                <w:rFonts w:ascii="Arial" w:cs="Arial" w:eastAsia="Arial" w:hAnsi="Arial"/>
+                <w:color w:val="1A1A1A"/>
+                <w:sz w:val="20"/>
+                <w:szCs w:val="20"/>
+              </w:rPr>
+              <w:t xml:space="preserve">★★★★☆</w:t>
+            </w:r>
+          </w:p>
+        </w:tc>
+        <w:tc>
+          <w:tcPr>
+            <w:tcW w:type="dxa" w:w="880"/>
+            <w:tcBorders>
+              <w:top w:val="single" w:color="CCCCCC" w:sz="1"/>
+              <w:left w:val="single" w:color="CCCCCC" w:sz="1"/>
+              <w:bottom w:val="single" w:color="CCCCCC" w:sz="1"/>
+              <w:right w:val="single" w:color="CCCCCC" w:sz="1"/>
+            </w:tcBorders>
+            <w:shd w:fill="FFFFFF" w:val="clear"/>
+            <w:tcMar>
+              <w:top w:type="dxa" w:w="80"/>
+              <w:left w:type="dxa" w:w="120"/>
+              <w:bottom w:type="dxa" w:w="80"/>
+              <w:right w:type="dxa" w:w="120"/>
+            </w:tcMar>
+          </w:tcPr>
+          <w:p>
+            <w:pPr>
+              <w:jc w:val="center"/>
+            </w:pPr>
+            <w:r>
+              <w:rPr>
+                <w:rFonts w:ascii="Arial" w:cs="Arial" w:eastAsia="Arial" w:hAnsi="Arial"/>
+                <w:color w:val="1A1A1A"/>
+                <w:sz w:val="20"/>
+                <w:szCs w:val="20"/>
+              </w:rPr>
+              <w:t xml:space="preserve">低 ★☆☆</w:t>
+            </w:r>
+          </w:p>
+        </w:tc>
+        <w:tc>
+          <w:tcPr>
+            <w:tcW w:type="dxa" w:w="2000"/>
+            <w:tcBorders>
+              <w:top w:val="single" w:color="CCCCCC" w:sz="1"/>
+              <w:left w:val="single" w:color="CCCCCC" w:sz="1"/>
+              <w:bottom w:val="single" w:color="CCCCCC" w:sz="1"/>
+              <w:right w:val="single" w:color="CCCCCC" w:sz="1"/>
+            </w:tcBorders>
+            <w:shd w:fill="FFFFFF" w:val="clear"/>
+            <w:tcMar>
+              <w:top w:type="dxa" w:w="80"/>
+              <w:left w:type="dxa" w:w="120"/>
+              <w:bottom w:type="dxa" w:w="80"/>
+              <w:right w:type="dxa" w:w="120"/>
+            </w:tcMar>
+          </w:tcPr>
+          <w:p>
+            <w:pPr>
+              <w:jc w:val="center"/>
+            </w:pPr>
+            <w:r>
+              <w:rPr>
+                <w:rFonts w:ascii="Arial" w:cs="Arial" w:eastAsia="Arial" w:hAnsi="Arial"/>
+                <w:color w:val="1A1A1A"/>
+                <w:sz w:val="20"/>
+                <w:szCs w:val="20"/>
+              </w:rPr>
+              <w:t xml:space="preserve">1–2万</w:t>
             </w:r>
           </w:p>
         </w:tc>

</xml_diff>